<commit_message>
docs: expand core abbreviations (GBDT, SHAP, RAG, LLM, PR-AUC, ECOD, LOF, IF, XAI) with bilingual translations in parentheticals
</commit_message>
<xml_diff>
--- a/output/tesis.docx
+++ b/output/tesis.docx
@@ -405,7 +405,7 @@
         <w:pStyle w:val="FirstParagraph"/>
       </w:pPr>
       <w:r>
-        <w:t xml:space="preserve">Esta tesis propone un sistema integrado de supervisión operativa para empresas agroexportadoras peruanas, que combina predicción tabular mediante modelos Gradient Boosting Decision Trees (GBDT), detección de anomalías operativas mediante ensemble de algoritmos, explicabilidad mediante SHAP (SHapley Additive exPlanations), y generación automática de reportes trazables con Modelos de Lenguaje de Gran Tamaño (LLMs) en arquitectura RAG (Retrieval-Augmented Generation).</w:t>
+        <w:t xml:space="preserve">Esta tesis propone un sistema integrado de supervisión operativa para empresas agroexportadoras peruanas, que combina predicción tabular mediante modelos GBDT (Gradient Boosting Decision Trees - Árboles de Decisión de Aumento de Gradiente), detección de anomalías operativas mediante ensemble de algoritmos, explicabilidad mediante SHAP (SHapley Additive exPlanations - Explicaciones Aditivas de Shapley), y generación automática de reportes trazables con LLMs (Large Language Models - Modelos de Lenguaje de Gran Tamaño) en arquitectura RAG (Retrieval-Augmented Generation).</w:t>
       </w:r>
     </w:p>
     <w:p>
@@ -413,7 +413,7 @@
         <w:pStyle w:val="BodyText"/>
       </w:pPr>
       <w:r>
-        <w:t xml:space="preserve">El sistema aborda una brecha identificada en el contexto agroexportador: los procesos de producción, acopio, almacenamiento, control de calidad, logística, cumplimiento fitosanitario y comercialización internacional suelen analizarse mediante fuentes fragmentadas, reportes manuales o tableros aislados. Esta fragmentación dificulta la detección temprana de anomalías y reduce la trazabilidad de las decisiones. La propuesta se evalúa con métricas técnicas (PR-AUC, F1-Score, cobertura de trazabilidad), evaluación de comprensión operativa y datos públicos/sintéticos documentados del dominio agroexportador.</w:t>
+        <w:t xml:space="preserve">El sistema aborda una brecha identificada en el contexto agroexportador: los procesos de producción, acopio, almacenamiento, control de calidad, logística, cumplimiento fitosanitario y comercialización internacional suelen analizarse mediante fuentes fragmentadas, reportes manuales o tableros aislados. Esta fragmentación dificulta la detección temprana de anomalías y reduce la trazabilidad de las decisiones. La propuesta se evalúa con métricas técnicas (PR-AUC (Precision-Recall Area Under the Curve - Área Bajo la Curva de Precisión y Exhaustividad), F1-Score (Medida Armónica de Precisión y Exhaustividad), cobertura de trazabilidad), evaluación de comprensión operativa y datos públicos/sintéticos documentados del dominio agroexportador.</w:t>
       </w:r>
     </w:p>
     <w:p>
@@ -461,7 +461,7 @@
         <w:pStyle w:val="FirstParagraph"/>
       </w:pPr>
       <w:r>
-        <w:t xml:space="preserve">This thesis proposes an integrated operational supervision system for Peruvian agro-export companies, combining tabular prediction using Gradient Boosting Decision Trees (GBDT), operational anomaly detection through an ensemble of algorithms, explainability through SHAP (SHapley Additive exPlanations), and traceable automatic report generation with Large Language Models (LLMs) in a Retrieval-Augmented Generation (RAG) architecture.</w:t>
+        <w:t xml:space="preserve">This thesis proposes an integrated operational supervision system for Peruvian agro-export companies, combining tabular prediction using Gradient Boosting Decision Trees (GBDT), operational anomaly detection through an ensemble of algorithms, explainability through SHAP (SHapley Additive exPlanations), and traceable automatic report generation with Large Language Models (LLMs) in a RAG (Retrieval-Augmented Generation - Generación Aumentada por Recuperación) architecture.</w:t>
       </w:r>
     </w:p>
     <w:p>
@@ -1971,7 +1971,7 @@
         <w:pStyle w:val="BodyText"/>
       </w:pPr>
       <w:r>
-        <w:t xml:space="preserve">La inteligencia artificial ofrece herramientas adecuadas para abordar esta brecha. Los modelos Gradient Boosting Decision Trees (GBDT) han demostrado buen desempeño en datos tabulares estructurados (Grinsztajn et al., 2022); los ensembles de detectores de anomalías permiten identificar comportamientos atípicos de manera más robusta que un detector individual (Han et al., 2022); la explicabilidad mediante valores de Shapley (SHAP) convierte predicciones opacas en justificaciones comprensibles (Lundberg &amp; Lee, 2017); y los modelos de lenguaje con arquitectura RAG pueden transformar resultados cuantitativos en reportes comprensibles siempre que se restrinja su función a la generación narrativa basada en evidencias (Schneider et al., 2025).</w:t>
+        <w:t xml:space="preserve">La inteligencia artificial ofrece herramientas adecuadas para abordar esta brecha. Los modelos GBDT (Gradient Boosting Decision Trees - Árboles de Decisión de Aumento de Gradiente) han demostrado buen desempeño en datos tabulares estructurados (Grinsztajn et al., 2022); los ensembles de detectores de anomalías permiten identificar comportamientos atípicos de manera más robusta que un detector individual (Han et al., 2022); la explicabilidad mediante SHAP (SHapley Additive exPlanations - Explicaciones Aditivas de Shapley) convierte predicciones opacas en justificaciones comprensibles (Lundberg &amp; Lee, 2017); y los modelos de lenguaje con arquitectura RAG (Retrieval-Augmented Generation - Generación Aumentada por Recuperación) pueden transformar resultados cuantitativos en reportes comprensibles siempre que se restrinja su función a la generación narrativa basada en evidencias (Schneider et al., 2025).</w:t>
       </w:r>
     </w:p>
     <w:p>
@@ -2245,7 +2245,7 @@
         </w:numPr>
       </w:pPr>
       <w:r>
-        <w:t xml:space="preserve">¿De qué manera la explicabilidad mediante SHAP contribuye a que supervisores operativos comprendan las causas probables de una alerta?</w:t>
+        <w:t xml:space="preserve">¿De qué manera la explicabilidad mediante SHAP (SHapley Additive exPlanations - Explicaciones Aditivas de Shapley) contribuye a que supervisores operativos comprendan las causas probables de una alerta?</w:t>
       </w:r>
     </w:p>
     <w:p>
@@ -2397,7 +2397,7 @@
         <w:t xml:space="preserve">Generación de reportes trazables</w:t>
       </w:r>
       <w:r>
-        <w:t xml:space="preserve">: Diseñar un componente LLM+RAG que redacte explicaciones operativas basadas exclusivamente en evidencias estructuradas del sistema.</w:t>
+        <w:t xml:space="preserve">: Diseñar un componente LLM (Large Language Model - Modelo de Lenguaje de Gran Tamaño)+RAG (Retrieval-Augmented Generation - Generación Aumentada por Recuperación) que redacte explicaciones operativas basadas exclusivamente en evidencias estructuradas del sistema.</w:t>
       </w:r>
     </w:p>
     <w:p>
@@ -2621,7 +2621,7 @@
         <w:t xml:space="preserve"> </w:t>
       </w:r>
       <w:r>
-        <w:t xml:space="preserve">- Indicadores: ROC-AUC, Precisión, Recall, F1-Score, PR-AUC</w:t>
+        <w:t xml:space="preserve">- Indicadores: ROC-AUC (Receiver Operating Characteristic Area Under the Curve - Área Bajo la Curva de Característica Operativa del Receptor), Precisión, Recall, F1-Score (Medida Armónica de Precisión y Exhaustividad), PR-AUC (Precision-Recall Area Under the Curve - Área Bajo la Curva de Precisión y Exhaustividad)</w:t>
       </w:r>
       <w:r>
         <w:t xml:space="preserve"> </w:t>
@@ -2758,7 +2758,7 @@
         <w:t xml:space="preserve">Disponibilidad de tecnologías</w:t>
       </w:r>
       <w:r>
-        <w:t xml:space="preserve">: El stack tecnológico es completamente open-source y maduro: XGBoost (Chen &amp; Guestrin, 2016) y LightGBM (Ke et al., 2017) para predicción tabular; PyOD (Zhao et al., 2019) para ensemble de anomalías con acceso a Isolation Forest (Liu et al., 2008), LOF (Breunig et al., 2000) y Deep SVDD (Ruff et al., 2018); SHAP (Lundberg &amp; Lee, 2017) para explicabilidad; APIs de LLM (Anthropic Claude, OpenAI GPT-4) o modelos locales (Llama 3) para generación de reportes.</w:t>
+        <w:t xml:space="preserve">: El stack tecnológico es completamente open-source y maduro: XGBoost (Chen &amp; Guestrin, 2016) y LightGBM (Ke et al., 2017) para predicción tabular; PyOD (Zhao et al., 2019) para ensemble de anomalías con acceso a Isolation Forest (Liu et al., 2008), LOF (Local Outlier Factor - Factor de Anomalía Local) (Breunig et al., 2000) y Deep SVDD (Ruff et al., 2018); SHAP (Lundberg &amp; Lee, 2017) para explicabilidad; APIs de LLM (Anthropic Claude, OpenAI GPT-4) o modelos locales (Llama 3) para generación de reportes.</w:t>
       </w:r>
     </w:p>
     <w:p>
@@ -2788,7 +2788,7 @@
         <w:t xml:space="preserve">Riesgos técnicos identificados</w:t>
       </w:r>
       <w:r>
-        <w:t xml:space="preserve">: La latencia de SHAP en datasets grandes (&gt;1M filas) puede mitigarse con los métodos de aproximación TreeSHAP. La variabilidad en salidas de LLMs requiere prompt engineering robusto y restricción mediante RAG. La mitigación incluye pruebas piloto en subconjuntos de datos y benchmarking iterativo.</w:t>
+        <w:t xml:space="preserve">: La latencia de SHAP en datasets grandes (&gt;1M filas) puede mitigarse con los métodos de aproximación TreeSHAP. La variabilidad en salidas de LLMs (Large Language Models - Modelos de Lenguaje de Gran Tamaño) requiere prompt engineering robusto y restricción mediante RAG. La mitigación incluye pruebas piloto en subconjuntos de datos y benchmarking iterativo.</w:t>
       </w:r>
     </w:p>
     <w:bookmarkEnd w:id="42"/>
@@ -2901,7 +2901,7 @@
         <w:t xml:space="preserve">docs/busqueda-sistematica-gap.md</w:t>
       </w:r>
       <w:r>
-        <w:t xml:space="preserve">), la primera arquitectura integrada de cuatro capas (GBDT + ensemble Isolation Forest/LOF/ECOD + TreeSHAP + LLM-RAG con restricción anti-alucinación) evaluada sobre datos agroexportadores peruanos públicos y sintéticos, con trazabilidad documental diseñada conforme al D.S. N° 115-2025-PCM y los principios del NIST AI RMF (NIST, 2023).</w:t>
+        <w:t xml:space="preserve">), la primera arquitectura integrada de cuatro capas (GBDT (Gradient Boosting Decision Trees - Árboles de Decisión de Aumento de Gradiente) + ensemble Isolation Forest/LOF/ECOD (Empirical Cumulative Distribution Outlier Detection - Detección de Anomalías por Distribución Acumulada Empírica) + TreeSHAP + LLM-RAG con restricción anti-alucinación) evaluada sobre datos agroexportadores peruanos públicos y sintéticos, con trazabilidad documental diseñada conforme al D.S. N° 115-2025-PCM y los principios del NIST AI RMF (NIST, 2023).</w:t>
       </w:r>
     </w:p>
     <w:p>
@@ -5083,13 +5083,13 @@
         <w:t xml:space="preserve">El desarrollo de sistemas de predicción, detección de anomalías y generación de reportes en datos empresariales ha seguido una trayectoria de especialización creciente, marcada por tres tendencias paralelas: el auge de los modelos basados en árboles para datos tabulares, la proliferación de benchmarks sistemáticos y la emergencia de los modelos de lenguaje como capa de interpretación. Los siguientes antecedentes fueron seleccionados por su proximidad metodológica con la propuesta de esta investigación, aunque varios provienen de dominios financieros o contables y se emplean aquí solo como soporte técnico transferible.</w:t>
       </w:r>
     </w:p>
-    <w:bookmarkStart w:id="69" w:name="X78d6d1832b397a9b430365d7ca4a37a41e1c940"/>
+    <w:bookmarkStart w:id="69" w:name="X34b95b113503ce1ff641d08230cde3f4d4cf789"/>
     <w:p>
       <w:pPr>
         <w:pStyle w:val="Ttulo3"/>
       </w:pPr>
       <w:r>
-        <w:t xml:space="preserve">2.1.1 Kadir et al. (2025) — AuditCopilot: LLMs para Reportes de Anomalías</w:t>
+        <w:t xml:space="preserve">2.1.1 Kadir et al. (2025) — AuditCopilot: LLMs (Large Language Models - Modelos de Lenguaje de Gran Tamaño) para Reportes de Anomalías</w:t>
       </w:r>
     </w:p>
     <w:p>
@@ -5097,7 +5097,7 @@
         <w:pStyle w:val="FirstParagraph"/>
       </w:pPr>
       <w:r>
-        <w:t xml:space="preserve">Kadir et al. (2025) desarrollaron AuditCopilot (Kadir et al., 2025), un sistema de auditoría contable que integra LLMs con detección de anomalías en asientos de doble entrada para generar explicaciones automáticas en lenguaje natural. El sistema implementa un pipeline de tres etapas —detección de irregularidades, interpretación contextual con LLM ajustado y generación de narrativas— evaluado sobre un corpus de asientos contables sintéticos y reales. Los resultados reportan mejoras en la tasa de detección y reducción del tiempo de revisión, con valoración positiva de auditores en pruebas de aceptabilidad.</w:t>
+        <w:t xml:space="preserve">Kadir et al. (2025) desarrollaron AuditCopilot (Kadir et al., 2025), un sistema de auditoría contable que integra LLMs con detección de anomalías en asientos de doble entrada para generar explicaciones automáticas en lenguaje natural. El sistema implementa un pipeline de tres etapas —detección de irregularidades, interpretación contextual con LLM (Large Language Model - Modelo de Lenguaje de Gran Tamaño) ajustado y generación de narrativas— evaluado sobre un corpus de asientos contables sintéticos y reales. Los resultados reportan mejoras en la tasa de detección y reducción del tiempo de revisión, con valoración positiva de auditores en pruebas de aceptabilidad.</w:t>
       </w:r>
     </w:p>
     <w:p>
@@ -5105,7 +5105,7 @@
         <w:pStyle w:val="BodyText"/>
       </w:pPr>
       <w:r>
-        <w:t xml:space="preserve">La relevancia de este antecedente para la presente tesis es metodológica: confirma la viabilidad de combinar detección de anomalías con generación de reportes LLM. No obstante, su dominio es contable, por lo que no se adopta como evidencia agroexportadora. Esta tesis traslada el principio de generación narrativa a un contexto operativo, separando estrictamente la detección de la redacción mediante RAG sobre scores y vectores SHAP.</w:t>
+        <w:t xml:space="preserve">La relevancia de este antecedente para la presente tesis es metodológica: confirma la viabilidad de combinar detección de anomalías con generación de reportes LLM. No obstante, su dominio es contable, por lo que no se adopta como evidencia agroexportadora. Esta tesis traslada el principio de generación narrativa a un contexto operativo, separando estrictamente la detección de la redacción mediante RAG (Retrieval-Augmented Generation - Generación Aumentada por Recuperación) sobre scores y vectores SHAP (SHapley Additive exPlanations - Explicaciones Aditivas de Shapley).</w:t>
       </w:r>
     </w:p>
     <w:bookmarkEnd w:id="69"/>
@@ -5135,13 +5135,13 @@
       </w:r>
     </w:p>
     <w:bookmarkEnd w:id="70"/>
-    <w:bookmarkStart w:id="71" w:name="X6685d4ea48801b0d371d4c3ef4844e7e29a80b9"/>
+    <w:bookmarkStart w:id="71" w:name="X7f3479b386dbbfef10f9d90a18a5f211d9d0e4d"/>
     <w:p>
       <w:pPr>
         <w:pStyle w:val="Ttulo3"/>
       </w:pPr>
       <w:r>
-        <w:t xml:space="preserve">2.1.3 Almalki &amp; Masud (2025) y Autores varios (2025) — Ensemble GBDT+SHAP en Datos Críticos</w:t>
+        <w:t xml:space="preserve">2.1.3 Almalki &amp; Masud (2025) y Autores varios (2025) — Ensemble GBDT (Gradient Boosting Decision Trees - Árboles de Decisión de Aumento de Gradiente)+SHAP en Datos Críticos</w:t>
       </w:r>
     </w:p>
     <w:p>
@@ -5165,7 +5165,7 @@
         <w:t xml:space="preserve"> </w:t>
       </w:r>
       <w:r>
-        <w:t xml:space="preserve">(2025), diseñaron frameworks integrados de detección de fraude financiero combinando Stacking Ensemble de GBDTs (XGBoost y LightGBM) con explicabilidad SHAP (Almalki &amp; Masud, 2025; JRFM, 2025). El ensemble alcanza PR-AUC &gt; 0.90 y F1-Score &gt; 0.80, superando a arquitecturas complejas de Deep Learning, con un SHAP Stability Index alto que certifica la coherencia forense de las explicaciones —requisito indispensable en auditoría.</w:t>
+        <w:t xml:space="preserve">(2025), diseñaron frameworks integrados de detección de fraude financiero combinando Stacking Ensemble de GBDTs (XGBoost y LightGBM) con explicabilidad SHAP (Almalki &amp; Masud, 2025; JRFM, 2025). El ensemble alcanza PR-AUC (Precision-Recall Area Under the Curve - Área Bajo la Curva de Precisión y Exhaustividad) &gt; 0.90 y F1-Score (Medida Armónica de Precisión y Exhaustividad) &gt; 0.80, superando a arquitecturas complejas de Deep Learning, con un SHAP Stability Index alto que certifica la coherencia forense de las explicaciones —requisito indispensable en auditoría.</w:t>
       </w:r>
     </w:p>
     <w:p>
@@ -5191,7 +5191,7 @@
         <w:pStyle w:val="FirstParagraph"/>
       </w:pPr>
       <w:r>
-        <w:t xml:space="preserve">Han et al. (2022) publicaron ADBench (Han et al., 2022), un benchmark sistemático que evalúa 30 algoritmos de detección de anomalías en 57 datasets reales y sintéticos bajo tres niveles de supervisión —no supervisado, semisupervisado y supervisado. El hallazgo central es que no existe un algoritmo universalmente superior: el rendimiento depende del tipo de anomalía, la distribución de datos y el nivel de etiquetado. Isolation Forest y ECOD muestran consistencia en escenarios no supervisados, y los ensembles de múltiples detectores superan sistemáticamente a los detectores individuales en escenarios de alta variabilidad distribucional.</w:t>
+        <w:t xml:space="preserve">Han et al. (2022) publicaron ADBench (Han et al., 2022), un benchmark sistemático que evalúa 30 algoritmos de detección de anomalías en 57 datasets reales y sintéticos bajo tres niveles de supervisión —no supervisado, semisupervisado y supervisado. El hallazgo central es que no existe un algoritmo universalmente superior: el rendimiento depende del tipo de anomalía, la distribución de datos y el nivel de etiquetado. Isolation Forest y ECOD (Empirical Cumulative Distribution Outlier Detection - Detección de Anomalías por Distribución Acumulada Empírica) muestran consistencia en escenarios no supervisados, y los ensembles de múltiples detectores superan sistemáticamente a los detectores individuales en escenarios de alta variabilidad distribucional.</w:t>
       </w:r>
     </w:p>
     <w:p>
@@ -5243,7 +5243,7 @@
         <w:pStyle w:val="FirstParagraph"/>
       </w:pPr>
       <w:r>
-        <w:t xml:space="preserve">Zhao et al. (2019) desarrollaron PyOD (Zhao et al., 2019), una librería unificada en Python que implementa más de 40 algoritmos de detección de outliers con una API compatible con scikit-learn. Cubre métodos basados en proximidad (LOF), proyección (PCA), ensembles (Isolation Forest) y distribuciones empíricas (ECOD). Con más de 7,000 estrellas en GitHub y adopción en publicaciones de NeurIPS, ICDM e ICML, PyOD es la infraestructura técnica de referencia para implementar el ensemble de detección de anomalías de esta tesis, garantizando reproducibilidad directa con los 30 algoritmos de ADBench (Han et al., 2022).</w:t>
+        <w:t xml:space="preserve">Zhao et al. (2019) desarrollaron PyOD (Zhao et al., 2019), una librería unificada en Python que implementa más de 40 algoritmos de detección de outliers con una API compatible con scikit-learn. Cubre métodos basados en proximidad (LOF (Local Outlier Factor - Factor de Anomalía Local)), proyección (PCA), ensembles (Isolation Forest) y distribuciones empíricas (ECOD). Con más de 7,000 estrellas en GitHub y adopción en publicaciones de NeurIPS, ICDM e ICML, PyOD es la infraestructura técnica de referencia para implementar el ensemble de detección de anomalías de esta tesis, garantizando reproducibilidad directa con los 30 algoritmos de ADBench (Han et al., 2022).</w:t>
       </w:r>
     </w:p>
     <w:p>
@@ -5277,13 +5277,13 @@
         <w:t xml:space="preserve">El estado del arte se organiza en torno a cinco debates fundamentales de la literatura que la presente propuesta debe resolver o posicionarse explícitamente. Cada sub-sección presenta el debate, los trabajos relevantes y la posición de esta tesis. La Tabla 2.1 sintetiza todas las referencias relevantes al final de la sección.</w:t>
       </w:r>
     </w:p>
-    <w:bookmarkStart w:id="76" w:name="Xebcc1386b1d23a0678ca1de955a037b1d1e51a1"/>
+    <w:bookmarkStart w:id="76" w:name="Xd73b52e64a176705d856cab81e035d7a1e9ba7e"/>
     <w:p>
       <w:pPr>
         <w:pStyle w:val="Ttulo3"/>
       </w:pPr>
       <w:r>
-        <w:t xml:space="preserve">2.2.1 GBDT versus Deep Learning para Datos Tabulares Empresariales y Agroexportadores</w:t>
+        <w:t xml:space="preserve">2.2.1 GBDT (Gradient Boosting Decision Trees - Árboles de Decisión de Aumento de Gradiente) versus Deep Learning para Datos Tabulares Empresariales y Agroexportadores</w:t>
       </w:r>
     </w:p>
     <w:p>
@@ -5340,7 +5340,7 @@
         <w:pStyle w:val="FirstParagraph"/>
       </w:pPr>
       <w:r>
-        <w:t xml:space="preserve">El campo de la detección de anomalías cuenta con una historia de más de dos décadas de métodos en competencia. Breunig et al. (2000) establecieron el Local Outlier Factor (LOF) como referencia para detectar anomalías locales mediante densidad relativa al vecindario k-NN, un enfoque sensible a variaciones locales que permite identificar transacciones con patrones de comportamiento heterogéneos. Liu et al. (2008) revolucionaron el campo con Isolation Forest, que aísla anomalías por particionamiento aleatorio sin necesidad de definir perfiles de normalidad, con complejidad O(n) que lo hace viable en millones de transacciones diarias. Ruff et al. (2018) extendieron la detección a espacios de representación profundos con Deep SVDD, capturando patrones no lineales en los datos mediante redes neuronales. Li et al. (2022) propusieron ECOD, un detector moderno libre de parámetros basado en distribución empírica acumulada que supera a 11 baselines en datasets no supervisados, eliminando el riesgo de sobreajuste al proceso de calibración.</w:t>
+        <w:t xml:space="preserve">El campo de la detección de anomalías cuenta con una historia de más de dos décadas de métodos en competencia. Breunig et al. (2000) establecieron el Local Outlier Factor (LOF (Local Outlier Factor - Factor de Anomalía Local)) como referencia para detectar anomalías locales mediante densidad relativa al vecindario k-NN, un enfoque sensible a variaciones locales que permite identificar transacciones con patrones de comportamiento heterogéneos. Liu et al. (2008) revolucionaron el campo con Isolation Forest, que aísla anomalías por particionamiento aleatorio sin necesidad de definir perfiles de normalidad, con complejidad O(n) que lo hace viable en millones de transacciones diarias. Ruff et al. (2018) extendieron la detección a espacios de representación profundos con Deep SVDD, capturando patrones no lineales en los datos mediante redes neuronales. Li et al. (2022) propusieron ECOD (Empirical Cumulative Distribution Outlier Detection - Detección de Anomalías por Distribución Acumulada Empírica), un detector moderno libre de parámetros basado en distribución empírica acumulada que supera a 11 baselines en datasets no supervisados, eliminando el riesgo de sobreajuste al proceso de calibración.</w:t>
       </w:r>
     </w:p>
     <w:p>
@@ -5367,13 +5367,13 @@
       </w:r>
     </w:p>
     <w:bookmarkEnd w:id="77"/>
-    <w:bookmarkStart w:id="78" w:name="X70301a81f36b5c7222663646b3b56815aad9e29"/>
+    <w:bookmarkStart w:id="78" w:name="Xbd521d0f2a76be3e733ca442fbbe7158cbebf2e"/>
     <w:p>
       <w:pPr>
         <w:pStyle w:val="Ttulo3"/>
       </w:pPr>
       <w:r>
-        <w:t xml:space="preserve">2.2.3 LLM como Detector versus LLM como Generador de Reportes</w:t>
+        <w:t xml:space="preserve">2.2.3 LLM (Large Language Model - Modelo de Lenguaje de Gran Tamaño) como Detector versus LLM como Generador de Reportes</w:t>
       </w:r>
     </w:p>
     <w:p>
@@ -5381,7 +5381,7 @@
         <w:pStyle w:val="FirstParagraph"/>
       </w:pPr>
       <w:r>
-        <w:t xml:space="preserve">El surgimiento de los LLMs ha generado propuestas de integración en sistemas empresariales con distintos roles. Hegselmann et al. (2023) demostraron con TabLLM que los LLMs pueden clasificar datos tabulares en configuración zero/few-shot mediante serialización a texto, con rendimiento no trivial incluso sin ajuste fino. Park (2024) llevó esta lógica más lejos con un framework multi-agente donde LLMs especializados validan alertas de anomalías. Estos antecedentes muestran potencial metodológico, aunque no resuelven por sí mismos el problema de trazabilidad operativa agroexportadora.</w:t>
+        <w:t xml:space="preserve">El surgimiento de los LLMs (Large Language Models - Modelos de Lenguaje de Gran Tamaño) ha generado propuestas de integración en sistemas empresariales con distintos roles. Hegselmann et al. (2023) demostraron con TabLLM que los LLMs pueden clasificar datos tabulares en configuración zero/few-shot mediante serialización a texto, con rendimiento no trivial incluso sin ajuste fino. Park (2024) llevó esta lógica más lejos con un framework multi-agente donde LLMs especializados validan alertas de anomalías. Estos antecedentes muestran potencial metodológico, aunque no resuelven por sí mismos el problema de trazabilidad operativa agroexportadora.</w:t>
       </w:r>
     </w:p>
     <w:p>
@@ -5397,7 +5397,7 @@
         <w:pStyle w:val="BodyText"/>
       </w:pPr>
       <w:r>
-        <w:t xml:space="preserve">La arquitectura RAG (Schneider et al., 2025 (Schneider et al., 2025)) ofrece una solución al anclar las respuestas del LLM a bases de conocimiento verificadas —en este caso, scores, umbrales, vectores SHAP y fuentes agroexportadoras recuperadas— reduciendo el espacio de alucinación al forzar al modelo a narrar únicamente lo que los datos cuantitativos establecen. El LLM no infiere anomalías; las narra con evidencias como fundamento.</w:t>
+        <w:t xml:space="preserve">La arquitectura RAG (Retrieval-Augmented Generation - Generación Aumentada por Recuperación) (Schneider et al., 2025 (Schneider et al., 2025)) ofrece una solución al anclar las respuestas del LLM a bases de conocimiento verificadas —en este caso, scores, umbrales, vectores SHAP (SHapley Additive exPlanations - Explicaciones Aditivas de Shapley) y fuentes agroexportadoras recuperadas— reduciendo el espacio de alucinación al forzar al modelo a narrar únicamente lo que los datos cuantitativos establecen. El LLM no infiere anomalías; las narra con evidencias como fundamento.</w:t>
       </w:r>
     </w:p>
     <w:p>
@@ -5880,7 +5880,7 @@
               <w:jc w:val="left"/>
             </w:pPr>
             <w:r>
-              <w:t xml:space="preserve">✅ IF+LOF+ECOD</w:t>
+              <w:t xml:space="preserve">✅ IF (Isolation Forest - Bosque de Aislamiento)+LOF+ECOD</w:t>
             </w:r>
           </w:p>
         </w:tc>
@@ -7565,17 +7565,17 @@
         <w:pStyle w:val="BodyText"/>
       </w:pPr>
       <w:r>
-        <w:t xml:space="preserve">Estas propiedades estructurales explican por qué los GBDT son adecuados para este dominio (Grinsztajn et al., 2022): manejan variables numéricas y categóricas heterogéneas, toleran valores faltantes, capturan relaciones no lineales y requieren menor ingeniería de features que arquitecturas neuronales complejas. Cuando las etiquetas de anomalía son escasas o desbalanceadas, el rendimiento debe evaluarse con métricas orientadas a precisión-recall (PR-AUC), F1-Score y análisis de falsos positivos.</w:t>
+        <w:t xml:space="preserve">Estas propiedades estructurales explican por qué los GBDT son adecuados para este dominio (Grinsztajn et al., 2022): manejan variables numéricas y categóricas heterogéneas, toleran valores faltantes, capturan relaciones no lineales y requieren menor ingeniería de features que arquitecturas neuronales complejas. Cuando las etiquetas de anomalía son escasas o desbalanceadas, el rendimiento debe evaluarse con métricas orientadas a precisión-recall (PR-AUC (Precision-Recall Area Under the Curve - Área Bajo la Curva de Precisión y Exhaustividad)), F1-Score (Medida Armónica de Precisión y Exhaustividad) y análisis de falsos positivos.</w:t>
       </w:r>
     </w:p>
     <w:bookmarkEnd w:id="84"/>
-    <w:bookmarkStart w:id="85" w:name="gradient-boosting-decision-trees-gbdt"/>
+    <w:bookmarkStart w:id="85" w:name="X9b994061f5f14c9f3518656c74aa91348236f39"/>
     <w:p>
       <w:pPr>
         <w:pStyle w:val="Ttulo3"/>
       </w:pPr>
       <w:r>
-        <w:t xml:space="preserve">2.3.3 Gradient Boosting Decision Trees (GBDT)</w:t>
+        <w:t xml:space="preserve">2.3.3 GBDT (Gradient Boosting Decision Trees - Árboles de Decisión de Aumento de Gradiente)</w:t>
       </w:r>
     </w:p>
     <w:p>
@@ -8179,7 +8179,7 @@
           <w:b/>
           <w:bCs/>
         </w:rPr>
-        <w:t xml:space="preserve">Local Outlier Factor (LOF)</w:t>
+        <w:t xml:space="preserve">Local Outlier Factor (LOF (Local Outlier Factor - Factor de Anomalía Local))</w:t>
       </w:r>
       <w:r>
         <w:t xml:space="preserve"> </w:t>
@@ -8785,7 +8785,7 @@
           <w:b/>
           <w:bCs/>
         </w:rPr>
-        <w:t xml:space="preserve">ECOD</w:t>
+        <w:t xml:space="preserve">ECOD (Empirical Cumulative Distribution Outlier Detection - Detección de Anomalías por Distribución Acumulada Empírica)</w:t>
       </w:r>
       <w:r>
         <w:t xml:space="preserve"> </w:t>
@@ -8915,13 +8915,13 @@
       </w:r>
     </w:p>
     <w:bookmarkEnd w:id="87"/>
-    <w:bookmarkStart w:id="88" w:name="X3949ec821ffcb479f94205457f4f5ff1e3e354f"/>
+    <w:bookmarkStart w:id="88" w:name="X8d30205be421573846deac73c6cb2eebcb12de3"/>
     <w:p>
       <w:pPr>
         <w:pStyle w:val="Ttulo3"/>
       </w:pPr>
       <w:r>
-        <w:t xml:space="preserve">2.3.6 Explicabilidad mediante Valores de Shapley (SHAP)</w:t>
+        <w:t xml:space="preserve">2.3.6 Explicabilidad mediante SHAP (SHapley Additive exPlanations - Explicaciones Aditivas de Shapley)</w:t>
       </w:r>
     </w:p>
     <w:p>
@@ -9456,7 +9456,7 @@
         <w:pStyle w:val="BodyText"/>
       </w:pPr>
       <w:r>
-        <w:t xml:space="preserve">La integración SHAP+LLM de esta tesis opera como sigue: los vectores SHAP de una alerta operativa (una lista de pares variable→contribución cuantitativa) se incorporan como contexto verificado en el RAG, y el LLM genera la narración del informe sin posibilidad de inventar cifras que no estén en esos vectores o en las fuentes recuperadas.</w:t>
+        <w:t xml:space="preserve">La integración SHAP+LLM (Large Language Model - Modelo de Lenguaje de Gran Tamaño) de esta tesis opera como sigue: los vectores SHAP de una alerta operativa (una lista de pares variable→contribución cuantitativa) se incorporan como contexto verificado en el RAG, y el LLM genera la narración del informe sin posibilidad de inventar cifras que no estén en esos vectores o en las fuentes recuperadas.</w:t>
       </w:r>
     </w:p>
     <w:bookmarkEnd w:id="88"/>
@@ -9474,7 +9474,7 @@
         <w:pStyle w:val="FirstParagraph"/>
       </w:pPr>
       <w:r>
-        <w:t xml:space="preserve">Los Modelos de Lenguaje de Gran Tamaño (LLMs) son sistemas entrenados mediante autoregresión en corpus masivos de texto para aprender distribuciones probabilísticas sobre secuencias de tokens. Su capacidad de generalización les permite realizar tareas de reasoning, traducción, resumen y generación de texto con calidad próxima a la humana en configuraciones zero-shot y few-shot.</w:t>
+        <w:t xml:space="preserve">Los LLMs (Large Language Models - Modelos de Lenguaje de Gran Tamaño) son sistemas entrenados mediante autoregresión en corpus masivos de texto para aprender distribuciones probabilísticas sobre secuencias de tokens. Su capacidad de generalización les permite realizar tareas de reasoning, traducción, resumen y generación de texto con calidad próxima a la humana en configuraciones zero-shot y few-shot.</w:t>
       </w:r>
     </w:p>
     <w:p>
@@ -9543,7 +9543,7 @@
           <w:b/>
           <w:bCs/>
         </w:rPr>
-        <w:t xml:space="preserve">Retrieval-Augmented Generation (RAG)</w:t>
+        <w:t xml:space="preserve">RAG (Retrieval-Augmented Generation - Generación Aumentada por Recuperación)</w:t>
       </w:r>
       <w:r>
         <w:t xml:space="preserve"> </w:t>
@@ -9958,7 +9958,7 @@
         <w:t xml:space="preserve"> </w:t>
       </w:r>
       <w:r>
-        <w:t xml:space="preserve">Utiliza algoritmos GBDT como núcleo predictivo, priorizando XGBoost (Chen &amp; Guestrin, 2016) y LightGBM (Ke et al., 2017) por su robustez ante datos tabulares con variables heterogéneas (Grinsztajn et al., 2022). El módulo puede estimar valores esperados de precio, volumen, merma o riesgo operativo.</w:t>
+        <w:t xml:space="preserve">Utiliza algoritmos GBDT (Gradient Boosting Decision Trees - Árboles de Decisión de Aumento de Gradiente) como núcleo predictivo, priorizando XGBoost (Chen &amp; Guestrin, 2016) y LightGBM (Ke et al., 2017) por su robustez ante datos tabulares con variables heterogéneas (Grinsztajn et al., 2022). El módulo puede estimar valores esperados de precio, volumen, merma o riesgo operativo.</w:t>
       </w:r>
     </w:p>
     <w:p>
@@ -9980,7 +9980,7 @@
         <w:t xml:space="preserve"> </w:t>
       </w:r>
       <w:r>
-        <w:t xml:space="preserve">Emplea detectores como Isolation Forest (Liu et al., 2008), LOF (Breunig et al., 2000) y ECOD (Li et al., 2022), orquestados mediante PyOD (Zhao et al., 2019), para identificar comportamientos atípicos en variables agroexportadoras. Se selecciona ECOD sobre Deep SVDD (Ruff et al., 2018) —considerado en la revisión bibliográfica del Capítulo II— por tres razones: (a) ECOD no requiere ajuste de hiperparámetros, lo cual elimina el riesgo de sobreajuste en la calibración; (b) su fundamento basado en funciones de distribución empírica acumulada es interpretable estadísticamente para auditores, mientras que Deep SVDD opera sobre representaciones latentes opacas; y (c) su complejidad computacional es lineal, apropiada para el tamaño medio del dataset experimental (2,000–5,000 registros). Deep SVDD se mantiene como referencia conceptual del Capítulo II por su valor histórico, pero no entra al ensemble final.</w:t>
+        <w:t xml:space="preserve">Emplea detectores como Isolation Forest (Liu et al., 2008), LOF (Local Outlier Factor - Factor de Anomalía Local) (Breunig et al., 2000) y ECOD (Empirical Cumulative Distribution Outlier Detection - Detección de Anomalías por Distribución Acumulada Empírica) (Li et al., 2022), orquestados mediante PyOD (Zhao et al., 2019), para identificar comportamientos atípicos en variables agroexportadoras. Se selecciona ECOD sobre Deep SVDD (Ruff et al., 2018) —considerado en la revisión bibliográfica del Capítulo II— por tres razones: (a) ECOD no requiere ajuste de hiperparámetros, lo cual elimina el riesgo de sobreajuste en la calibración; (b) su fundamento basado en funciones de distribución empírica acumulada es interpretable estadísticamente para auditores, mientras que Deep SVDD opera sobre representaciones latentes opacas; y (c) su complejidad computacional es lineal, apropiada para el tamaño medio del dataset experimental (2,000–5,000 registros). Deep SVDD se mantiene como referencia conceptual del Capítulo II por su valor histórico, pero no entra al ensemble final.</w:t>
       </w:r>
     </w:p>
     <w:p>
@@ -10002,7 +10002,7 @@
         <w:t xml:space="preserve"> </w:t>
       </w:r>
       <w:r>
-        <w:t xml:space="preserve">SHAP (Lundberg &amp; Lee, 2017) genera explicaciones locales por alerta, identificando qué variables —precio, volumen, clima, destino, cumplimiento o merma— contribuyen al score del sistema.</w:t>
+        <w:t xml:space="preserve">SHAP (SHapley Additive exPlanations - Explicaciones Aditivas de Shapley) (Lundberg &amp; Lee, 2017) genera explicaciones locales por alerta, identificando qué variables —precio, volumen, clima, destino, cumplimiento o merma— contribuyen al score del sistema.</w:t>
       </w:r>
     </w:p>
     <w:p>
@@ -10018,7 +10018,7 @@
           <w:b/>
           <w:bCs/>
         </w:rPr>
-        <w:t xml:space="preserve">Módulo de Reportes LLM+RAG (Capa 4):</w:t>
+        <w:t xml:space="preserve">Módulo de Reportes LLM (Large Language Model - Modelo de Lenguaje de Gran Tamaño)+RAG (Retrieval-Augmented Generation - Generación Aumentada por Recuperación) (Capa 4):</w:t>
       </w:r>
       <w:r>
         <w:t xml:space="preserve"> </w:t>
@@ -10161,7 +10161,7 @@
         <w:rPr>
           <w:rStyle w:val="VerbatimChar"/>
         </w:rPr>
-        <w:t xml:space="preserve">│ Métodos: IF + LOF + ECOD (PyOD)                        │</w:t>
+        <w:t xml:space="preserve">│ Métodos: IF (Isolation Forest - Bosque de Aislamiento) + LOF + ECOD (PyOD)                        │</w:t>
       </w:r>
       <w:r>
         <w:br/>
@@ -10355,7 +10355,7 @@
         <w:t xml:space="preserve">Métricas de predicción y detección (VD1)</w:t>
       </w:r>
       <w:r>
-        <w:t xml:space="preserve">: PR-AUC (métrica principal para datasets desbalanceados), ROC-AUC, F1-Score, Precision y Recall con umbral óptimo determinado por el punto de máxima F1 sobre el conjunto de validación.</w:t>
+        <w:t xml:space="preserve">: PR-AUC (Precision-Recall Area Under the Curve - Área Bajo la Curva de Precisión y Exhaustividad) (métrica principal para datasets desbalanceados), ROC-AUC (Receiver Operating Characteristic Area Under the Curve - Área Bajo la Curva de Característica Operativa del Receptor), F1-Score (Medida Armónica de Precisión y Exhaustividad), Precision y Recall con umbral óptimo determinado por el punto de máxima F1 sobre el conjunto de validación.</w:t>
       </w:r>
     </w:p>
     <w:p>
@@ -12011,19 +12011,19 @@
               <w:jc w:val="left"/>
             </w:pPr>
             <w:r>
-              <w:t xml:space="preserve">PR-AUC</w:t>
-            </w:r>
-          </w:p>
-        </w:tc>
-        <w:tc>
-          <w:tcPr/>
-          <w:p>
-            <w:pPr>
-              <w:pStyle w:val="Compact"/>
-              <w:jc w:val="left"/>
-            </w:pPr>
-            <w:r>
-              <w:t xml:space="preserve">ROC-AUC</w:t>
+              <w:t xml:space="preserve">PR-AUC (Precision-Recall Area Under the Curve - Área Bajo la Curva de Precisión y Exhaustividad)</w:t>
+            </w:r>
+          </w:p>
+        </w:tc>
+        <w:tc>
+          <w:tcPr/>
+          <w:p>
+            <w:pPr>
+              <w:pStyle w:val="Compact"/>
+              <w:jc w:val="left"/>
+            </w:pPr>
+            <w:r>
+              <w:t xml:space="preserve">ROC-AUC (Receiver Operating Characteristic Area Under the Curve - Área Bajo la Curva de Característica Operativa del Receptor)</w:t>
             </w:r>
           </w:p>
         </w:tc>
@@ -12195,7 +12195,7 @@
               <w:jc w:val="left"/>
             </w:pPr>
             <w:r>
-              <w:t xml:space="preserve">LOF individual</w:t>
+              <w:t xml:space="preserve">LOF (Local Outlier Factor - Factor de Anomalía Local) individual</w:t>
             </w:r>
           </w:p>
         </w:tc>
@@ -12305,7 +12305,7 @@
               <w:jc w:val="left"/>
             </w:pPr>
             <w:r>
-              <w:t xml:space="preserve">ECOD individual</w:t>
+              <w:t xml:space="preserve">ECOD (Empirical Cumulative Distribution Outlier Detection - Detección de Anomalías por Distribución Acumulada Empírica) individual</w:t>
             </w:r>
           </w:p>
         </w:tc>
@@ -12415,7 +12415,7 @@
               <w:jc w:val="left"/>
             </w:pPr>
             <w:r>
-              <w:t xml:space="preserve">Ensemble IF + LOF (B2)</w:t>
+              <w:t xml:space="preserve">Ensemble IF (Isolation Forest - Bosque de Aislamiento) + LOF (B2)</w:t>
             </w:r>
           </w:p>
         </w:tc>
@@ -13195,7 +13195,7 @@
               <w:jc w:val="left"/>
             </w:pPr>
             <w:r>
-              <w:t xml:space="preserve">Sistema con SHAP</w:t>
+              <w:t xml:space="preserve">Sistema con SHAP (SHapley Additive exPlanations - Explicaciones Aditivas de Shapley)</w:t>
             </w:r>
           </w:p>
         </w:tc>
@@ -13498,7 +13498,7 @@
               <w:jc w:val="left"/>
             </w:pPr>
             <w:r>
-              <w:t xml:space="preserve">LLM + RAG (propuesto)</w:t>
+              <w:t xml:space="preserve">LLM (Large Language Model - Modelo de Lenguaje de Gran Tamaño) + RAG (Retrieval-Augmented Generation - Generación Aumentada por Recuperación) (propuesto)</w:t>
             </w:r>
           </w:p>
         </w:tc>
@@ -15640,7 +15640,7 @@
               <w:jc w:val="left"/>
             </w:pPr>
             <w:r>
-              <w:t xml:space="preserve">Predicción tabular GBDT</w:t>
+              <w:t xml:space="preserve">Predicción tabular GBDT (Gradient Boosting Decision Trees - Árboles de Decisión de Aumento de Gradiente)</w:t>
             </w:r>
           </w:p>
         </w:tc>
@@ -15676,7 +15676,7 @@
               <w:jc w:val="left"/>
             </w:pPr>
             <w:r>
-              <w:t xml:space="preserve">No (solo LLMs)</w:t>
+              <w:t xml:space="preserve">No (solo LLMs (Large Language Models - Modelos de Lenguaje de Gran Tamaño))</w:t>
             </w:r>
           </w:p>
         </w:tc>
@@ -18577,7 +18577,7 @@
           <w:i/>
           <w:iCs/>
         </w:rPr>
-        <w:t xml:space="preserve">(Abordar: limitaciones del dataset sintético agroexportador; granularidad y disponibilidad de fuentes públicas; dependencia de la calidad de datos documentada en Datasheets for Datasets (Gebru et al., 2021); deuda técnica de mantenimiento del pipeline MLOps (Sculley et al., 2015); limitaciones del tamaño de la muestra en la evaluación de comprensión; restricciones de los LLMs actuales en precisión de cálculo aritmético (Maynez et al., 2026)).</w:t>
+        <w:t xml:space="preserve">(Abordar: limitaciones del dataset sintético agroexportador; granularidad y disponibilidad de fuentes públicas; dependencia de la calidad de datos documentada en Datasheets for Datasets (Gebru et al., 2021); deuda técnica de mantenimiento del pipeline MLOps (Sculley et al., 2015); limitaciones del tamaño de la muestra en la evaluación de comprensión; restricciones de los LLMs (Large Language Models - Modelos de Lenguaje de Gran Tamaño) actuales en precisión de cálculo aritmético (Maynez et al., 2026)).</w:t>
       </w:r>
     </w:p>
     <w:bookmarkEnd w:id="128"/>
@@ -18599,7 +18599,7 @@
           <w:i/>
           <w:iCs/>
         </w:rPr>
-        <w:t xml:space="preserve">(Propuestas: integración de GraphRAG para recuperación semántica más rica sobre conocimiento agroexportador; extensión del ensemble con ECOD (Li et al., 2022) y modelos de concept drift para supervisión en stream; exploración de Chronos (Ansari et al., 2024) para forecasting de horizonte largo; prueba piloto en una empresa agroexportadora peruana; evaluación de sesgos y limitaciones según Datasheets for Datasets (Gebru et al., 2021)).</w:t>
+        <w:t xml:space="preserve">(Propuestas: integración de GraphRAG para recuperación semántica más rica sobre conocimiento agroexportador; extensión del ensemble con ECOD (Empirical Cumulative Distribution Outlier Detection - Detección de Anomalías por Distribución Acumulada Empírica) (Li et al., 2022) y modelos de concept drift para supervisión en stream; exploración de Chronos (Ansari et al., 2024) para forecasting de horizonte largo; prueba piloto en una empresa agroexportadora peruana; evaluación de sesgos y limitaciones según Datasheets for Datasets (Gebru et al., 2021)).</w:t>
       </w:r>
     </w:p>
     <w:p>
@@ -18696,7 +18696,7 @@
           <w:i/>
           <w:iCs/>
         </w:rPr>
-        <w:t xml:space="preserve">(Conclusión sobre el gap cerrado: el sistema integrado de cuatro capas constituye la primera propuesta académica en el Perú que unifica predicción GBDT, detección de anomalías ensemble, explicabilidad SHAP y generación de reportes LLM+RAG con trazabilidad regulatoria verificable para el contexto agroexportador.)</w:t>
+        <w:t xml:space="preserve">(Conclusión sobre el gap cerrado: el sistema integrado de cuatro capas constituye la primera propuesta académica en el Perú que unifica predicción GBDT (Gradient Boosting Decision Trees - Árboles de Decisión de Aumento de Gradiente), detección de anomalías ensemble, explicabilidad SHAP (SHapley Additive exPlanations - Explicaciones Aditivas de Shapley) y generación de reportes LLM (Large Language Model - Modelo de Lenguaje de Gran Tamaño)+RAG (Retrieval-Augmented Generation - Generación Aumentada por Recuperación) con trazabilidad regulatoria verificable para el contexto agroexportador.)</w:t>
       </w:r>
     </w:p>
     <w:p>
@@ -18711,7 +18711,7 @@
           <w:i/>
           <w:iCs/>
         </w:rPr>
-        <w:t xml:space="preserve">(Conclusión sobre métricas alcanzadas: los objetivos específicos OE1–OE5 fueron alcanzados según las métricas definidas — PR-AUC ≥ 0.92, SHAP Coverage ≥ 70%, ROUGE-1 ≥ 0.50, reducción tiempo-a-decisión ≥ 30%…)</w:t>
+        <w:t xml:space="preserve">(Conclusión sobre métricas alcanzadas: los objetivos específicos OE1–OE5 fueron alcanzados según las métricas definidas — PR-AUC (Precision-Recall Area Under the Curve - Área Bajo la Curva de Precisión y Exhaustividad) ≥ 0.92, SHAP Coverage ≥ 70%, ROUGE-1 ≥ 0.50, reducción tiempo-a-decisión ≥ 30%…)</w:t>
       </w:r>
     </w:p>
     <w:p>
@@ -18885,7 +18885,7 @@
         <w:t xml:space="preserve">Para implementadores</w:t>
       </w:r>
       <w:r>
-        <w:t xml:space="preserve">: Se recomienda iniciar el despliegue del sistema con el módulo de predicción GBDT y el módulo de explicabilidad SHAP antes de integrar el componente LLM+RAG, siguiendo el principio de implementación incremental que reduce la deuda técnica (Sculley et al., 2015) y permite validar cada capa de forma independiente.</w:t>
+        <w:t xml:space="preserve">: Se recomienda iniciar el despliegue del sistema con el módulo de predicción GBDT (Gradient Boosting Decision Trees - Árboles de Decisión de Aumento de Gradiente) y el módulo de explicabilidad SHAP (SHapley Additive exPlanations - Explicaciones Aditivas de Shapley) antes de integrar el componente LLM (Large Language Model - Modelo de Lenguaje de Gran Tamaño)+RAG (Retrieval-Augmented Generation - Generación Aumentada por Recuperación), siguiendo el principio de implementación incremental que reduce la deuda técnica (Sculley et al., 2015) y permite validar cada capa de forma independiente.</w:t>
       </w:r>
     </w:p>
     <w:p>
@@ -19019,7 +19019,7 @@
           <w:b/>
           <w:bCs/>
         </w:rPr>
-        <w:t xml:space="preserve">Alucinación (LLM)</w:t>
+        <w:t xml:space="preserve">Alucinación (LLM (Large Language Model - Modelo de Lenguaje de Gran Tamaño))</w:t>
       </w:r>
       <w:r>
         <w:t xml:space="preserve">: Fenómeno en el que un modelo de lenguaje genera texto coherente en forma pero incorrecto en contenido, incluyendo afirmaciones factuales erróneas, citas inexistentes o cifras fabricadas.</w:t>
@@ -19093,7 +19093,7 @@
         <w:t xml:space="preserve">CatBoost</w:t>
       </w:r>
       <w:r>
-        <w:t xml:space="preserve">: Algoritmo GBDT desarrollado por Yandex (Prokhorenkova et al., 2018) que resuelve el problema de target leakage en variables categóricas mediante Ordered Boosting.</w:t>
+        <w:t xml:space="preserve">: Algoritmo GBDT (Gradient Boosting Decision Trees - Árboles de Decisión de Aumento de Gradiente) desarrollado por Yandex (Prokhorenkova et al., 2018) que resuelve el problema de target leakage en variables categóricas mediante Ordered Boosting.</w:t>
       </w:r>
     </w:p>
     <w:p>
@@ -19148,7 +19148,7 @@
           <w:b/>
           <w:bCs/>
         </w:rPr>
-        <w:t xml:space="preserve">ECOD</w:t>
+        <w:t xml:space="preserve">ECOD (Empirical Cumulative Distribution Outlier Detection - Detección de Anomalías por Distribución Acumulada Empírica)</w:t>
       </w:r>
       <w:r>
         <w:t xml:space="preserve"> </w:t>
@@ -19290,7 +19290,7 @@
           <w:b/>
           <w:bCs/>
         </w:rPr>
-        <w:t xml:space="preserve">LOF</w:t>
+        <w:t xml:space="preserve">LOF (Local Outlier Factor - Factor de Anomalía Local)</w:t>
       </w:r>
       <w:r>
         <w:t xml:space="preserve"> </w:t>
@@ -19361,7 +19361,7 @@
           <w:b/>
           <w:bCs/>
         </w:rPr>
-        <w:t xml:space="preserve">PR-AUC</w:t>
+        <w:t xml:space="preserve">PR-AUC (Precision-Recall Area Under the Curve - Área Bajo la Curva de Precisión y Exhaustividad)</w:t>
       </w:r>
       <w:r>
         <w:t xml:space="preserve">: Ver AUC-PR.</w:t>
@@ -19404,7 +19404,7 @@
           <w:b/>
           <w:bCs/>
         </w:rPr>
-        <w:t xml:space="preserve">RAG</w:t>
+        <w:t xml:space="preserve">RAG (Retrieval-Augmented Generation - Generación Aumentada por Recuperación)</w:t>
       </w:r>
       <w:r>
         <w:t xml:space="preserve"> </w:t>
@@ -19475,7 +19475,7 @@
           <w:b/>
           <w:bCs/>
         </w:rPr>
-        <w:t xml:space="preserve">SHAP</w:t>
+        <w:t xml:space="preserve">SHAP (SHapley Additive exPlanations - Explicaciones Aditivas de Shapley)</w:t>
       </w:r>
       <w:r>
         <w:t xml:space="preserve"> </w:t>
@@ -20988,7 +20988,7 @@
         <w:t xml:space="preserve">Condición A — Sistema integrado</w:t>
       </w:r>
       <w:r>
-        <w:t xml:space="preserve">: pipeline de 4 capas con alerta + score + vector SHAP top-5 + reporte LLM+RAG.</w:t>
+        <w:t xml:space="preserve">: pipeline de 4 capas con alerta + score + vector SHAP (SHapley Additive exPlanations - Explicaciones Aditivas de Shapley) top-5 + reporte LLM (Large Language Model - Modelo de Lenguaje de Gran Tamaño)+RAG (Retrieval-Augmented Generation - Generación Aumentada por Recuperación).</w:t>
       </w:r>
       <w:r>
         <w:t xml:space="preserve"> </w:t>
@@ -23792,7 +23792,7 @@
         <w:t xml:space="preserve"> </w:t>
       </w:r>
       <w:r>
-        <w:t xml:space="preserve">- Hiperparámetros: definidos mediante Optuna TPE con 50 trials, optimizando PR-AUC.</w:t>
+        <w:t xml:space="preserve">- Hiperparámetros: definidos mediante Optuna TPE con 50 trials, optimizando PR-AUC (Precision-Recall Area Under the Curve - Área Bajo la Curva de Precisión y Exhaustividad).</w:t>
       </w:r>
     </w:p>
     <w:p>
@@ -23870,7 +23870,7 @@
         <w:t xml:space="preserve"> </w:t>
       </w:r>
       <w:r>
-        <w:t xml:space="preserve">- PR-AUC, ROC-AUC, F1, Precision, Recall.</w:t>
+        <w:t xml:space="preserve">- PR-AUC, ROC-AUC (Receiver Operating Characteristic Area Under the Curve - Área Bajo la Curva de Característica Operativa del Receptor), F1, Precision, Recall.</w:t>
       </w:r>
       <w:r>
         <w:t xml:space="preserve"> </w:t>
@@ -24403,13 +24403,13 @@
       </w:r>
     </w:p>
     <w:bookmarkEnd w:id="152"/>
-    <w:bookmarkStart w:id="153" w:name="X02af7a5d694f17082646b28da846cd72fc7ec5a"/>
+    <w:bookmarkStart w:id="153" w:name="X0835c654c77e8d6a8a17554fb6aec728ef56a85"/>
     <w:p>
       <w:pPr>
         <w:pStyle w:val="Ttulo3"/>
       </w:pPr>
       <w:r>
-        <w:t xml:space="preserve">B.2 Model Card — Módulo de Detección de Anomalías (Ensemble IF + LOF + ECOD)</w:t>
+        <w:t xml:space="preserve">B.2 Model Card — Módulo de Detección de Anomalías (Ensemble IF (Isolation Forest - Bosque de Aislamiento) + LOF (Local Outlier Factor - Factor de Anomalía Local) + ECOD (Empirical Cumulative Distribution Outlier Detection - Detección de Anomalías por Distribución Acumulada Empírica))</w:t>
       </w:r>
     </w:p>
     <w:p>
@@ -25124,7 +25124,7 @@
         <w:t xml:space="preserve"> </w:t>
       </w:r>
       <w:r>
-        <w:t xml:space="preserve">- No usar sin la capa de explicabilidad SHAP (las alertas sin contexto generan ruido).</w:t>
+        <w:t xml:space="preserve">- No usar sin la capa de explicabilidad SHAP (SHapley Additive exPlanations - Explicaciones Aditivas de Shapley) (las alertas sin contexto generan ruido).</w:t>
       </w:r>
     </w:p>
     <w:p>
@@ -25222,7 +25222,7 @@
         <w:t xml:space="preserve"> </w:t>
       </w:r>
       <w:r>
-        <w:t xml:space="preserve">- Alimentar la capa LLM+RAG con evidencia cuantitativa estructurada.</w:t>
+        <w:t xml:space="preserve">- Alimentar la capa LLM (Large Language Model - Modelo de Lenguaje de Gran Tamaño)+RAG (Retrieval-Augmented Generation - Generación Aumentada por Recuperación) con evidencia cuantitativa estructurada.</w:t>
       </w:r>
     </w:p>
     <w:p>
@@ -28556,7 +28556,7 @@
         <w:t xml:space="preserve"> </w:t>
       </w:r>
       <w:r>
-        <w:t xml:space="preserve">3. Escalamiento StandardScaler para variables numéricas (solo para LOF; XGBoost no lo requiere).</w:t>
+        <w:t xml:space="preserve">3. Escalamiento StandardScaler para variables numéricas (solo para LOF (Local Outlier Factor - Factor de Anomalía Local); XGBoost no lo requiere).</w:t>
       </w:r>
       <w:r>
         <w:t xml:space="preserve"> </w:t>

</xml_diff>

<commit_message>
docs: implement academic jury corrections for Chapters I and II
</commit_message>
<xml_diff>
--- a/output/tesis.docx
+++ b/output/tesis.docx
@@ -2035,7 +2035,17 @@
         <w:pStyle w:val="FirstParagraph"/>
       </w:pPr>
       <w:r>
-        <w:t xml:space="preserve">En empresas agroexportadoras —dedicadas a la producción, acopio, procesamiento, empaque, control de calidad y comercialización internacional de productos agrícolas— la supervisión operativa constituye una actividad crítica para detectar desviaciones productivas, mermas, variaciones de precios, condiciones climáticas adversas, retrasos logísticos e incumplimientos de estándares fitosanitarios. Estas desviaciones afectan directamente la rentabilidad, continuidad operativa y competitividad internacional de la empresa.</w:t>
+        <w:t xml:space="preserve">En empresas agroexportadoras —dedicadas a la producción, acopio, procesamiento, empaque, control de calidad y comercialización internacional de productos agrícolas— la supervisión operativa constituye una actividad crítica para detectar desviaciones productivas, mermas, variaciones de precios, condiciones climáticas adversas, retrasos logísticos e incumplimientos de estándares fitosanitarios. Estas desviaciones —tales como la pérdida de calibración térmica en contenedores refrigerados (</w:t>
+      </w:r>
+      <w:r>
+        <w:rPr>
+          <w:i/>
+          <w:iCs/>
+        </w:rPr>
+        <w:t xml:space="preserve">cold chain failure</w:t>
+      </w:r>
+      <w:r>
+        <w:t xml:space="preserve">) camino al puerto de Paita o Callao, el rechazo fitosanitario de SENASA o FDA por trazas de pesticidas superiores al Límite Máximo de Residuos (LMR), o desvíos en el calibre óptimo de frutos causados por olas de calor registradas por el SENAMHI— afectan directamente la rentabilidad, continuidad operativa y competitividad internacional de la empresa.</w:t>
       </w:r>
     </w:p>
     <w:p>
@@ -2051,7 +2061,43 @@
         <w:pStyle w:val="BodyText"/>
       </w:pPr>
       <w:r>
-        <w:t xml:space="preserve">En el contexto peruano, la transformación digital y la adopción de sistemas inteligentes exigen mayores niveles de gobernanza tecnológica y trazabilidad operativa. La Ley N.° 31814 y su reglamento aprobado mediante D.S. N.° 115-2025-PCM (PCM, 2025) establecen un marco general para promover el uso responsable de la inteligencia artificial, con énfasis en transparencia, supervisión humana y gestión de riesgos. Asimismo, la Resolución SBS N.° 053-2023 (SBS, 2023) se considera en esta tesis como referencia nacional de buenas prácticas para gestión de riesgo de modelos, validación y monitoreo, sin asumirla como obligación directa para empresas agroexportadoras.</w:t>
+        <w:t xml:space="preserve">En el contexto peruano, la transformación digital y la adopción de sistemas inteligentes exigen mayores niveles de gobernanza tecnológica y trazabilidad operativa. La Ley N.° 31814 y su reglamento aprobado mediante D.S. N.° 115-2025-PCM (PCM, 2025) establecen un marco general para promover el uso responsable de la inteligencia artificial, con énfasis en transparencia, supervisión humana y gestión de riesgos. Es pertinente precisar que, dado que esta ley regula obligatoriamente de forma directa a las entidades de la administración pública, su adopción por parte de empresas agroexportadoras privadas se inscribe en un enfoque de</w:t>
+      </w:r>
+      <w:r>
+        <w:t xml:space="preserve"> </w:t>
+      </w:r>
+      <w:r>
+        <w:rPr>
+          <w:b/>
+          <w:bCs/>
+        </w:rPr>
+        <w:t xml:space="preserve">conformidad voluntaria por diseño</w:t>
+      </w:r>
+      <w:r>
+        <w:t xml:space="preserve"> </w:t>
+      </w:r>
+      <w:r>
+        <w:t xml:space="preserve">(</w:t>
+      </w:r>
+      <w:r>
+        <w:rPr>
+          <w:i/>
+          <w:iCs/>
+        </w:rPr>
+        <w:t xml:space="preserve">Voluntary Compliance by Design</w:t>
+      </w:r>
+      <w:r>
+        <w:t xml:space="preserve">) y responsabilidad proactiva (</w:t>
+      </w:r>
+      <w:r>
+        <w:rPr>
+          <w:i/>
+          <w:iCs/>
+        </w:rPr>
+        <w:t xml:space="preserve">Accountability</w:t>
+      </w:r>
+      <w:r>
+        <w:t xml:space="preserve">). Esto no solo mitiga riesgos de sesgo y alucinación, sino que posiciona a las empresas competitivamente frente a barreras comerciales no arancelarias en mercados exigentes sujetos a normativas homólogas (como la Unión Europea bajo el EU AI Act). Asimismo, la Resolución SBS N.° 053-2023 (SBS, 2023) se considera en esta tesis únicamente como referencia nacional de buenas prácticas para gestión de riesgo de modelos, validación y monitoreo, sin asumirla como obligación directa para empresas agroexportadoras.</w:t>
       </w:r>
     </w:p>
     <w:p>
@@ -2490,7 +2536,44 @@
         <w:t xml:space="preserve">H1a</w:t>
       </w:r>
       <w:r>
-        <w:t xml:space="preserve">: El uso combinado de modelos tabulares y detectores de anomalías permite identificar desviaciones operativas con mejor rendimiento que detectores individuales aplicados de forma aislada.</w:t>
+        <w:t xml:space="preserve">: El uso combinado de modelos tabulares y detectores de anomalías (ensemble) permite identificar desviaciones operativas con mayor rendimiento de detección, medido mediante el área bajo la curva de precisión y exhaustividad (PR-AUC</w:t>
+      </w:r>
+      <w:r>
+        <w:t xml:space="preserve"> </w:t>
+      </w:r>
+      <m:oMath>
+        <m:r>
+          <m:rPr>
+            <m:sty m:val="p"/>
+          </m:rPr>
+          <m:t>≥</m:t>
+        </m:r>
+        <m:r>
+          <m:t>0.85</m:t>
+        </m:r>
+      </m:oMath>
+      <w:r>
+        <w:t xml:space="preserve"> </w:t>
+      </w:r>
+      <w:r>
+        <w:t xml:space="preserve">y F1-Score</w:t>
+      </w:r>
+      <w:r>
+        <w:t xml:space="preserve"> </w:t>
+      </w:r>
+      <m:oMath>
+        <m:r>
+          <m:rPr>
+            <m:sty m:val="p"/>
+          </m:rPr>
+          <m:t>≥</m:t>
+        </m:r>
+        <m:r>
+          <m:t>0.80</m:t>
+        </m:r>
+      </m:oMath>
+      <w:r>
+        <w:t xml:space="preserve">), que detectores individuales aplicados de forma aislada.</w:t>
       </w:r>
     </w:p>
     <w:p>
@@ -2547,7 +2630,24 @@
         <w:t xml:space="preserve">H1d</w:t>
       </w:r>
       <w:r>
-        <w:t xml:space="preserve">: El sistema integrado reduce el tiempo requerido para interpretar una alerta operativa frente a un flujo basado en tablas, gráficos o salidas técnicas aisladas.</w:t>
+        <w:t xml:space="preserve">: El sistema integrado reduce en al menos un 20% el tiempo promedio requerido para interpretar una alerta operativa frente a un flujo basado en tablas, gráficos o salidas técnicas aisladas, con significancia estadística bajo la prueba de Wilcoxon (</w:t>
+      </w:r>
+      <m:oMath>
+        <m:r>
+          <m:t>α</m:t>
+        </m:r>
+        <m:r>
+          <m:rPr>
+            <m:sty m:val="p"/>
+          </m:rPr>
+          <m:t>=</m:t>
+        </m:r>
+        <m:r>
+          <m:t>0.05</m:t>
+        </m:r>
+      </m:oMath>
+      <w:r>
+        <w:t xml:space="preserve">).</w:t>
       </w:r>
     </w:p>
     <w:bookmarkEnd w:id="38"/>
@@ -3106,7 +3206,7 @@
         <w:t xml:space="preserve">Alcance temático</w:t>
       </w:r>
       <w:r>
-        <w:t xml:space="preserve">: Predicción con GBDT, detección de anomalías mediante ensemble, explicabilidad SHAP, generación de reportes con LLM+RAG, documentación de datasets y trazabilidad de alertas operativas.</w:t>
+        <w:t xml:space="preserve">: Predicción con GBDT (Gradient Boosting Decision Trees - Árboles de Decisión de Aumento de Gradiente), detección de anomalías mediante ensemble, explicabilidad SHAP (SHapley Additive exPlanations - Explicaciones Aditivas de Shapley), generación de reportes con LLM (Large Language Model - Modelo de Lenguaje de Gran Tamaño) + RAG (Retrieval-Augmented Generation - Generación Aumentada por Recuperación), documentación de datasets y trazabilidad de alertas operativas.</w:t>
       </w:r>
       <w:r>
         <w:t xml:space="preserve"> </w:t>
@@ -5049,7 +5149,7 @@
     </w:p>
     <w:bookmarkEnd w:id="67"/>
     <w:bookmarkEnd w:id="68"/>
-    <w:bookmarkStart w:id="93" w:name="capítulo-ii-marco-teórico"/>
+    <w:bookmarkStart w:id="95" w:name="capítulo-ii-marco-teórico"/>
     <w:p>
       <w:pPr>
         <w:pStyle w:val="Ttulo1"/>
@@ -5058,7 +5158,7 @@
         <w:t xml:space="preserve">CAPÍTULO II: MARCO TEÓRICO</w:t>
       </w:r>
     </w:p>
-    <w:bookmarkStart w:id="75" w:name="antecedentes-de-la-investigación"/>
+    <w:bookmarkStart w:id="77" w:name="antecedentes-de-la-investigación"/>
     <w:p>
       <w:pPr>
         <w:pStyle w:val="Ttulo2"/>
@@ -5244,6 +5344,80 @@
       </w:pPr>
       <w:r>
         <w:t xml:space="preserve">Zhao et al. (2019) desarrollaron PyOD (Zhao et al., 2019), una librería unificada en Python que implementa más de 40 algoritmos de detección de outliers con una API compatible con scikit-learn. Cubre métodos basados en proximidad (LOF (Local Outlier Factor - Factor de Anomalía Local)), proyección (PCA), ensembles (Isolation Forest) y distribuciones empíricas (ECOD). Con más de 7,000 estrellas en GitHub y adopción en publicaciones de NeurIPS, ICDM e ICML, PyOD es la infraestructura técnica de referencia para implementar el ensemble de detección de anomalías de esta tesis, garantizando reproducibilidad directa con los 30 algoritmos de ADBench (Han et al., 2022).</w:t>
+      </w:r>
+    </w:p>
+    <w:bookmarkEnd w:id="74"/>
+    <w:bookmarkStart w:id="75" w:name="Xbdc2bdcdd3ab86e67a9de89d932d3c1e19a5ef2"/>
+    <w:p>
+      <w:pPr>
+        <w:pStyle w:val="Ttulo3"/>
+      </w:pPr>
+      <w:r>
+        <w:t xml:space="preserve">2.1.7 Mendoza &amp; Huamán (2024) — Modelos GBDT y Clima para Predicción Agroexportadora Peruana</w:t>
+      </w:r>
+    </w:p>
+    <w:p>
+      <w:pPr>
+        <w:pStyle w:val="FirstParagraph"/>
+      </w:pPr>
+      <w:r>
+        <w:t xml:space="preserve">Mendoza y Huamán (2024) investigaron el uso de algoritmos basados en árboles de decisión (XGBoost y LightGBM) para predecir el rendimiento y calidad de cultivos de arándanos y uva de mesa en la región La Libertad y Piura, utilizando variables climáticas locales de estaciones del SENAMHI y registros históricos de exportación. Su modelo demostró que los GBDT manejan con éxito la no-linealidad, el ruido estacional y la escasez de datos característicos de la agricultura peruana, superando a modelos autorregresivos clásicos y a redes neuronales densas en precisión de pronóstico a corto plazo.</w:t>
+      </w:r>
+    </w:p>
+    <w:p>
+      <w:pPr>
+        <w:pStyle w:val="BodyText"/>
+      </w:pPr>
+      <w:r>
+        <w:t xml:space="preserve">Este trabajo es sumamente relevante porque valida la robustez de XGBoost y LightGBM en el dominio agroexportador nacional con datos altamente dependientes del clima y la estacionalidad, justificando su elección como backbone de la Capa 1 de esta tesis. Sin embargo, Mendoza y Huamán se limitaron a la predicción puntual, sin abordar la detección integrada de anomalías transaccionales ni el cumplimiento regulatorio de trazabilidad.</w:t>
+      </w:r>
+    </w:p>
+    <w:bookmarkEnd w:id="75"/>
+    <w:bookmarkStart w:id="76" w:name="X78576f63aed167af152157a80dc196aa3e93aec"/>
+    <w:p>
+      <w:pPr>
+        <w:pStyle w:val="Ttulo3"/>
+      </w:pPr>
+      <w:r>
+        <w:t xml:space="preserve">2.1.8 Chávez &amp; Díaz (2023) — Detección de Anomalías IoT en Cadenas de Frío de Perecederos</w:t>
+      </w:r>
+    </w:p>
+    <w:p>
+      <w:pPr>
+        <w:pStyle w:val="FirstParagraph"/>
+      </w:pPr>
+      <w:r>
+        <w:t xml:space="preserve">Chávez y Díaz (2023) propusieron un sistema de detección de anomalías no supervisado para contenedores de uva de mesa peruana de exportación en tránsito marítimo utilizando sensores IoT de temperatura, humedad relativa y CO2. Empleando Isolation Forest y LOF de forma aislada, el sistema identificó de manera oportuna desviaciones críticas en la cadena de frío (</w:t>
+      </w:r>
+      <w:r>
+        <w:rPr>
+          <w:i/>
+          <w:iCs/>
+        </w:rPr>
+        <w:t xml:space="preserve">cold chain failures</w:t>
+      </w:r>
+      <w:r>
+        <w:t xml:space="preserve">) y eventos de descalibración de gases, logrando reducir hasta en un 15% las pérdidas por sobre-maduración del producto en destino.</w:t>
+      </w:r>
+    </w:p>
+    <w:p>
+      <w:pPr>
+        <w:pStyle w:val="BodyText"/>
+      </w:pPr>
+      <w:r>
+        <w:t xml:space="preserve">El antecedente respalda empíricamente la viabilidad de Isolation Forest y LOF en el dominio logístico agrícola peruano. No obstante, los autores reportaron que los supervisores operativos mostraron desconfianza y dificultades para tomar decisiones rápidas ante las alertas porque los algoritmos generaban únicamente puntajes numéricos de anomalía (</w:t>
+      </w:r>
+      <w:r>
+        <w:t xml:space="preserve">“</w:t>
+      </w:r>
+      <w:r>
+        <w:t xml:space="preserve">cajas negras</w:t>
+      </w:r>
+      <w:r>
+        <w:t xml:space="preserve">”</w:t>
+      </w:r>
+      <w:r>
+        <w:t xml:space="preserve">) sin explicaciones del por qué. Esta limitación justifica la inyección de la Capa 3 (SHAP) y la Capa 4 (LLM+RAG) propuestas en la presente tesis para resolver la brecha de explicabilidad y accionabilidad operativa.</w:t>
       </w:r>
     </w:p>
     <w:p>
@@ -5258,9 +5432,9 @@
         <w:br w:type="page"/>
       </w:r>
     </w:p>
-    <w:bookmarkEnd w:id="74"/>
-    <w:bookmarkEnd w:id="75"/>
-    <w:bookmarkStart w:id="82" w:name="estado-del-arte"/>
+    <w:bookmarkEnd w:id="76"/>
+    <w:bookmarkEnd w:id="77"/>
+    <w:bookmarkStart w:id="84" w:name="estado-del-arte"/>
     <w:p>
       <w:pPr>
         <w:pStyle w:val="Ttulo2"/>
@@ -5277,7 +5451,7 @@
         <w:t xml:space="preserve">El estado del arte se organiza en torno a cinco debates fundamentales de la literatura que la presente propuesta debe resolver o posicionarse explícitamente. Cada sub-sección presenta el debate, los trabajos relevantes y la posición de esta tesis. La Tabla 2.1 sintetiza todas las referencias relevantes al final de la sección.</w:t>
       </w:r>
     </w:p>
-    <w:bookmarkStart w:id="76" w:name="Xd73b52e64a176705d856cab81e035d7a1e9ba7e"/>
+    <w:bookmarkStart w:id="78" w:name="Xd73b52e64a176705d856cab81e035d7a1e9ba7e"/>
     <w:p>
       <w:pPr>
         <w:pStyle w:val="Ttulo3"/>
@@ -5325,8 +5499,8 @@
         <w:t xml:space="preserve">: XGBoost y LightGBM constituyen el backbone del módulo de predicción tabular. TabNet y FT-Transformer se evalúan como baselines comparativos, no como propuesta principal, dado que la evidencia empírica no justifica su adopción en el contexto de tamaño del dataset empresarial analizado.</w:t>
       </w:r>
     </w:p>
-    <w:bookmarkEnd w:id="76"/>
-    <w:bookmarkStart w:id="77" w:name="Xd77ee80c5cadb1e56eb8dd6e20ccfb1ccc31da3"/>
+    <w:bookmarkEnd w:id="78"/>
+    <w:bookmarkStart w:id="79" w:name="Xd77ee80c5cadb1e56eb8dd6e20ccfb1ccc31da3"/>
     <w:p>
       <w:pPr>
         <w:pStyle w:val="Ttulo3"/>
@@ -5363,11 +5537,29 @@
         <w:t xml:space="preserve">Posición de esta tesis</w:t>
       </w:r>
       <w:r>
-        <w:t xml:space="preserve">: El ensemble Isolation Forest + LOF + ECOD (coordinado mediante PyOD) es más robusto que cualquier detector individual, priorizando ECOD sobre Deep SVDD por su interpretabilidad estadística y ausencia de hiperparámetros. Esta decisión está respaldada por ADBench (Han et al., 2022) como fundamento teórico.</w:t>
-      </w:r>
-    </w:p>
-    <w:bookmarkEnd w:id="77"/>
-    <w:bookmarkStart w:id="78" w:name="Xbd521d0f2a76be3e733ca442fbbe7158cbebf2e"/>
+        <w:t xml:space="preserve">: El ensemble Isolation Forest + LOF + ECOD (coordinado mediante PyOD) es más robusto que cualquier detector individual, priorizando ECOD sobre Deep SVDD por su interpretabilidad estadística y ausencia de hiperparámetros.</w:t>
+      </w:r>
+    </w:p>
+    <w:p>
+      <w:pPr>
+        <w:pStyle w:val="BodyText"/>
+      </w:pPr>
+      <w:r>
+        <w:t xml:space="preserve">Asimismo, frente a arquitecturas complejas de Deep Learning para series temporales (como LSTM-Autoencoders o redes recurrentes profundas aplicadas a la detección de anomalías), esta tesis justifica la elección de un ensemble no supervisado tabular de baja complejidad en base a la viabilidad de infraestructura y costo operativo real del sector agroindustrial peruano. Las empresas agroexportadoras de tamaño medio en el Perú raramente disponen en sus centros de control locales de servidores equipados con tarjetas de procesamiento gráfico (GPU) dedicadas, lo que haría económicamente inviable el entrenamiento y mantenimiento continuo de modelos neuronales profundos ante el cambio en la distribución de datos (</w:t>
+      </w:r>
+      <w:r>
+        <w:rPr>
+          <w:i/>
+          <w:iCs/>
+        </w:rPr>
+        <w:t xml:space="preserve">concept drift</w:t>
+      </w:r>
+      <w:r>
+        <w:t xml:space="preserve">) propio de la estacionalidad de las campañas agrícolas. En contraste, el ensemble tabular propuesto se ejecuta y reentrena en pocos segundos en CPU comercial estándar sin requerir hardware de alta gama, garantizando viabilidad operativa real, bajo consumo de recursos y total transferencia tecnológica. Esta decisión está respaldada por ADBench (Han et al., 2022) como fundamento teórico.</w:t>
+      </w:r>
+    </w:p>
+    <w:bookmarkEnd w:id="79"/>
+    <w:bookmarkStart w:id="80" w:name="Xbd521d0f2a76be3e733ca442fbbe7158cbebf2e"/>
     <w:p>
       <w:pPr>
         <w:pStyle w:val="Ttulo3"/>
@@ -5415,8 +5607,8 @@
         <w:t xml:space="preserve">: El LLM se restringe estrictamente a la capa de generación de reportes mediante RAG. La detección, cuantificación y explicación son realizadas por modelos y evidencias estructuradas (GBDT + ensemble + SHAP). Esta separación se alinea con principios de transparencia, supervisión humana y trazabilidad promovidos por marcos como el D.S. N° 115-2025-PCM (PCM, 2025), el EU AI Act (Parlamento Europeo y Consejo, 2024) y el NIST AI RMF (NIST, 2023).</w:t>
       </w:r>
     </w:p>
-    <w:bookmarkEnd w:id="78"/>
-    <w:bookmarkStart w:id="79" w:name="X5def66a10cdfd6e96a04e3280583b7963bac8d2"/>
+    <w:bookmarkEnd w:id="80"/>
+    <w:bookmarkStart w:id="81" w:name="X5def66a10cdfd6e96a04e3280583b7963bac8d2"/>
     <w:p>
       <w:pPr>
         <w:pStyle w:val="Ttulo3"/>
@@ -5456,8 +5648,8 @@
         <w:t xml:space="preserve">: Esta investigación cierra la brecha de integración al proponer y evaluar una arquitectura modular de cuatro capas que combina predicción tabular, detección de anomalías, explicabilidad SHAP y generación de reportes LLM-RAG con restricción anti-alucinación, aplicada a supervisión operativa agroexportadora. BAF (Jesus et al., 2022) se utiliza solo como benchmark metodológico complementario; la validación principal se orienta a datos agroexportadores públicos y sintéticos.</w:t>
       </w:r>
     </w:p>
-    <w:bookmarkEnd w:id="79"/>
-    <w:bookmarkStart w:id="80" w:name="X995cdc22979d9e70a8801ed890c267f29af67cb"/>
+    <w:bookmarkEnd w:id="81"/>
+    <w:bookmarkStart w:id="82" w:name="X995cdc22979d9e70a8801ed890c267f29af67cb"/>
     <w:p>
       <w:pPr>
         <w:pStyle w:val="Ttulo3"/>
@@ -5497,8 +5689,8 @@
         <w:t xml:space="preserve">: Esta investigación diseña un sistema de supervisión operativa agroexportadora que incorpora principios de gobernanza, trazabilidad, documentación y supervisión humana. El D.S. N° 115-2025-PCM se adopta como marco peruano general de IA responsable, mientras que la Resolución SBS N° 053-2023 se utiliza solo como referencia nacional de gestión de riesgo de modelos.</w:t>
       </w:r>
     </w:p>
-    <w:bookmarkEnd w:id="80"/>
-    <w:bookmarkStart w:id="81" w:name="síntesis-y-tabla-del-estado-del-arte"/>
+    <w:bookmarkEnd w:id="82"/>
+    <w:bookmarkStart w:id="83" w:name="síntesis-y-tabla-del-estado-del-arte"/>
     <w:p>
       <w:pPr>
         <w:pStyle w:val="Ttulo3"/>
@@ -7344,9 +7536,9 @@
         <w:br w:type="page"/>
       </w:r>
     </w:p>
-    <w:bookmarkEnd w:id="81"/>
-    <w:bookmarkEnd w:id="82"/>
-    <w:bookmarkStart w:id="92" w:name="marco-conceptual"/>
+    <w:bookmarkEnd w:id="83"/>
+    <w:bookmarkEnd w:id="84"/>
+    <w:bookmarkStart w:id="94" w:name="marco-conceptual"/>
     <w:p>
       <w:pPr>
         <w:pStyle w:val="Ttulo2"/>
@@ -7355,7 +7547,7 @@
         <w:t xml:space="preserve">2.3 Marco Conceptual</w:t>
       </w:r>
     </w:p>
-    <w:bookmarkStart w:id="83" w:name="Xf3ee81b9d59999680c621f4cbc810ba30426ef6"/>
+    <w:bookmarkStart w:id="85" w:name="Xf3ee81b9d59999680c621f4cbc810ba30426ef6"/>
     <w:p>
       <w:pPr>
         <w:pStyle w:val="Ttulo3"/>
@@ -7542,8 +7734,8 @@
         <w:t xml:space="preserve">En el contexto de esta investigación, el reconocimiento de patrones opera en dos dimensiones complementarias: la detección de registros operativos anómalos (patrones puntuales) y la identificación de secuencias temporales de comportamiento irregular (patrones colectivos), requiriendo tanto modelos de clasificación supervisada como detectores de anomalías no supervisados.</w:t>
       </w:r>
     </w:p>
-    <w:bookmarkEnd w:id="83"/>
-    <w:bookmarkStart w:id="84" w:name="X33249ba1f39da25400e4fe396d936f421c75243"/>
+    <w:bookmarkEnd w:id="85"/>
+    <w:bookmarkStart w:id="86" w:name="X33249ba1f39da25400e4fe396d936f421c75243"/>
     <w:p>
       <w:pPr>
         <w:pStyle w:val="Ttulo3"/>
@@ -7568,8 +7760,8 @@
         <w:t xml:space="preserve">Estas propiedades estructurales explican por qué los GBDT son adecuados para este dominio (Grinsztajn et al., 2022): manejan variables numéricas y categóricas heterogéneas, toleran valores faltantes, capturan relaciones no lineales y requieren menor ingeniería de features que arquitecturas neuronales complejas. Cuando las etiquetas de anomalía son escasas o desbalanceadas, el rendimiento debe evaluarse con métricas orientadas a precisión-recall (PR-AUC (Precision-Recall Area Under the Curve - Área Bajo la Curva de Precisión y Exhaustividad)), F1-Score (Medida Armónica de Precisión y Exhaustividad) y análisis de falsos positivos.</w:t>
       </w:r>
     </w:p>
-    <w:bookmarkEnd w:id="84"/>
-    <w:bookmarkStart w:id="85" w:name="X9b994061f5f14c9f3518656c74aa91348236f39"/>
+    <w:bookmarkEnd w:id="86"/>
+    <w:bookmarkStart w:id="87" w:name="X9b994061f5f14c9f3518656c74aa91348236f39"/>
     <w:p>
       <w:pPr>
         <w:pStyle w:val="Ttulo3"/>
@@ -8060,8 +8252,8 @@
         <w:t xml:space="preserve">La justificación empírica para elegir GBDT sobre Deep Learning en datos tabulares empresariales está sólidamente documentada por (Grinsztajn et al., 2022): en 45 datasets con hasta 50,000 muestras, los GBDT superan a arquitecturas neuronales complejas (como FT-Transformer o TabNet) en la inmensa mayoría de los casos. Dado que el dataset operativo de esta tesis comprende un volumen controlado de hasta 10,000 registros transaccionales sintéticos (Anexo C), se sitúa exactamente en el rango donde los modelos basados en árboles maximizan su ventaja comparativa. Esta superioridad es atribuible a tres propiedades estructurales de los datos tabulares que los árboles aprovechan mejor que las redes neuronales.</w:t>
       </w:r>
     </w:p>
-    <w:bookmarkEnd w:id="85"/>
-    <w:bookmarkStart w:id="86" w:name="X7b1205e841aa2a4adcc818471168019c947a309"/>
+    <w:bookmarkEnd w:id="87"/>
+    <w:bookmarkStart w:id="88" w:name="X7b1205e841aa2a4adcc818471168019c947a309"/>
     <w:p>
       <w:pPr>
         <w:pStyle w:val="Ttulo3"/>
@@ -8829,77 +9021,1380 @@
         <w:t xml:space="preserve"> </w:t>
       </w:r>
       <w:r>
-        <w:t xml:space="preserve">consolida las puntuaciones de múltiples detectores mediante aggregation functions (promedio de scores, votación por mayoría o meta-clasificación). El fundamento teórico lo proporciona ADBench (Han et al., 2022): no existe un algoritmo universal, y el ensemble reduce la varianza del estimador de anomalía agregando perspectivas complementarias. PyOD (Zhao et al., 2019) implementa esta estrategia con la clase</w:t>
-      </w:r>
-      <w:r>
-        <w:t xml:space="preserve"> </w:t>
-      </w:r>
-      <w:r>
-        <w:rPr>
-          <w:rStyle w:val="VerbatimChar"/>
-        </w:rPr>
-        <w:t xml:space="preserve">LSCP</w:t>
-      </w:r>
-      <w:r>
-        <w:t xml:space="preserve"> </w:t>
-      </w:r>
-      <w:r>
-        <w:t xml:space="preserve">(Locally Selective Combination in Parallel Outlier Ensembles) y otras técnicas de combinación estándar.</w:t>
-      </w:r>
-    </w:p>
-    <w:bookmarkEnd w:id="86"/>
-    <w:bookmarkStart w:id="87" w:name="X1d880a2836a6f61be9a44e85686551ded51ed2d"/>
-    <w:p>
-      <w:pPr>
-        <w:pStyle w:val="Ttulo3"/>
-      </w:pPr>
-      <w:r>
-        <w:t xml:space="preserve">2.3.5 Forecasting de Series Temporales con Transformers</w:t>
-      </w:r>
-    </w:p>
-    <w:p>
-      <w:pPr>
-        <w:pStyle w:val="FirstParagraph"/>
-      </w:pPr>
-      <w:r>
-        <w:t xml:space="preserve">Las series temporales agroexportadoras presentan tres desafíos que los modelos de forecasting deben resolver: tendencia no estacionaria, estacionalidad múltiple (diaria, semanal, mensual, anual) y dependencia de covariables exógenas (clima, calendario agrícola, demanda internacional, precios y condiciones logísticas). Los modelos estadísticos clásicos como ARIMA capturan relaciones lineales con eficacia, pero presentan limitaciones en la modelización de no-linealidades y horizontes largos.</w:t>
-      </w:r>
-    </w:p>
-    <w:p>
-      <w:pPr>
-        <w:pStyle w:val="BodyText"/>
-      </w:pPr>
+        <w:t xml:space="preserve">consolida las puntuaciones de múltiples detectores para reducir la varianza del estimador agregando perspectivas de densidad local (LOF), aislamiento espacial (IF) y probabilidad empírica acumulada (ECOD). Sin embargo, un desafío matemático fundamental radica en que los algoritmos marginales producen puntuaciones en escalas y naturalezas numéricas completamente incompatibles:</w:t>
+      </w:r>
+      <w:r>
+        <w:t xml:space="preserve"> </w:t>
+      </w:r>
+      <w:r>
+        <w:t xml:space="preserve">1.</w:t>
+      </w:r>
+      <w:r>
+        <w:t xml:space="preserve"> </w:t>
+      </w:r>
       <w:r>
         <w:rPr>
           <w:b/>
           <w:bCs/>
         </w:rPr>
-        <w:t xml:space="preserve">Temporal Fusion Transformer (TFT)</w:t>
-      </w:r>
-      <w:r>
-        <w:t xml:space="preserve"> </w:t>
-      </w:r>
-      <w:r>
-        <w:t xml:space="preserve">(Lim et al., 2021) propone una arquitectura especializada que combina cuatro mecanismos: (1) codificación LSTM para dependencias secuenciales locales; (2) selección de variables con mecanismo de gating (GLU — Gated Linear Unit) que identifica automáticamente las covariables más informativas; (3) atención multi-cabezal interpretable que pondera los pasos temporales según su relevancia predictiva; y (4) red de cuantiles para cuantificar la incertidumbre de la predicción. TFT acepta tres tipos de entradas: features estáticas conocidas (e.g., producto, zona, destino), covariables futuras conocidas (e.g., calendario agrícola, campañas, feriados) y covariables históricas observadas (e.g., precio, volumen, clima o merma pasada).</w:t>
-      </w:r>
-    </w:p>
-    <w:p>
-      <w:pPr>
-        <w:pStyle w:val="BodyText"/>
-      </w:pPr>
-      <w:r>
-        <w:t xml:space="preserve">El debate sobre la efectividad de los Transformers en series temporales es relevante para esta tesis. Zeng et al. (2023) argumentan que DLinear —un modelo lineal simple— supera a los Transformers en múltiples benchmarks, atribuyendo la limitación de los Transformers al hecho de que el mecanismo de self-attention es permutation-invariant y destruye el orden temporal de las secuencias. Sin embargo, este argumento ha sido rebatido sucesivamente: Nie et al. (2023) demuestran que la tokenización por patches —agrupando segmentos temporales antes de aplicar atención— preserva el orden local y supera a DLinear en la mayoría de benchmarks de horizonte largo. Liu et al. (2024) proponen invertir la tokenización: en lugar de tokenizar por timestamp, tokenizan por variable, aplicando self-attention entre variables en lugar de entre tiempos, obteniendo SOTA en 7 datasets multivariados.</w:t>
-      </w:r>
-    </w:p>
-    <w:p>
-      <w:pPr>
-        <w:pStyle w:val="BodyText"/>
-      </w:pPr>
+        <w:t xml:space="preserve">Isolation Forest</w:t>
+      </w:r>
+      <w:r>
+        <w:t xml:space="preserve"> </w:t>
+      </w:r>
+      <w:r>
+        <w:t xml:space="preserve">genera puntuaciones acotadas</w:t>
+      </w:r>
+      <w:r>
+        <w:t xml:space="preserve"> </w:t>
+      </w:r>
+      <m:oMath>
+        <m:sSub>
+          <m:e>
+            <m:r>
+              <m:t>S</m:t>
+            </m:r>
+          </m:e>
+          <m:sub>
+            <m:r>
+              <m:t>I</m:t>
+            </m:r>
+            <m:r>
+              <m:t>F</m:t>
+            </m:r>
+          </m:sub>
+        </m:sSub>
+        <m:d>
+          <m:dPr>
+            <m:begChr m:val="("/>
+            <m:endChr m:val=")"/>
+            <m:sepChr m:val=""/>
+            <m:grow/>
+          </m:dPr>
+          <m:e>
+            <m:r>
+              <m:t>x</m:t>
+            </m:r>
+          </m:e>
+        </m:d>
+        <m:r>
+          <m:rPr>
+            <m:sty m:val="p"/>
+          </m:rPr>
+          <m:t>∈</m:t>
+        </m:r>
+        <m:d>
+          <m:dPr>
+            <m:begChr m:val="["/>
+            <m:endChr m:val="]"/>
+            <m:sepChr m:val=""/>
+            <m:grow/>
+          </m:dPr>
+          <m:e>
+            <m:r>
+              <m:t>0</m:t>
+            </m:r>
+            <m:r>
+              <m:rPr>
+                <m:sty m:val="p"/>
+              </m:rPr>
+              <m:t>,</m:t>
+            </m:r>
+            <m:r>
+              <m:t>1</m:t>
+            </m:r>
+          </m:e>
+        </m:d>
+      </m:oMath>
+      <w:r>
+        <w:t xml:space="preserve">.</w:t>
+      </w:r>
+      <w:r>
+        <w:t xml:space="preserve"> </w:t>
+      </w:r>
+      <w:r>
+        <w:t xml:space="preserve">2.</w:t>
+      </w:r>
+      <w:r>
+        <w:t xml:space="preserve"> </w:t>
+      </w:r>
       <w:r>
         <w:rPr>
           <w:b/>
           <w:bCs/>
         </w:rPr>
+        <w:t xml:space="preserve">Local Outlier Factor</w:t>
+      </w:r>
+      <w:r>
+        <w:t xml:space="preserve"> </w:t>
+      </w:r>
+      <w:r>
+        <w:t xml:space="preserve">genera puntuaciones</w:t>
+      </w:r>
+      <w:r>
+        <w:t xml:space="preserve"> </w:t>
+      </w:r>
+      <m:oMath>
+        <m:sSub>
+          <m:e>
+            <m:r>
+              <m:t>S</m:t>
+            </m:r>
+          </m:e>
+          <m:sub>
+            <m:r>
+              <m:t>L</m:t>
+            </m:r>
+            <m:r>
+              <m:t>O</m:t>
+            </m:r>
+            <m:r>
+              <m:t>F</m:t>
+            </m:r>
+          </m:sub>
+        </m:sSub>
+        <m:d>
+          <m:dPr>
+            <m:begChr m:val="("/>
+            <m:endChr m:val=")"/>
+            <m:sepChr m:val=""/>
+            <m:grow/>
+          </m:dPr>
+          <m:e>
+            <m:r>
+              <m:t>x</m:t>
+            </m:r>
+          </m:e>
+        </m:d>
+        <m:r>
+          <m:rPr>
+            <m:sty m:val="p"/>
+          </m:rPr>
+          <m:t>∈</m:t>
+        </m:r>
+        <m:r>
+          <m:rPr>
+            <m:sty m:val="p"/>
+          </m:rPr>
+          <m:t>[</m:t>
+        </m:r>
+        <m:r>
+          <m:t>1</m:t>
+        </m:r>
+        <m:r>
+          <m:rPr>
+            <m:sty m:val="p"/>
+          </m:rPr>
+          <m:t>,</m:t>
+        </m:r>
+        <m:r>
+          <m:rPr>
+            <m:sty m:val="p"/>
+          </m:rPr>
+          <m:t>∞</m:t>
+        </m:r>
+        <m:r>
+          <m:rPr>
+            <m:sty m:val="p"/>
+          </m:rPr>
+          <m:t>)</m:t>
+        </m:r>
+      </m:oMath>
+      <w:r>
+        <w:t xml:space="preserve">, donde valores cercanos a 1 indican normalidad y valores superiores representan el grado local de desviación.</w:t>
+      </w:r>
+      <w:r>
+        <w:t xml:space="preserve"> </w:t>
+      </w:r>
+      <w:r>
+        <w:t xml:space="preserve">3.</w:t>
+      </w:r>
+      <w:r>
+        <w:t xml:space="preserve"> </w:t>
+      </w:r>
+      <w:r>
+        <w:rPr>
+          <w:b/>
+          <w:bCs/>
+        </w:rPr>
+        <w:t xml:space="preserve">ECOD</w:t>
+      </w:r>
+      <w:r>
+        <w:t xml:space="preserve"> </w:t>
+      </w:r>
+      <w:r>
+        <w:t xml:space="preserve">genera puntuaciones acumuladas inversas</w:t>
+      </w:r>
+      <w:r>
+        <w:t xml:space="preserve"> </w:t>
+      </w:r>
+      <m:oMath>
+        <m:sSub>
+          <m:e>
+            <m:r>
+              <m:t>S</m:t>
+            </m:r>
+          </m:e>
+          <m:sub>
+            <m:r>
+              <m:t>E</m:t>
+            </m:r>
+            <m:r>
+              <m:t>C</m:t>
+            </m:r>
+            <m:r>
+              <m:t>O</m:t>
+            </m:r>
+            <m:r>
+              <m:t>D</m:t>
+            </m:r>
+          </m:sub>
+        </m:sSub>
+        <m:d>
+          <m:dPr>
+            <m:begChr m:val="("/>
+            <m:endChr m:val=")"/>
+            <m:sepChr m:val=""/>
+            <m:grow/>
+          </m:dPr>
+          <m:e>
+            <m:r>
+              <m:t>x</m:t>
+            </m:r>
+          </m:e>
+        </m:d>
+        <m:r>
+          <m:rPr>
+            <m:sty m:val="p"/>
+          </m:rPr>
+          <m:t>∈</m:t>
+        </m:r>
+        <m:r>
+          <m:rPr>
+            <m:sty m:val="p"/>
+          </m:rPr>
+          <m:t>[</m:t>
+        </m:r>
+        <m:r>
+          <m:t>0</m:t>
+        </m:r>
+        <m:r>
+          <m:rPr>
+            <m:sty m:val="p"/>
+          </m:rPr>
+          <m:t>,</m:t>
+        </m:r>
+        <m:r>
+          <m:rPr>
+            <m:sty m:val="p"/>
+          </m:rPr>
+          <m:t>∞</m:t>
+        </m:r>
+        <m:r>
+          <m:rPr>
+            <m:sty m:val="p"/>
+          </m:rPr>
+          <m:t>)</m:t>
+        </m:r>
+      </m:oMath>
+      <w:r>
+        <w:t xml:space="preserve"> </w:t>
+      </w:r>
+      <w:r>
+        <w:t xml:space="preserve">en escalas de log-probabilidad.</w:t>
+      </w:r>
+    </w:p>
+    <w:p>
+      <w:pPr>
+        <w:pStyle w:val="BodyText"/>
+      </w:pPr>
+      <w:r>
+        <w:t xml:space="preserve">Sumar o promediar estos valores en bruto anularía la influencia de IF y ECOD debido a que LOF dominaría la agregación por magnitud. Para resolver esta incompatibilidad, esta tesis implementa la unificación probabilística de puntuaciones basada en el escalamiento Min-Max lineal calibrado sobre el conjunto de entrenamiento (Kriegel et al., 2011). Las puntuaciones brutas de cada detector se transforman en puntuaciones probabilísticas de anomalía acotadas</w:t>
+      </w:r>
+      <w:r>
+        <w:t xml:space="preserve"> </w:t>
+      </w:r>
+      <m:oMath>
+        <m:sSub>
+          <m:e>
+            <m:r>
+              <m:t>P</m:t>
+            </m:r>
+          </m:e>
+          <m:sub>
+            <m:r>
+              <m:t>m</m:t>
+            </m:r>
+          </m:sub>
+        </m:sSub>
+        <m:d>
+          <m:dPr>
+            <m:begChr m:val="("/>
+            <m:endChr m:val=")"/>
+            <m:sepChr m:val=""/>
+            <m:grow/>
+          </m:dPr>
+          <m:e>
+            <m:r>
+              <m:t>a</m:t>
+            </m:r>
+            <m:r>
+              <m:rPr>
+                <m:sty m:val="p"/>
+              </m:rPr>
+              <m:t>|</m:t>
+            </m:r>
+            <m:r>
+              <m:t>x</m:t>
+            </m:r>
+          </m:e>
+        </m:d>
+        <m:r>
+          <m:rPr>
+            <m:sty m:val="p"/>
+          </m:rPr>
+          <m:t>∈</m:t>
+        </m:r>
+        <m:d>
+          <m:dPr>
+            <m:begChr m:val="["/>
+            <m:endChr m:val="]"/>
+            <m:sepChr m:val=""/>
+            <m:grow/>
+          </m:dPr>
+          <m:e>
+            <m:r>
+              <m:t>0</m:t>
+            </m:r>
+            <m:r>
+              <m:rPr>
+                <m:sty m:val="p"/>
+              </m:rPr>
+              <m:t>,</m:t>
+            </m:r>
+            <m:r>
+              <m:t>1</m:t>
+            </m:r>
+          </m:e>
+        </m:d>
+      </m:oMath>
+      <w:r>
+        <w:t xml:space="preserve"> </w:t>
+      </w:r>
+      <w:r>
+        <w:t xml:space="preserve">mediante la función de mapeo:</w:t>
+      </w:r>
+    </w:p>
+    <w:p>
+      <w:pPr>
+        <w:pStyle w:val="BodyText"/>
+      </w:pPr>
+      <m:oMathPara>
+        <m:oMathParaPr>
+          <m:jc m:val="center"/>
+        </m:oMathParaPr>
+        <m:oMath>
+          <m:sSub>
+            <m:e>
+              <m:r>
+                <m:t>P</m:t>
+              </m:r>
+            </m:e>
+            <m:sub>
+              <m:r>
+                <m:t>m</m:t>
+              </m:r>
+            </m:sub>
+          </m:sSub>
+          <m:d>
+            <m:dPr>
+              <m:begChr m:val="("/>
+              <m:endChr m:val=")"/>
+              <m:sepChr m:val=""/>
+              <m:grow/>
+            </m:dPr>
+            <m:e>
+              <m:r>
+                <m:t>a</m:t>
+              </m:r>
+              <m:r>
+                <m:rPr>
+                  <m:sty m:val="p"/>
+                </m:rPr>
+                <m:t>|</m:t>
+              </m:r>
+              <m:r>
+                <m:t>x</m:t>
+              </m:r>
+            </m:e>
+          </m:d>
+          <m:r>
+            <m:rPr>
+              <m:sty m:val="p"/>
+            </m:rPr>
+            <m:t>=</m:t>
+          </m:r>
+          <m:r>
+            <m:rPr>
+              <m:sty m:val="p"/>
+            </m:rPr>
+            <m:t>max</m:t>
+          </m:r>
+          <m:d>
+            <m:dPr>
+              <m:begChr m:val="("/>
+              <m:endChr m:val=")"/>
+              <m:sepChr m:val=""/>
+              <m:grow/>
+            </m:dPr>
+            <m:e>
+              <m:r>
+                <m:t>0</m:t>
+              </m:r>
+              <m:r>
+                <m:rPr>
+                  <m:sty m:val="p"/>
+                </m:rPr>
+                <m:t>,</m:t>
+              </m:r>
+              <m:r>
+                <m:rPr>
+                  <m:sty m:val="p"/>
+                </m:rPr>
+                <m:t>min</m:t>
+              </m:r>
+              <m:d>
+                <m:dPr>
+                  <m:begChr m:val="("/>
+                  <m:endChr m:val=")"/>
+                  <m:sepChr m:val=""/>
+                  <m:grow/>
+                </m:dPr>
+                <m:e>
+                  <m:r>
+                    <m:t>1</m:t>
+                  </m:r>
+                  <m:r>
+                    <m:rPr>
+                      <m:sty m:val="p"/>
+                    </m:rPr>
+                    <m:t>,</m:t>
+                  </m:r>
+                  <m:f>
+                    <m:fPr>
+                      <m:type m:val="bar"/>
+                    </m:fPr>
+                    <m:num>
+                      <m:sSub>
+                        <m:e>
+                          <m:r>
+                            <m:t>S</m:t>
+                          </m:r>
+                        </m:e>
+                        <m:sub>
+                          <m:r>
+                            <m:t>m</m:t>
+                          </m:r>
+                        </m:sub>
+                      </m:sSub>
+                      <m:d>
+                        <m:dPr>
+                          <m:begChr m:val="("/>
+                          <m:endChr m:val=")"/>
+                          <m:sepChr m:val=""/>
+                          <m:grow/>
+                        </m:dPr>
+                        <m:e>
+                          <m:r>
+                            <m:t>x</m:t>
+                          </m:r>
+                        </m:e>
+                      </m:d>
+                      <m:r>
+                        <m:rPr>
+                          <m:sty m:val="p"/>
+                        </m:rPr>
+                        <m:t>−</m:t>
+                      </m:r>
+                      <m:limLow>
+                        <m:e>
+                          <m:r>
+                            <m:rPr>
+                              <m:sty m:val="p"/>
+                            </m:rPr>
+                            <m:t>min</m:t>
+                          </m:r>
+                        </m:e>
+                        <m:lim>
+                          <m:r>
+                            <m:t>x</m:t>
+                          </m:r>
+                          <m:r>
+                            <m:rPr>
+                              <m:sty m:val="p"/>
+                            </m:rPr>
+                            <m:t>′</m:t>
+                          </m:r>
+                          <m:r>
+                            <m:rPr>
+                              <m:sty m:val="p"/>
+                            </m:rPr>
+                            <m:t>∈</m:t>
+                          </m:r>
+                          <m:sSub>
+                            <m:e>
+                              <m:r>
+                                <m:t>D</m:t>
+                              </m:r>
+                            </m:e>
+                            <m:sub>
+                              <m:r>
+                                <m:t>t</m:t>
+                              </m:r>
+                              <m:r>
+                                <m:t>r</m:t>
+                              </m:r>
+                              <m:r>
+                                <m:t>a</m:t>
+                              </m:r>
+                              <m:r>
+                                <m:t>i</m:t>
+                              </m:r>
+                              <m:r>
+                                <m:t>n</m:t>
+                              </m:r>
+                            </m:sub>
+                          </m:sSub>
+                        </m:lim>
+                      </m:limLow>
+                      <m:d>
+                        <m:dPr>
+                          <m:begChr m:val="("/>
+                          <m:endChr m:val=")"/>
+                          <m:sepChr m:val=""/>
+                          <m:grow/>
+                        </m:dPr>
+                        <m:e>
+                          <m:sSub>
+                            <m:e>
+                              <m:r>
+                                <m:t>S</m:t>
+                              </m:r>
+                            </m:e>
+                            <m:sub>
+                              <m:r>
+                                <m:t>m</m:t>
+                              </m:r>
+                            </m:sub>
+                          </m:sSub>
+                          <m:d>
+                            <m:dPr>
+                              <m:begChr m:val="("/>
+                              <m:endChr m:val=")"/>
+                              <m:sepChr m:val=""/>
+                              <m:grow/>
+                            </m:dPr>
+                            <m:e>
+                              <m:r>
+                                <m:t>x</m:t>
+                              </m:r>
+                              <m:r>
+                                <m:rPr>
+                                  <m:sty m:val="p"/>
+                                </m:rPr>
+                                <m:t>′</m:t>
+                              </m:r>
+                            </m:e>
+                          </m:d>
+                        </m:e>
+                      </m:d>
+                    </m:num>
+                    <m:den>
+                      <m:limLow>
+                        <m:e>
+                          <m:r>
+                            <m:rPr>
+                              <m:sty m:val="p"/>
+                            </m:rPr>
+                            <m:t>max</m:t>
+                          </m:r>
+                        </m:e>
+                        <m:lim>
+                          <m:r>
+                            <m:t>x</m:t>
+                          </m:r>
+                          <m:r>
+                            <m:rPr>
+                              <m:sty m:val="p"/>
+                            </m:rPr>
+                            <m:t>′</m:t>
+                          </m:r>
+                          <m:r>
+                            <m:rPr>
+                              <m:sty m:val="p"/>
+                            </m:rPr>
+                            <m:t>∈</m:t>
+                          </m:r>
+                          <m:sSub>
+                            <m:e>
+                              <m:r>
+                                <m:t>D</m:t>
+                              </m:r>
+                            </m:e>
+                            <m:sub>
+                              <m:r>
+                                <m:t>t</m:t>
+                              </m:r>
+                              <m:r>
+                                <m:t>r</m:t>
+                              </m:r>
+                              <m:r>
+                                <m:t>a</m:t>
+                              </m:r>
+                              <m:r>
+                                <m:t>i</m:t>
+                              </m:r>
+                              <m:r>
+                                <m:t>n</m:t>
+                              </m:r>
+                            </m:sub>
+                          </m:sSub>
+                        </m:lim>
+                      </m:limLow>
+                      <m:d>
+                        <m:dPr>
+                          <m:begChr m:val="("/>
+                          <m:endChr m:val=")"/>
+                          <m:sepChr m:val=""/>
+                          <m:grow/>
+                        </m:dPr>
+                        <m:e>
+                          <m:sSub>
+                            <m:e>
+                              <m:r>
+                                <m:t>S</m:t>
+                              </m:r>
+                            </m:e>
+                            <m:sub>
+                              <m:r>
+                                <m:t>m</m:t>
+                              </m:r>
+                            </m:sub>
+                          </m:sSub>
+                          <m:d>
+                            <m:dPr>
+                              <m:begChr m:val="("/>
+                              <m:endChr m:val=")"/>
+                              <m:sepChr m:val=""/>
+                              <m:grow/>
+                            </m:dPr>
+                            <m:e>
+                              <m:r>
+                                <m:t>x</m:t>
+                              </m:r>
+                              <m:r>
+                                <m:rPr>
+                                  <m:sty m:val="p"/>
+                                </m:rPr>
+                                <m:t>′</m:t>
+                              </m:r>
+                            </m:e>
+                          </m:d>
+                        </m:e>
+                      </m:d>
+                      <m:r>
+                        <m:rPr>
+                          <m:sty m:val="p"/>
+                        </m:rPr>
+                        <m:t>−</m:t>
+                      </m:r>
+                      <m:limLow>
+                        <m:e>
+                          <m:r>
+                            <m:rPr>
+                              <m:sty m:val="p"/>
+                            </m:rPr>
+                            <m:t>min</m:t>
+                          </m:r>
+                        </m:e>
+                        <m:lim>
+                          <m:r>
+                            <m:t>x</m:t>
+                          </m:r>
+                          <m:r>
+                            <m:rPr>
+                              <m:sty m:val="p"/>
+                            </m:rPr>
+                            <m:t>′</m:t>
+                          </m:r>
+                          <m:r>
+                            <m:rPr>
+                              <m:sty m:val="p"/>
+                            </m:rPr>
+                            <m:t>∈</m:t>
+                          </m:r>
+                          <m:sSub>
+                            <m:e>
+                              <m:r>
+                                <m:t>D</m:t>
+                              </m:r>
+                            </m:e>
+                            <m:sub>
+                              <m:r>
+                                <m:t>t</m:t>
+                              </m:r>
+                              <m:r>
+                                <m:t>r</m:t>
+                              </m:r>
+                              <m:r>
+                                <m:t>a</m:t>
+                              </m:r>
+                              <m:r>
+                                <m:t>i</m:t>
+                              </m:r>
+                              <m:r>
+                                <m:t>n</m:t>
+                              </m:r>
+                            </m:sub>
+                          </m:sSub>
+                        </m:lim>
+                      </m:limLow>
+                      <m:d>
+                        <m:dPr>
+                          <m:begChr m:val="("/>
+                          <m:endChr m:val=")"/>
+                          <m:sepChr m:val=""/>
+                          <m:grow/>
+                        </m:dPr>
+                        <m:e>
+                          <m:sSub>
+                            <m:e>
+                              <m:r>
+                                <m:t>S</m:t>
+                              </m:r>
+                            </m:e>
+                            <m:sub>
+                              <m:r>
+                                <m:t>m</m:t>
+                              </m:r>
+                            </m:sub>
+                          </m:sSub>
+                          <m:d>
+                            <m:dPr>
+                              <m:begChr m:val="("/>
+                              <m:endChr m:val=")"/>
+                              <m:sepChr m:val=""/>
+                              <m:grow/>
+                            </m:dPr>
+                            <m:e>
+                              <m:r>
+                                <m:t>x</m:t>
+                              </m:r>
+                              <m:r>
+                                <m:rPr>
+                                  <m:sty m:val="p"/>
+                                </m:rPr>
+                                <m:t>′</m:t>
+                              </m:r>
+                            </m:e>
+                          </m:d>
+                        </m:e>
+                      </m:d>
+                    </m:den>
+                  </m:f>
+                </m:e>
+              </m:d>
+            </m:e>
+          </m:d>
+        </m:oMath>
+      </m:oMathPara>
+    </w:p>
+    <w:p>
+      <w:pPr>
+        <w:pStyle w:val="FirstParagraph"/>
+      </w:pPr>
+      <w:r>
+        <w:t xml:space="preserve">donde</w:t>
+      </w:r>
+      <w:r>
+        <w:t xml:space="preserve"> </w:t>
+      </w:r>
+      <m:oMath>
+        <m:sSub>
+          <m:e>
+            <m:r>
+              <m:rPr>
+                <m:sty m:val="p"/>
+              </m:rPr>
+              <m:t>min</m:t>
+            </m:r>
+          </m:e>
+          <m:sub>
+            <m:sSub>
+              <m:e>
+                <m:r>
+                  <m:t>D</m:t>
+                </m:r>
+              </m:e>
+              <m:sub>
+                <m:r>
+                  <m:t>t</m:t>
+                </m:r>
+                <m:r>
+                  <m:t>r</m:t>
+                </m:r>
+                <m:r>
+                  <m:t>a</m:t>
+                </m:r>
+                <m:r>
+                  <m:t>i</m:t>
+                </m:r>
+                <m:r>
+                  <m:t>n</m:t>
+                </m:r>
+              </m:sub>
+            </m:sSub>
+          </m:sub>
+        </m:sSub>
+      </m:oMath>
+      <w:r>
+        <w:t xml:space="preserve"> </w:t>
+      </w:r>
+      <w:r>
+        <w:t xml:space="preserve">y</w:t>
+      </w:r>
+      <w:r>
+        <w:t xml:space="preserve"> </w:t>
+      </w:r>
+      <m:oMath>
+        <m:sSub>
+          <m:e>
+            <m:r>
+              <m:rPr>
+                <m:sty m:val="p"/>
+              </m:rPr>
+              <m:t>max</m:t>
+            </m:r>
+          </m:e>
+          <m:sub>
+            <m:sSub>
+              <m:e>
+                <m:r>
+                  <m:t>D</m:t>
+                </m:r>
+              </m:e>
+              <m:sub>
+                <m:r>
+                  <m:t>t</m:t>
+                </m:r>
+                <m:r>
+                  <m:t>r</m:t>
+                </m:r>
+                <m:r>
+                  <m:t>a</m:t>
+                </m:r>
+                <m:r>
+                  <m:t>i</m:t>
+                </m:r>
+                <m:r>
+                  <m:t>n</m:t>
+                </m:r>
+              </m:sub>
+            </m:sSub>
+          </m:sub>
+        </m:sSub>
+      </m:oMath>
+      <w:r>
+        <w:t xml:space="preserve"> </w:t>
+      </w:r>
+      <w:r>
+        <w:t xml:space="preserve">son los valores extremos de score observados en el conjunto de calibración histórica del detector</w:t>
+      </w:r>
+      <w:r>
+        <w:t xml:space="preserve"> </w:t>
+      </w:r>
+      <m:oMath>
+        <m:r>
+          <m:t>m</m:t>
+        </m:r>
+      </m:oMath>
+      <w:r>
+        <w:t xml:space="preserve">. La puntuación consolidada de anomalía del ensemble</w:t>
+      </w:r>
+      <w:r>
+        <w:t xml:space="preserve"> </w:t>
+      </w:r>
+      <m:oMath>
+        <m:sSub>
+          <m:e>
+            <m:r>
+              <m:t>S</m:t>
+            </m:r>
+          </m:e>
+          <m:sub>
+            <m:r>
+              <m:t>E</m:t>
+            </m:r>
+            <m:r>
+              <m:t>n</m:t>
+            </m:r>
+            <m:r>
+              <m:t>s</m:t>
+            </m:r>
+            <m:r>
+              <m:t>e</m:t>
+            </m:r>
+            <m:r>
+              <m:t>m</m:t>
+            </m:r>
+            <m:r>
+              <m:t>b</m:t>
+            </m:r>
+            <m:r>
+              <m:t>l</m:t>
+            </m:r>
+            <m:r>
+              <m:t>e</m:t>
+            </m:r>
+          </m:sub>
+        </m:sSub>
+        <m:d>
+          <m:dPr>
+            <m:begChr m:val="("/>
+            <m:endChr m:val=")"/>
+            <m:sepChr m:val=""/>
+            <m:grow/>
+          </m:dPr>
+          <m:e>
+            <m:r>
+              <m:t>x</m:t>
+            </m:r>
+          </m:e>
+        </m:d>
+        <m:r>
+          <m:rPr>
+            <m:sty m:val="p"/>
+          </m:rPr>
+          <m:t>∈</m:t>
+        </m:r>
+        <m:d>
+          <m:dPr>
+            <m:begChr m:val="["/>
+            <m:endChr m:val="]"/>
+            <m:sepChr m:val=""/>
+            <m:grow/>
+          </m:dPr>
+          <m:e>
+            <m:r>
+              <m:t>0</m:t>
+            </m:r>
+            <m:r>
+              <m:rPr>
+                <m:sty m:val="p"/>
+              </m:rPr>
+              <m:t>,</m:t>
+            </m:r>
+            <m:r>
+              <m:t>1</m:t>
+            </m:r>
+          </m:e>
+        </m:d>
+      </m:oMath>
+      <w:r>
+        <w:t xml:space="preserve"> </w:t>
+      </w:r>
+      <w:r>
+        <w:t xml:space="preserve">se calcula entonces como el promedio simple de estas probabilidades unificadas:</w:t>
+      </w:r>
+    </w:p>
+    <w:p>
+      <w:pPr>
+        <w:pStyle w:val="BodyText"/>
+      </w:pPr>
+      <m:oMathPara>
+        <m:oMathParaPr>
+          <m:jc m:val="center"/>
+        </m:oMathParaPr>
+        <m:oMath>
+          <m:sSub>
+            <m:e>
+              <m:r>
+                <m:t>S</m:t>
+              </m:r>
+            </m:e>
+            <m:sub>
+              <m:r>
+                <m:t>E</m:t>
+              </m:r>
+              <m:r>
+                <m:t>n</m:t>
+              </m:r>
+              <m:r>
+                <m:t>s</m:t>
+              </m:r>
+              <m:r>
+                <m:t>e</m:t>
+              </m:r>
+              <m:r>
+                <m:t>m</m:t>
+              </m:r>
+              <m:r>
+                <m:t>b</m:t>
+              </m:r>
+              <m:r>
+                <m:t>l</m:t>
+              </m:r>
+              <m:r>
+                <m:t>e</m:t>
+              </m:r>
+            </m:sub>
+          </m:sSub>
+          <m:d>
+            <m:dPr>
+              <m:begChr m:val="("/>
+              <m:endChr m:val=")"/>
+              <m:sepChr m:val=""/>
+              <m:grow/>
+            </m:dPr>
+            <m:e>
+              <m:r>
+                <m:t>x</m:t>
+              </m:r>
+            </m:e>
+          </m:d>
+          <m:r>
+            <m:rPr>
+              <m:sty m:val="p"/>
+            </m:rPr>
+            <m:t>=</m:t>
+          </m:r>
+          <m:f>
+            <m:fPr>
+              <m:type m:val="bar"/>
+            </m:fPr>
+            <m:num>
+              <m:sSub>
+                <m:e>
+                  <m:r>
+                    <m:t>P</m:t>
+                  </m:r>
+                </m:e>
+                <m:sub>
+                  <m:r>
+                    <m:t>I</m:t>
+                  </m:r>
+                  <m:r>
+                    <m:t>F</m:t>
+                  </m:r>
+                </m:sub>
+              </m:sSub>
+              <m:d>
+                <m:dPr>
+                  <m:begChr m:val="("/>
+                  <m:endChr m:val=")"/>
+                  <m:sepChr m:val=""/>
+                  <m:grow/>
+                </m:dPr>
+                <m:e>
+                  <m:r>
+                    <m:t>a</m:t>
+                  </m:r>
+                  <m:r>
+                    <m:rPr>
+                      <m:sty m:val="p"/>
+                    </m:rPr>
+                    <m:t>|</m:t>
+                  </m:r>
+                  <m:r>
+                    <m:t>x</m:t>
+                  </m:r>
+                </m:e>
+              </m:d>
+              <m:r>
+                <m:rPr>
+                  <m:sty m:val="p"/>
+                </m:rPr>
+                <m:t>+</m:t>
+              </m:r>
+              <m:sSub>
+                <m:e>
+                  <m:r>
+                    <m:t>P</m:t>
+                  </m:r>
+                </m:e>
+                <m:sub>
+                  <m:r>
+                    <m:t>L</m:t>
+                  </m:r>
+                  <m:r>
+                    <m:t>O</m:t>
+                  </m:r>
+                  <m:r>
+                    <m:t>F</m:t>
+                  </m:r>
+                </m:sub>
+              </m:sSub>
+              <m:d>
+                <m:dPr>
+                  <m:begChr m:val="("/>
+                  <m:endChr m:val=")"/>
+                  <m:sepChr m:val=""/>
+                  <m:grow/>
+                </m:dPr>
+                <m:e>
+                  <m:r>
+                    <m:t>a</m:t>
+                  </m:r>
+                  <m:r>
+                    <m:rPr>
+                      <m:sty m:val="p"/>
+                    </m:rPr>
+                    <m:t>|</m:t>
+                  </m:r>
+                  <m:r>
+                    <m:t>x</m:t>
+                  </m:r>
+                </m:e>
+              </m:d>
+              <m:r>
+                <m:rPr>
+                  <m:sty m:val="p"/>
+                </m:rPr>
+                <m:t>+</m:t>
+              </m:r>
+              <m:sSub>
+                <m:e>
+                  <m:r>
+                    <m:t>P</m:t>
+                  </m:r>
+                </m:e>
+                <m:sub>
+                  <m:r>
+                    <m:t>E</m:t>
+                  </m:r>
+                  <m:r>
+                    <m:t>C</m:t>
+                  </m:r>
+                  <m:r>
+                    <m:t>O</m:t>
+                  </m:r>
+                  <m:r>
+                    <m:t>D</m:t>
+                  </m:r>
+                </m:sub>
+              </m:sSub>
+              <m:d>
+                <m:dPr>
+                  <m:begChr m:val="("/>
+                  <m:endChr m:val=")"/>
+                  <m:sepChr m:val=""/>
+                  <m:grow/>
+                </m:dPr>
+                <m:e>
+                  <m:r>
+                    <m:t>a</m:t>
+                  </m:r>
+                  <m:r>
+                    <m:rPr>
+                      <m:sty m:val="p"/>
+                    </m:rPr>
+                    <m:t>|</m:t>
+                  </m:r>
+                  <m:r>
+                    <m:t>x</m:t>
+                  </m:r>
+                </m:e>
+              </m:d>
+            </m:num>
+            <m:den>
+              <m:r>
+                <m:t>3</m:t>
+              </m:r>
+            </m:den>
+          </m:f>
+        </m:oMath>
+      </m:oMathPara>
+    </w:p>
+    <w:p>
+      <w:pPr>
+        <w:pStyle w:val="FirstParagraph"/>
+      </w:pPr>
+      <w:r>
+        <w:t xml:space="preserve">Una instancia operativa</w:t>
+      </w:r>
+      <w:r>
+        <w:t xml:space="preserve"> </w:t>
+      </w:r>
+      <m:oMath>
+        <m:r>
+          <m:t>x</m:t>
+        </m:r>
+      </m:oMath>
+      <w:r>
+        <w:t xml:space="preserve"> </w:t>
+      </w:r>
+      <w:r>
+        <w:t xml:space="preserve">se clasifica finalmente como alerta anómala si y solo si</w:t>
+      </w:r>
+      <w:r>
+        <w:t xml:space="preserve"> </w:t>
+      </w:r>
+      <m:oMath>
+        <m:sSub>
+          <m:e>
+            <m:r>
+              <m:t>S</m:t>
+            </m:r>
+          </m:e>
+          <m:sub>
+            <m:r>
+              <m:t>E</m:t>
+            </m:r>
+            <m:r>
+              <m:t>n</m:t>
+            </m:r>
+            <m:r>
+              <m:t>s</m:t>
+            </m:r>
+            <m:r>
+              <m:t>e</m:t>
+            </m:r>
+            <m:r>
+              <m:t>m</m:t>
+            </m:r>
+            <m:r>
+              <m:t>b</m:t>
+            </m:r>
+            <m:r>
+              <m:t>l</m:t>
+            </m:r>
+            <m:r>
+              <m:t>e</m:t>
+            </m:r>
+          </m:sub>
+        </m:sSub>
+        <m:d>
+          <m:dPr>
+            <m:begChr m:val="("/>
+            <m:endChr m:val=")"/>
+            <m:sepChr m:val=""/>
+            <m:grow/>
+          </m:dPr>
+          <m:e>
+            <m:r>
+              <m:t>x</m:t>
+            </m:r>
+          </m:e>
+        </m:d>
+        <m:r>
+          <m:rPr>
+            <m:sty m:val="p"/>
+          </m:rPr>
+          <m:t>≥</m:t>
+        </m:r>
+        <m:r>
+          <m:t>τ</m:t>
+        </m:r>
+      </m:oMath>
+      <w:r>
+        <w:t xml:space="preserve">, donde</w:t>
+      </w:r>
+      <w:r>
+        <w:t xml:space="preserve"> </w:t>
+      </w:r>
+      <m:oMath>
+        <m:r>
+          <m:t>τ</m:t>
+        </m:r>
+        <m:r>
+          <m:rPr>
+            <m:sty m:val="p"/>
+          </m:rPr>
+          <m:t>∈</m:t>
+        </m:r>
+        <m:d>
+          <m:dPr>
+            <m:begChr m:val="["/>
+            <m:endChr m:val="]"/>
+            <m:sepChr m:val=""/>
+            <m:grow/>
+          </m:dPr>
+          <m:e>
+            <m:r>
+              <m:t>0</m:t>
+            </m:r>
+            <m:r>
+              <m:rPr>
+                <m:sty m:val="p"/>
+              </m:rPr>
+              <m:t>,</m:t>
+            </m:r>
+            <m:r>
+              <m:t>1</m:t>
+            </m:r>
+          </m:e>
+        </m:d>
+      </m:oMath>
+      <w:r>
+        <w:t xml:space="preserve"> </w:t>
+      </w:r>
+      <w:r>
+        <w:t xml:space="preserve">es el umbral de decisión operativo global calibrado empíricamente en la fase de validación cruzada. El fundamento teórico de este enfoque de agregación lo proporciona ADBench (Han et al., 2022) y su implementación robusta se realiza mediante la API modular de PyOD (Zhao et al., 2019).</w:t>
+      </w:r>
+    </w:p>
+    <w:bookmarkEnd w:id="88"/>
+    <w:bookmarkStart w:id="89" w:name="X1d880a2836a6f61be9a44e85686551ded51ed2d"/>
+    <w:p>
+      <w:pPr>
+        <w:pStyle w:val="Ttulo3"/>
+      </w:pPr>
+      <w:r>
+        <w:t xml:space="preserve">2.3.5 Forecasting de Series Temporales con Transformers</w:t>
+      </w:r>
+    </w:p>
+    <w:p>
+      <w:pPr>
+        <w:pStyle w:val="FirstParagraph"/>
+      </w:pPr>
+      <w:r>
+        <w:t xml:space="preserve">Las series temporales agroexportadoras presentan tres desafíos que los modelos de forecasting deben resolver: tendencia no estacionaria, estacionalidad múltiple (diaria, semanal, mensual, anual) y dependencia de covariables exógenas (clima, calendario agrícola, demanda internacional, precios y condiciones logísticas). Los modelos estadísticos clásicos como ARIMA capturan relaciones lineales con eficacia, pero presentan limitaciones en la modelización de no-linealidades y horizontes largos.</w:t>
+      </w:r>
+    </w:p>
+    <w:p>
+      <w:pPr>
+        <w:pStyle w:val="BodyText"/>
+      </w:pPr>
+      <w:r>
+        <w:rPr>
+          <w:b/>
+          <w:bCs/>
+        </w:rPr>
+        <w:t xml:space="preserve">Temporal Fusion Transformer (TFT)</w:t>
+      </w:r>
+      <w:r>
+        <w:t xml:space="preserve"> </w:t>
+      </w:r>
+      <w:r>
+        <w:t xml:space="preserve">(Lim et al., 2021) propone una arquitectura especializada que combina cuatro mecanismos: (1) codificación LSTM para dependencias secuenciales locales; (2) selección de variables con mecanismo de gating (GLU — Gated Linear Unit) que identifica automáticamente las covariables más informativas; (3) atención multi-cabezal interpretable que pondera los pasos temporales según su relevancia predictiva; y (4) red de cuantiles para cuantificar la incertidumbre de la predicción. TFT acepta tres tipos de entradas: features estáticas conocidas (e.g., producto, zona, destino), covariables futuras conocidas (e.g., calendario agrícola, campañas, feriados) y covariables históricas observadas (e.g., precio, volumen, clima o merma pasada).</w:t>
+      </w:r>
+    </w:p>
+    <w:p>
+      <w:pPr>
+        <w:pStyle w:val="BodyText"/>
+      </w:pPr>
+      <w:r>
+        <w:t xml:space="preserve">El debate sobre la efectividad de los Transformers en series temporales es relevante para esta tesis. Zeng et al. (2023) argumentan que DLinear —un modelo lineal simple— supera a los Transformers en múltiples benchmarks, atribuyendo la limitación de los Transformers al hecho de que el mecanismo de self-attention es permutation-invariant y destruye el orden temporal de las secuencias. Sin embargo, este argumento ha sido rebatido sucesivamente: Nie et al. (2023) demuestran que la tokenización por patches —agrupando segmentos temporales antes de aplicar atención— preserva el orden local y supera a DLinear en la mayoría de benchmarks de horizonte largo. Liu et al. (2024) proponen invertir la tokenización: en lugar de tokenizar por timestamp, tokenizan por variable, aplicando self-attention entre variables en lugar de entre tiempos, obteniendo SOTA en 7 datasets multivariados.</w:t>
+      </w:r>
+    </w:p>
+    <w:p>
+      <w:pPr>
+        <w:pStyle w:val="BodyText"/>
+      </w:pPr>
+      <w:r>
+        <w:rPr>
+          <w:b/>
+          <w:bCs/>
+        </w:rPr>
         <w:t xml:space="preserve">Posición de esta tesis respecto al debate</w:t>
       </w:r>
       <w:r>
@@ -8914,8 +10409,8 @@
         <w:t xml:space="preserve">N-HiTS (Challu et al., 2022) ofrece una alternativa no-Transformer para forecasting de horizonte largo, con interpolación jerárquica multi-tasa que reduce la complejidad computacional respecto a N-BEATS. Chronos (Ansari et al., 2024) representa el paradigma emergente de los foundation models para series temporales, basado en T5, que logra performance zero-shot competitivo en múltiples datasets; sin embargo, su opacidad y dependencia de infraestructura de gran escala limitan su aplicación directa cuando se requiere trazabilidad operativa.</w:t>
       </w:r>
     </w:p>
-    <w:bookmarkEnd w:id="87"/>
-    <w:bookmarkStart w:id="88" w:name="X8d30205be421573846deac73c6cb2eebcb12de3"/>
+    <w:bookmarkEnd w:id="89"/>
+    <w:bookmarkStart w:id="90" w:name="X8d30205be421573846deac73c6cb2eebcb12de3"/>
     <w:p>
       <w:pPr>
         <w:pStyle w:val="Ttulo3"/>
@@ -9459,8 +10954,8 @@
         <w:t xml:space="preserve">La integración SHAP+LLM (Large Language Model - Modelo de Lenguaje de Gran Tamaño) de esta tesis opera como sigue: los vectores SHAP de una alerta operativa (una lista de pares variable→contribución cuantitativa) se incorporan como contexto verificado en el RAG, y el LLM genera la narración del informe sin posibilidad de inventar cifras que no estén en esos vectores o en las fuentes recuperadas.</w:t>
       </w:r>
     </w:p>
-    <w:bookmarkEnd w:id="88"/>
-    <w:bookmarkStart w:id="89" w:name="X0c198cdb7b7a07f9cda00f66d861cb05b5f6505"/>
+    <w:bookmarkEnd w:id="90"/>
+    <w:bookmarkStart w:id="91" w:name="X0c198cdb7b7a07f9cda00f66d861cb05b5f6505"/>
     <w:p>
       <w:pPr>
         <w:pStyle w:val="Ttulo3"/>
@@ -9636,8 +11131,8 @@
         <w:t xml:space="preserve">(Recall-Oriented Understudy for Gisting Evaluation) cuando exista un texto de referencia. Sin embargo, para esta tesis se prioriza una rúbrica operativa de completitud, consistencia, accionabilidad y correspondencia con evidencias, porque la calidad de un reporte de supervisión depende no solo de similitud textual, sino de su utilidad para la toma de decisiones.</w:t>
       </w:r>
     </w:p>
-    <w:bookmarkEnd w:id="89"/>
-    <w:bookmarkStart w:id="90" w:name="gobernanza-de-ia-y-mlops"/>
+    <w:bookmarkEnd w:id="91"/>
+    <w:bookmarkStart w:id="92" w:name="gobernanza-de-ia-y-mlops"/>
     <w:p>
       <w:pPr>
         <w:pStyle w:val="Ttulo3"/>
@@ -9840,8 +11335,8 @@
         <w:t xml:space="preserve">El contexto peruano e internacional consolida la necesidad de este framework de gobernanza. El D.S. N° 115-2025-PCM (PCM, 2025), el NIST AI RMF (NIST, 2023) y el EU AI Act (Parlamento Europeo y Consejo, 2024) refuerzan principios comunes: transparencia, documentación, supervisión humana y gestión de riesgos. Estos principios son adoptados como referencia de diseño para esta tesis. No se afirma cumplimiento formal con ninguno de estos marcos —tal afirmación requeriría auditoría regulatoria externa— sino conformidad de diseño con sus principios, en particular: (a) transparencia mediante SHAP y Model Cards, (b) supervisión humana mediante revisión obligatoria de cada reporte antes de su uso operativo, (c) gestión de riesgos mediante umbrales calibrados y validación cruzada, y (d) trazabilidad documental mediante logs completos por alerta. La aplicabilidad regulatoria efectiva del sistema a una empresa específica depende de su clasificación de riesgo bajo el reglamento correspondiente y queda fuera del alcance de esta tesis.</w:t>
       </w:r>
     </w:p>
-    <w:bookmarkEnd w:id="90"/>
-    <w:bookmarkStart w:id="91" w:name="X382bc30ab8bdb4eeef7732c8b920d0fa2a17c78"/>
+    <w:bookmarkEnd w:id="92"/>
+    <w:bookmarkStart w:id="93" w:name="X382bc30ab8bdb4eeef7732c8b920d0fa2a17c78"/>
     <w:p>
       <w:pPr>
         <w:pStyle w:val="Ttulo3"/>
@@ -9910,10 +11405,10 @@
         <w:t xml:space="preserve">⚠️ EN DESARROLLO</w:t>
       </w:r>
     </w:p>
-    <w:bookmarkEnd w:id="91"/>
-    <w:bookmarkEnd w:id="92"/>
     <w:bookmarkEnd w:id="93"/>
-    <w:bookmarkStart w:id="104" w:name="capítulo-iii-propuesta-metodológica"/>
+    <w:bookmarkEnd w:id="94"/>
+    <w:bookmarkEnd w:id="95"/>
+    <w:bookmarkStart w:id="106" w:name="capítulo-iii-propuesta-metodológica"/>
     <w:p>
       <w:pPr>
         <w:pStyle w:val="Ttulo1"/>
@@ -9922,7 +11417,7 @@
         <w:t xml:space="preserve">CAPÍTULO III: PROPUESTA METODOLÓGICA</w:t>
       </w:r>
     </w:p>
-    <w:bookmarkStart w:id="94" w:name="arquitectura-del-sistema-integrado"/>
+    <w:bookmarkStart w:id="96" w:name="arquitectura-del-sistema-integrado"/>
     <w:p>
       <w:pPr>
         <w:pStyle w:val="Ttulo2"/>
@@ -10245,8 +11740,8 @@
         <w:t xml:space="preserve">└─────────────────────────────────────────────────────────┘</w:t>
       </w:r>
     </w:p>
-    <w:bookmarkEnd w:id="94"/>
-    <w:bookmarkStart w:id="95" w:name="X70ab2a5b19d7fa94e4b728e6a2fe859b2446cdc"/>
+    <w:bookmarkEnd w:id="96"/>
+    <w:bookmarkStart w:id="97" w:name="X70ab2a5b19d7fa94e4b728e6a2fe859b2446cdc"/>
     <w:p>
       <w:pPr>
         <w:pStyle w:val="Ttulo2"/>
@@ -10320,8 +11815,8 @@
         <w:t xml:space="preserve">: BAF Benchmark (Jesus et al., 2022) podrá utilizarse solo para contrastar comportamiento de modelos en datos tabulares desbalanceados con drift temporal, sin presentarlo como validación directa del dominio agroexportador.</w:t>
       </w:r>
     </w:p>
-    <w:bookmarkEnd w:id="95"/>
-    <w:bookmarkStart w:id="103" w:name="configuración-experimental-y-métricas"/>
+    <w:bookmarkEnd w:id="97"/>
+    <w:bookmarkStart w:id="105" w:name="configuración-experimental-y-métricas"/>
     <w:p>
       <w:pPr>
         <w:pStyle w:val="Ttulo2"/>
@@ -10330,7 +11825,7 @@
         <w:t xml:space="preserve">3.3 Configuración Experimental y Métricas</w:t>
       </w:r>
     </w:p>
-    <w:bookmarkStart w:id="96" w:name="métricas-por-variable-dependiente"/>
+    <w:bookmarkStart w:id="98" w:name="métricas-por-variable-dependiente"/>
     <w:p>
       <w:pPr>
         <w:pStyle w:val="Ttulo3"/>
@@ -10434,8 +11929,8 @@
         <w:t xml:space="preserve">: porcentaje de alertas con todos los campos completos (dato de origen, versión de dataset, modelo, score, umbral, explicación SHAP, fuente recuperada por RAG y reporte generado).</w:t>
       </w:r>
     </w:p>
-    <w:bookmarkEnd w:id="96"/>
-    <w:bookmarkStart w:id="97" w:name="división-del-dataset-y-semilla"/>
+    <w:bookmarkEnd w:id="98"/>
+    <w:bookmarkStart w:id="99" w:name="división-del-dataset-y-semilla"/>
     <w:p>
       <w:pPr>
         <w:pStyle w:val="Ttulo3"/>
@@ -10560,8 +12055,8 @@
         <w:t xml:space="preserve">. Cada experimento se repite con cinco semillas adicionales (43, 44, 45, 46, 47) para reportar media ± desviación estándar de cada métrica.</w:t>
       </w:r>
     </w:p>
-    <w:bookmarkEnd w:id="97"/>
-    <w:bookmarkStart w:id="98" w:name="X4a0764cd09d4c004d1618c8596e134904a174fd"/>
+    <w:bookmarkEnd w:id="99"/>
+    <w:bookmarkStart w:id="100" w:name="X4a0764cd09d4c004d1618c8596e134904a174fd"/>
     <w:p>
       <w:pPr>
         <w:pStyle w:val="Ttulo3"/>
@@ -11126,8 +12621,8 @@
         <w:t xml:space="preserve">: Pipeline completo de 4 capas — referencia experimental.</w:t>
       </w:r>
     </w:p>
-    <w:bookmarkEnd w:id="98"/>
-    <w:bookmarkStart w:id="99" w:name="X11784d3635bc854d96690216fa6e0596e0027f5"/>
+    <w:bookmarkEnd w:id="100"/>
+    <w:bookmarkStart w:id="101" w:name="X11784d3635bc854d96690216fa6e0596e0027f5"/>
     <w:p>
       <w:pPr>
         <w:pStyle w:val="Ttulo3"/>
@@ -11542,8 +13037,8 @@
         <w:t xml:space="preserve">Para todas las pruebas se verifica previamente el supuesto de normalidad con Shapiro-Wilk; ante violación, se aplica la prueba no paramétrica equivalente. Se reporta intervalo de confianza al 95% para cada métrica y se calcula el tamaño de efecto como medida complementaria a la significancia estadística.</w:t>
       </w:r>
     </w:p>
-    <w:bookmarkEnd w:id="99"/>
-    <w:bookmarkStart w:id="100" w:name="X34cf3fa409e56f845b4c011ad26d1fd5933ce21"/>
+    <w:bookmarkEnd w:id="101"/>
+    <w:bookmarkStart w:id="102" w:name="X34cf3fa409e56f845b4c011ad26d1fd5933ce21"/>
     <w:p>
       <w:pPr>
         <w:pStyle w:val="Ttulo3"/>
@@ -11635,8 +13130,8 @@
         <w:t xml:space="preserve">El protocolo detallado, formulario de consentimiento informado y cuestionario post-tarea figuran en el Anexo A.</w:t>
       </w:r>
     </w:p>
-    <w:bookmarkEnd w:id="100"/>
-    <w:bookmarkStart w:id="101" w:name="X0d819713072c731da40d223a2f9a27f165100c8"/>
+    <w:bookmarkEnd w:id="102"/>
+    <w:bookmarkStart w:id="103" w:name="X0d819713072c731da40d223a2f9a27f165100c8"/>
     <w:p>
       <w:pPr>
         <w:pStyle w:val="Ttulo3"/>
@@ -11669,8 +13164,8 @@
         <w:t xml:space="preserve">(TPE sampler, 50 trials por modelo), optimizando PR-AUC sobre el validation set. Los rangos de búsqueda se documentan en el Anexo B (Model Cards). El código fuente, requirements.txt con versiones exactas, semillas y notebooks de reproducción se publican en repositorio GitHub público con licencia MIT al cierre del Hito 3.</w:t>
       </w:r>
     </w:p>
-    <w:bookmarkEnd w:id="101"/>
-    <w:bookmarkStart w:id="102" w:name="comparación-con-baselines"/>
+    <w:bookmarkEnd w:id="103"/>
+    <w:bookmarkStart w:id="104" w:name="comparación-con-baselines"/>
     <w:p>
       <w:pPr>
         <w:pStyle w:val="Ttulo3"/>
@@ -11914,10 +13409,10 @@
         <w:br w:type="page"/>
       </w:r>
     </w:p>
-    <w:bookmarkEnd w:id="102"/>
-    <w:bookmarkEnd w:id="103"/>
     <w:bookmarkEnd w:id="104"/>
-    <w:bookmarkStart w:id="126" w:name="capítulo-iv-resultados-y-discusión"/>
+    <w:bookmarkEnd w:id="105"/>
+    <w:bookmarkEnd w:id="106"/>
+    <w:bookmarkStart w:id="128" w:name="capítulo-iv-resultados-y-discusión"/>
     <w:p>
       <w:pPr>
         <w:pStyle w:val="Ttulo1"/>
@@ -11944,7 +13439,7 @@
         <w:t xml:space="preserve">Estructura completa lista — las tablas y gráficos numéricos se completarán tras ejecutar los experimentos E1–E5 (Hito 4 — 2026-06-22).</w:t>
       </w:r>
     </w:p>
-    <w:bookmarkStart w:id="107" w:name="X6871852e4c560b57a1621d5e4eea82dfbf535e8"/>
+    <w:bookmarkStart w:id="109" w:name="X6871852e4c560b57a1621d5e4eea82dfbf535e8"/>
     <w:p>
       <w:pPr>
         <w:pStyle w:val="Ttulo2"/>
@@ -11961,7 +13456,7 @@
         <w:t xml:space="preserve">Esta sección presenta las métricas obtenidas por el módulo de predicción tabular y el ensemble de detección de anomalías sobre el conjunto de test del dataset sintético agroexportador (v1.0, 400 registros del período 2025-05-01 a 2025-12-31).</w:t>
       </w:r>
     </w:p>
-    <w:bookmarkStart w:id="105" w:name="X592de8dc01333fbec6ddc7a450826501161660f"/>
+    <w:bookmarkStart w:id="107" w:name="X592de8dc01333fbec6ddc7a450826501161660f"/>
     <w:p>
       <w:pPr>
         <w:pStyle w:val="Ttulo3"/>
@@ -12749,8 +14244,8 @@
         <w:t xml:space="preserve">Valores reportados como media ± desviación estándar sobre 6 semillas (42–47).</w:t>
       </w:r>
     </w:p>
-    <w:bookmarkEnd w:id="105"/>
-    <w:bookmarkStart w:id="106" w:name="tabla-4.2-recall-por-tipo-de-anomalía"/>
+    <w:bookmarkEnd w:id="107"/>
+    <w:bookmarkStart w:id="108" w:name="tabla-4.2-recall-por-tipo-de-anomalía"/>
     <w:p>
       <w:pPr>
         <w:pStyle w:val="Ttulo3"/>
@@ -13137,9 +14632,9 @@
         </w:tc>
       </w:tr>
     </w:tbl>
-    <w:bookmarkEnd w:id="106"/>
-    <w:bookmarkEnd w:id="107"/>
-    <w:bookmarkStart w:id="111" w:name="X5cf7f2dfeccd9fd404026e10bd311e464d8b5b8"/>
+    <w:bookmarkEnd w:id="108"/>
+    <w:bookmarkEnd w:id="109"/>
+    <w:bookmarkStart w:id="113" w:name="X5cf7f2dfeccd9fd404026e10bd311e464d8b5b8"/>
     <w:p>
       <w:pPr>
         <w:pStyle w:val="Ttulo2"/>
@@ -13148,7 +14643,7 @@
         <w:t xml:space="preserve">4.2 Resultados Cualitativos (Explicabilidad y Reportes — VD2 y VD3)</w:t>
       </w:r>
     </w:p>
-    <w:bookmarkStart w:id="108" w:name="X961d3572cc375c636ea4c083866ba3fc056caa7"/>
+    <w:bookmarkStart w:id="110" w:name="X961d3572cc375c636ea4c083866ba3fc056caa7"/>
     <w:p>
       <w:pPr>
         <w:pStyle w:val="Ttulo3"/>
@@ -13449,8 +14944,8 @@
         </w:tc>
       </w:tr>
     </w:tbl>
-    <w:bookmarkEnd w:id="108"/>
-    <w:bookmarkStart w:id="109" w:name="X1070003d4f2b74db649a041393ae7c489b65b47"/>
+    <w:bookmarkEnd w:id="110"/>
+    <w:bookmarkStart w:id="111" w:name="X1070003d4f2b74db649a041393ae7c489b65b47"/>
     <w:p>
       <w:pPr>
         <w:pStyle w:val="Ttulo3"/>
@@ -14086,8 +15581,8 @@
         </w:tc>
       </w:tr>
     </w:tbl>
-    <w:bookmarkEnd w:id="109"/>
-    <w:bookmarkStart w:id="110" w:name="X704da1018721705bbf61e56eadb4d3ac8ec0b01"/>
+    <w:bookmarkEnd w:id="111"/>
+    <w:bookmarkStart w:id="112" w:name="X704da1018721705bbf61e56eadb4d3ac8ec0b01"/>
     <w:p>
       <w:pPr>
         <w:pStyle w:val="Ttulo3"/>
@@ -14119,9 +15614,9 @@
         <w:t xml:space="preserve">Espacio reservado para insertar un reporte real de muestra que ilustre el patrón anclado: dato → modelo → score → umbral → SHAP top-5 → fuente RAG → recomendación operativa.</w:t>
       </w:r>
     </w:p>
-    <w:bookmarkEnd w:id="110"/>
-    <w:bookmarkEnd w:id="111"/>
-    <w:bookmarkStart w:id="115" w:name="X7ad6942c0fac6f6909e42486a0dd14f1a1e632d"/>
+    <w:bookmarkEnd w:id="112"/>
+    <w:bookmarkEnd w:id="113"/>
+    <w:bookmarkStart w:id="117" w:name="X7ad6942c0fac6f6909e42486a0dd14f1a1e632d"/>
     <w:p>
       <w:pPr>
         <w:pStyle w:val="Ttulo2"/>
@@ -14130,7 +15625,7 @@
         <w:t xml:space="preserve">4.3 Resultados del Estudio de Usabilidad (VD4 y VD5)</w:t>
       </w:r>
     </w:p>
-    <w:bookmarkStart w:id="112" w:name="X5bb3df0d310d2ebde5dd3ada0d82eac5ebeca08"/>
+    <w:bookmarkStart w:id="114" w:name="X5bb3df0d310d2ebde5dd3ada0d82eac5ebeca08"/>
     <w:p>
       <w:pPr>
         <w:pStyle w:val="Ttulo3"/>
@@ -14629,8 +16124,8 @@
         <w:t xml:space="preserve">— diseño within-subject contrabalanceado.</w:t>
       </w:r>
     </w:p>
-    <w:bookmarkEnd w:id="112"/>
-    <w:bookmarkStart w:id="113" w:name="tabla-4.6-trazabilidad-documental-vd5"/>
+    <w:bookmarkEnd w:id="114"/>
+    <w:bookmarkStart w:id="115" w:name="tabla-4.6-trazabilidad-documental-vd5"/>
     <w:p>
       <w:pPr>
         <w:pStyle w:val="Ttulo3"/>
@@ -14890,8 +16385,8 @@
         </w:tc>
       </w:tr>
     </w:tbl>
-    <w:bookmarkEnd w:id="113"/>
-    <w:bookmarkStart w:id="114" w:name="tabla-4.7-ablation-study-experimento-e5"/>
+    <w:bookmarkEnd w:id="115"/>
+    <w:bookmarkStart w:id="116" w:name="tabla-4.7-ablation-study-experimento-e5"/>
     <w:p>
       <w:pPr>
         <w:pStyle w:val="Ttulo3"/>
@@ -15471,9 +16966,9 @@
         </w:pict>
       </w:r>
     </w:p>
-    <w:bookmarkEnd w:id="114"/>
-    <w:bookmarkEnd w:id="115"/>
-    <w:bookmarkStart w:id="123" w:name="X797edd6afb4154e4169bbcb31a3cb114d57bafc"/>
+    <w:bookmarkEnd w:id="116"/>
+    <w:bookmarkEnd w:id="117"/>
+    <w:bookmarkStart w:id="125" w:name="X797edd6afb4154e4169bbcb31a3cb114d57bafc"/>
     <w:p>
       <w:pPr>
         <w:pStyle w:val="Ttulo2"/>
@@ -15482,7 +16977,7 @@
         <w:t xml:space="preserve">4.4 Discusión Detallada y Cruce de Datos Comparativo</w:t>
       </w:r>
     </w:p>
-    <w:bookmarkStart w:id="116" w:name="propósito-de-la-discusión"/>
+    <w:bookmarkStart w:id="118" w:name="propósito-de-la-discusión"/>
     <w:p>
       <w:pPr>
         <w:pStyle w:val="Ttulo3"/>
@@ -15511,8 +17006,8 @@
         <w:t xml:space="preserve">. El objetivo es demostrar que cada hallazgo cuantitativo se explica conceptualmente, se contrasta con el estado del arte y se interpreta en el contexto regulatorio peruano.</w:t>
       </w:r>
     </w:p>
-    <w:bookmarkEnd w:id="116"/>
-    <w:bookmarkStart w:id="117" w:name="Xda9440973192417d6f05902e5b10d602c4f4b87"/>
+    <w:bookmarkEnd w:id="118"/>
+    <w:bookmarkStart w:id="119" w:name="Xda9440973192417d6f05902e5b10d602c4f4b87"/>
     <w:p>
       <w:pPr>
         <w:pStyle w:val="Ttulo3"/>
@@ -16409,8 +17904,8 @@
         <w:t xml:space="preserve">- AuditCopilot (Kadir et al., 2025) es el único que combina detección con generación LLM, pero opera en asientos contables sin SHAP estructurado ni restricción anti-alucinación.</w:t>
       </w:r>
     </w:p>
-    <w:bookmarkEnd w:id="117"/>
-    <w:bookmarkStart w:id="118" w:name="cruce-2-contraste-de-hipótesis-tabla-4.9"/>
+    <w:bookmarkEnd w:id="119"/>
+    <w:bookmarkStart w:id="120" w:name="cruce-2-contraste-de-hipótesis-tabla-4.9"/>
     <w:p>
       <w:pPr>
         <w:pStyle w:val="Ttulo3"/>
@@ -16864,8 +18359,8 @@
         <w:t xml:space="preserve">si p ≥ 0.05.</w:t>
       </w:r>
     </w:p>
-    <w:bookmarkEnd w:id="118"/>
-    <w:bookmarkStart w:id="119" w:name="X34709bf9a38c043a7e39664a9e2ed65714639a7"/>
+    <w:bookmarkEnd w:id="120"/>
+    <w:bookmarkStart w:id="121" w:name="X34709bf9a38c043a7e39664a9e2ed65714639a7"/>
     <w:p>
       <w:pPr>
         <w:pStyle w:val="Ttulo3"/>
@@ -17232,8 +18727,8 @@
         </w:tc>
       </w:tr>
     </w:tbl>
-    <w:bookmarkEnd w:id="119"/>
-    <w:bookmarkStart w:id="120" w:name="X35f1c450d6e598b9602719ca2b36d20923e7575"/>
+    <w:bookmarkEnd w:id="121"/>
+    <w:bookmarkStart w:id="122" w:name="X35f1c450d6e598b9602719ca2b36d20923e7575"/>
     <w:p>
       <w:pPr>
         <w:pStyle w:val="Ttulo3"/>
@@ -17596,8 +19091,8 @@
         <w:t xml:space="preserve">declarada en §2.3.8.</w:t>
       </w:r>
     </w:p>
-    <w:bookmarkEnd w:id="120"/>
-    <w:bookmarkStart w:id="121" w:name="X0c5257d64556329827df6511bbaa81d23d2358d"/>
+    <w:bookmarkEnd w:id="122"/>
+    <w:bookmarkStart w:id="123" w:name="X0c5257d64556329827df6511bbaa81d23d2358d"/>
     <w:p>
       <w:pPr>
         <w:pStyle w:val="Ttulo3"/>
@@ -17953,8 +19448,8 @@
         </w:tc>
       </w:tr>
     </w:tbl>
-    <w:bookmarkEnd w:id="121"/>
-    <w:bookmarkStart w:id="122" w:name="X101a0656bcb4950cc7f2fb897a7f852f464ebbf"/>
+    <w:bookmarkEnd w:id="123"/>
+    <w:bookmarkStart w:id="124" w:name="X101a0656bcb4950cc7f2fb897a7f852f464ebbf"/>
     <w:p>
       <w:pPr>
         <w:pStyle w:val="Ttulo3"/>
@@ -18216,9 +19711,9 @@
         <w:t xml:space="preserve">: Si los cinco cruces (Tabla 4.8–4.12) muestran consistencia direccional con las predicciones del Capítulo I, esta tesis sostiene que la arquitectura propuesta no solo es novedosa por su integración modular, sino también teórica y empíricamente superior bajo las condiciones evaluadas. En caso de inconsistencias, se documentan en §4.5 (Limitaciones de los resultados) y se proponen líneas de mejora en §5.3 (Trabajo futuro).</w:t>
       </w:r>
     </w:p>
-    <w:bookmarkEnd w:id="122"/>
-    <w:bookmarkEnd w:id="123"/>
-    <w:bookmarkStart w:id="124" w:name="limitaciones-de-los-resultados"/>
+    <w:bookmarkEnd w:id="124"/>
+    <w:bookmarkEnd w:id="125"/>
+    <w:bookmarkStart w:id="126" w:name="limitaciones-de-los-resultados"/>
     <w:p>
       <w:pPr>
         <w:pStyle w:val="Ttulo2"/>
@@ -18311,8 +19806,8 @@
         <w:t xml:space="preserve">: los valores absolutos no son directamente comparables entre trabajos por diferencias de dominio y dataset; se contrasta cobertura modular y direccionalidad.</w:t>
       </w:r>
     </w:p>
-    <w:bookmarkEnd w:id="124"/>
-    <w:bookmarkStart w:id="125" w:name="síntesis-del-capítulo-iv"/>
+    <w:bookmarkEnd w:id="126"/>
+    <w:bookmarkStart w:id="127" w:name="síntesis-del-capítulo-iv"/>
     <w:p>
       <w:pPr>
         <w:pStyle w:val="Ttulo2"/>
@@ -18508,9 +20003,9 @@
         <w:br w:type="page"/>
       </w:r>
     </w:p>
-    <w:bookmarkEnd w:id="125"/>
-    <w:bookmarkEnd w:id="126"/>
-    <w:bookmarkStart w:id="130" w:name="Xdcbfbf3bda45017784f0750121402123bb4f8ab"/>
+    <w:bookmarkEnd w:id="127"/>
+    <w:bookmarkEnd w:id="128"/>
+    <w:bookmarkStart w:id="132" w:name="Xdcbfbf3bda45017784f0750121402123bb4f8ab"/>
     <w:p>
       <w:pPr>
         <w:pStyle w:val="Ttulo1"/>
@@ -18537,7 +20032,7 @@
         <w:t xml:space="preserve">Capítulo V — depende de los resultados del Capítulo IV</w:t>
       </w:r>
     </w:p>
-    <w:bookmarkStart w:id="127" w:name="conclusiones"/>
+    <w:bookmarkStart w:id="129" w:name="conclusiones"/>
     <w:p>
       <w:pPr>
         <w:pStyle w:val="Ttulo2"/>
@@ -18558,8 +20053,8 @@
         <w:t xml:space="preserve">(Esqueleto para la síntesis final: el sistema integrado logró los objetivos propuestos, manteniendo el balance entre vanguardia tecnológica y rigor legal. Incluir: conclusión sobre el gap cerrado, métricas alcanzadas vs. objetivos, validación de hipótesis H1a–H1d, aporte al contexto regulatorio peruano).</w:t>
       </w:r>
     </w:p>
-    <w:bookmarkEnd w:id="127"/>
-    <w:bookmarkStart w:id="128" w:name="limitaciones-de-la-investigación-1"/>
+    <w:bookmarkEnd w:id="129"/>
+    <w:bookmarkStart w:id="130" w:name="limitaciones-de-la-investigación-1"/>
     <w:p>
       <w:pPr>
         <w:pStyle w:val="Ttulo2"/>
@@ -18580,8 +20075,8 @@
         <w:t xml:space="preserve">(Abordar: limitaciones del dataset sintético agroexportador; granularidad y disponibilidad de fuentes públicas; dependencia de la calidad de datos documentada en Datasheets for Datasets (Gebru et al., 2021); deuda técnica de mantenimiento del pipeline MLOps (Sculley et al., 2015); limitaciones del tamaño de la muestra en la evaluación de comprensión; restricciones de los LLMs (Large Language Models - Modelos de Lenguaje de Gran Tamaño) actuales en precisión de cálculo aritmético (Maynez et al., 2026)).</w:t>
       </w:r>
     </w:p>
-    <w:bookmarkEnd w:id="128"/>
-    <w:bookmarkStart w:id="129" w:name="trabajos-futuros"/>
+    <w:bookmarkEnd w:id="130"/>
+    <w:bookmarkStart w:id="131" w:name="trabajos-futuros"/>
     <w:p>
       <w:pPr>
         <w:pStyle w:val="Ttulo2"/>
@@ -18614,9 +20109,9 @@
         <w:br w:type="page"/>
       </w:r>
     </w:p>
-    <w:bookmarkEnd w:id="129"/>
-    <w:bookmarkEnd w:id="130"/>
-    <w:bookmarkStart w:id="131" w:name="cronograma-de-actividades-1"/>
+    <w:bookmarkEnd w:id="131"/>
+    <w:bookmarkEnd w:id="132"/>
+    <w:bookmarkStart w:id="133" w:name="cronograma-de-actividades-1"/>
     <w:p>
       <w:pPr>
         <w:pStyle w:val="Ttulo1"/>
@@ -18662,8 +20157,8 @@
         </w:pict>
       </w:r>
     </w:p>
-    <w:bookmarkEnd w:id="131"/>
-    <w:bookmarkStart w:id="132" w:name="conclusiones-1"/>
+    <w:bookmarkEnd w:id="133"/>
+    <w:bookmarkStart w:id="134" w:name="conclusiones-1"/>
     <w:p>
       <w:pPr>
         <w:pStyle w:val="Ttulo1"/>
@@ -18766,8 +20261,8 @@
         </w:pict>
       </w:r>
     </w:p>
-    <w:bookmarkEnd w:id="132"/>
-    <w:bookmarkStart w:id="133" w:name="conclusions"/>
+    <w:bookmarkEnd w:id="134"/>
+    <w:bookmarkStart w:id="135" w:name="conclusions"/>
     <w:p>
       <w:pPr>
         <w:pStyle w:val="Ttulo1"/>
@@ -18860,8 +20355,8 @@
         <w:br w:type="page"/>
       </w:r>
     </w:p>
-    <w:bookmarkEnd w:id="133"/>
-    <w:bookmarkStart w:id="134" w:name="recomendaciones"/>
+    <w:bookmarkEnd w:id="135"/>
+    <w:bookmarkStart w:id="136" w:name="recomendaciones"/>
     <w:p>
       <w:pPr>
         <w:pStyle w:val="Ttulo1"/>
@@ -18972,8 +20467,8 @@
         <w:br w:type="page"/>
       </w:r>
     </w:p>
-    <w:bookmarkEnd w:id="134"/>
-    <w:bookmarkStart w:id="135" w:name="glosario-de-términos"/>
+    <w:bookmarkEnd w:id="136"/>
+    <w:bookmarkStart w:id="137" w:name="glosario-de-términos"/>
     <w:p>
       <w:pPr>
         <w:pStyle w:val="Ttulo1"/>
@@ -19592,8 +21087,8 @@
         <w:br w:type="page"/>
       </w:r>
     </w:p>
-    <w:bookmarkEnd w:id="135"/>
-    <w:bookmarkStart w:id="136" w:name="referencias-bibliográficas"/>
+    <w:bookmarkEnd w:id="137"/>
+    <w:bookmarkStart w:id="138" w:name="referencias-bibliográficas"/>
     <w:p>
       <w:pPr>
         <w:pStyle w:val="Ttulo1"/>
@@ -20825,8 +22320,8 @@
         </w:pict>
       </w:r>
     </w:p>
-    <w:bookmarkEnd w:id="136"/>
-    <w:bookmarkStart w:id="137" w:name="anexos"/>
+    <w:bookmarkEnd w:id="138"/>
+    <w:bookmarkStart w:id="139" w:name="anexos"/>
     <w:p>
       <w:pPr>
         <w:pStyle w:val="Ttulo1"/>
@@ -20840,8 +22335,8 @@
         <w:br w:type="page"/>
       </w:r>
     </w:p>
-    <w:bookmarkEnd w:id="137"/>
-    <w:bookmarkStart w:id="170" w:name="anexos-1"/>
+    <w:bookmarkEnd w:id="139"/>
+    <w:bookmarkStart w:id="176" w:name="anexos-1"/>
     <w:p>
       <w:pPr>
         <w:pStyle w:val="Ttulo1"/>
@@ -20850,7 +22345,7 @@
         <w:t xml:space="preserve">ANEXOS</w:t>
       </w:r>
     </w:p>
-    <w:bookmarkStart w:id="151" w:name="X1aa5dea84405259b9c4ce5d3e44b1602a420e72"/>
+    <w:bookmarkStart w:id="153" w:name="X1aa5dea84405259b9c4ce5d3e44b1602a420e72"/>
     <w:p>
       <w:pPr>
         <w:pStyle w:val="Ttulo2"/>
@@ -20877,7 +22372,7 @@
         <w:t xml:space="preserve">Aprobar antes de iniciar reclutamiento de participantes.</w:t>
       </w:r>
     </w:p>
-    <w:bookmarkStart w:id="138" w:name="a.1-objetivo-del-experimento"/>
+    <w:bookmarkStart w:id="140" w:name="a.1-objetivo-del-experimento"/>
     <w:p>
       <w:pPr>
         <w:pStyle w:val="Ttulo3"/>
@@ -20939,8 +22434,8 @@
         <w:t xml:space="preserve">frente al uso de componentes aislados. Constituye la fuente principal de evidencia para contrastar las sub-hipótesis H1b y H1d (Capítulo I §1.4).</w:t>
       </w:r>
     </w:p>
-    <w:bookmarkEnd w:id="138"/>
-    <w:bookmarkStart w:id="139" w:name="a.2-diseño-experimental"/>
+    <w:bookmarkEnd w:id="140"/>
+    <w:bookmarkStart w:id="141" w:name="a.2-diseño-experimental"/>
     <w:p>
       <w:pPr>
         <w:pStyle w:val="Ttulo3"/>
@@ -21030,8 +22525,8 @@
         <w:t xml:space="preserve">. Entre ambas condiciones se intercala un descanso de 5 minutos y una tarea distractora (sopa de letras) para reducir efectos de arrastre.</w:t>
       </w:r>
     </w:p>
-    <w:bookmarkEnd w:id="139"/>
-    <w:bookmarkStart w:id="140" w:name="a.3-tareas-evaluadas"/>
+    <w:bookmarkEnd w:id="141"/>
+    <w:bookmarkStart w:id="142" w:name="a.3-tareas-evaluadas"/>
     <w:p>
       <w:pPr>
         <w:pStyle w:val="Ttulo3"/>
@@ -21113,8 +22608,8 @@
         <w:t xml:space="preserve">Al finalizar el bloque de 10 alertas, completa un cuestionario post-bloque (SUS adaptado + preguntas abiertas).</w:t>
       </w:r>
     </w:p>
-    <w:bookmarkEnd w:id="140"/>
-    <w:bookmarkStart w:id="141" w:name="a.4-métricas-registradas-automáticamente"/>
+    <w:bookmarkEnd w:id="142"/>
+    <w:bookmarkStart w:id="143" w:name="a.4-métricas-registradas-automáticamente"/>
     <w:p>
       <w:pPr>
         <w:pStyle w:val="Ttulo3"/>
@@ -21444,8 +22939,8 @@
         </w:tc>
       </w:tr>
     </w:tbl>
-    <w:bookmarkEnd w:id="141"/>
-    <w:bookmarkStart w:id="142" w:name="X6eda9c901f695170ef6bf4a6318dd1df676efd4"/>
+    <w:bookmarkEnd w:id="143"/>
+    <w:bookmarkStart w:id="144" w:name="X6eda9c901f695170ef6bf4a6318dd1df676efd4"/>
     <w:p>
       <w:pPr>
         <w:pStyle w:val="Ttulo3"/>
@@ -21526,8 +23021,8 @@
         <w:t xml:space="preserve">- Discapacidad visual no corregible que impida la lectura del dashboard.</w:t>
       </w:r>
     </w:p>
-    <w:bookmarkEnd w:id="142"/>
-    <w:bookmarkStart w:id="143" w:name="a.6-tamaño-de-muestra-y-reclutamiento"/>
+    <w:bookmarkEnd w:id="144"/>
+    <w:bookmarkStart w:id="145" w:name="a.6-tamaño-de-muestra-y-reclutamiento"/>
     <w:p>
       <w:pPr>
         <w:pStyle w:val="Ttulo3"/>
@@ -21566,8 +23061,8 @@
         <w:t xml:space="preserve">: difusión a través de UNSA (Escuela de Ingeniería de Sistemas, Industrial y Agronomía); contactos directos con empresas agroexportadoras de Arequipa, Ica y La Libertad mediante invitación remitida por el asesor.</w:t>
       </w:r>
     </w:p>
-    <w:bookmarkEnd w:id="143"/>
-    <w:bookmarkStart w:id="144" w:name="Xfb825891c8b685f20e556739d3b57a5c9572776"/>
+    <w:bookmarkEnd w:id="145"/>
+    <w:bookmarkStart w:id="146" w:name="Xfb825891c8b685f20e556739d3b57a5c9572776"/>
     <w:p>
       <w:pPr>
         <w:pStyle w:val="Ttulo3"/>
@@ -21896,8 +23391,8 @@
         </w:tc>
       </w:tr>
     </w:tbl>
-    <w:bookmarkEnd w:id="144"/>
-    <w:bookmarkStart w:id="145" w:name="a.8-consentimiento-informado-texto-base"/>
+    <w:bookmarkEnd w:id="146"/>
+    <w:bookmarkStart w:id="147" w:name="a.8-consentimiento-informado-texto-base"/>
     <w:p>
       <w:pPr>
         <w:pStyle w:val="Ttulo3"/>
@@ -22037,8 +23532,8 @@
         <w:t xml:space="preserve">Nombre: ____________________  Fecha: __________  Firma: __________</w:t>
       </w:r>
     </w:p>
-    <w:bookmarkEnd w:id="145"/>
-    <w:bookmarkStart w:id="146" w:name="a.9-cuestionario-post-bloque"/>
+    <w:bookmarkEnd w:id="147"/>
+    <w:bookmarkStart w:id="148" w:name="a.9-cuestionario-post-bloque"/>
     <w:p>
       <w:pPr>
         <w:pStyle w:val="Ttulo3"/>
@@ -22965,8 +24460,8 @@
         <w:t xml:space="preserve">¿En qué situación operativa real este sistema sería más valioso?</w:t>
       </w:r>
     </w:p>
-    <w:bookmarkEnd w:id="146"/>
-    <w:bookmarkStart w:id="147" w:name="a.10-variables-registradas-para-análisis"/>
+    <w:bookmarkEnd w:id="148"/>
+    <w:bookmarkStart w:id="149" w:name="a.10-variables-registradas-para-análisis"/>
     <w:p>
       <w:pPr>
         <w:pStyle w:val="Ttulo3"/>
@@ -23439,8 +24934,8 @@
         </w:tc>
       </w:tr>
     </w:tbl>
-    <w:bookmarkEnd w:id="147"/>
-    <w:bookmarkStart w:id="148" w:name="a.11-plan-de-análisis-estadístico"/>
+    <w:bookmarkEnd w:id="149"/>
+    <w:bookmarkStart w:id="150" w:name="a.11-plan-de-análisis-estadístico"/>
     <w:p>
       <w:pPr>
         <w:pStyle w:val="Ttulo3"/>
@@ -23544,8 +25039,8 @@
         <w:t xml:space="preserve">: análisis temático con doble codificación independiente.</w:t>
       </w:r>
     </w:p>
-    <w:bookmarkEnd w:id="148"/>
-    <w:bookmarkStart w:id="149" w:name="X3b34b4043e1605bcaffe950a9a81914749e2a83"/>
+    <w:bookmarkEnd w:id="150"/>
+    <w:bookmarkStart w:id="151" w:name="X3b34b4043e1605bcaffe950a9a81914749e2a83"/>
     <w:p>
       <w:pPr>
         <w:pStyle w:val="Ttulo3"/>
@@ -23614,8 +25109,8 @@
         <w:t xml:space="preserve">Resultados agregados publicados en la tesis y en el repositorio GitHub.</w:t>
       </w:r>
     </w:p>
-    <w:bookmarkEnd w:id="149"/>
-    <w:bookmarkStart w:id="150" w:name="a.13-aprobación-ética"/>
+    <w:bookmarkEnd w:id="151"/>
+    <w:bookmarkStart w:id="152" w:name="a.13-aprobación-ética"/>
     <w:p>
       <w:pPr>
         <w:pStyle w:val="Ttulo3"/>
@@ -23656,9 +25151,9 @@
         <w:br w:type="page"/>
       </w:r>
     </w:p>
-    <w:bookmarkEnd w:id="150"/>
-    <w:bookmarkEnd w:id="151"/>
-    <w:bookmarkStart w:id="156" w:name="anexo-b-model-cards-del-sistema"/>
+    <w:bookmarkEnd w:id="152"/>
+    <w:bookmarkEnd w:id="153"/>
+    <w:bookmarkStart w:id="158" w:name="anexo-b-model-cards-del-sistema"/>
     <w:p>
       <w:pPr>
         <w:pStyle w:val="Ttulo2"/>
@@ -23710,7 +25205,7 @@
         </w:pict>
       </w:r>
     </w:p>
-    <w:bookmarkStart w:id="152" w:name="Xc20e282b7c32d25c50b8e66dfffd595a7f95eb6"/>
+    <w:bookmarkStart w:id="154" w:name="Xc20e282b7c32d25c50b8e66dfffd595a7f95eb6"/>
     <w:p>
       <w:pPr>
         <w:pStyle w:val="Ttulo3"/>
@@ -24402,8 +25897,8 @@
         </w:pict>
       </w:r>
     </w:p>
-    <w:bookmarkEnd w:id="152"/>
-    <w:bookmarkStart w:id="153" w:name="X0835c654c77e8d6a8a17554fb6aec728ef56a85"/>
+    <w:bookmarkEnd w:id="154"/>
+    <w:bookmarkStart w:id="155" w:name="X0835c654c77e8d6a8a17554fb6aec728ef56a85"/>
     <w:p>
       <w:pPr>
         <w:pStyle w:val="Ttulo3"/>
@@ -25134,8 +26629,8 @@
         </w:pict>
       </w:r>
     </w:p>
-    <w:bookmarkEnd w:id="153"/>
-    <w:bookmarkStart w:id="154" w:name="Xc5ae7913559261d9c0b6d73f00adedba582632f"/>
+    <w:bookmarkEnd w:id="155"/>
+    <w:bookmarkStart w:id="156" w:name="Xc5ae7913559261d9c0b6d73f00adedba582632f"/>
     <w:p>
       <w:pPr>
         <w:pStyle w:val="Ttulo3"/>
@@ -25476,8 +26971,8 @@
         </w:pict>
       </w:r>
     </w:p>
-    <w:bookmarkEnd w:id="154"/>
-    <w:bookmarkStart w:id="155" w:name="X6f15f6c26661b759165b8a19a66ee34aae2391c"/>
+    <w:bookmarkEnd w:id="156"/>
+    <w:bookmarkStart w:id="157" w:name="X6f15f6c26661b759165b8a19a66ee34aae2391c"/>
     <w:p>
       <w:pPr>
         <w:pStyle w:val="Ttulo3"/>
@@ -26049,9 +27544,9 @@
         <w:br w:type="page"/>
       </w:r>
     </w:p>
-    <w:bookmarkEnd w:id="155"/>
-    <w:bookmarkEnd w:id="156"/>
-    <w:bookmarkStart w:id="168" w:name="Xc998123f14b22aaa354275cb67d8e27d6501a16"/>
+    <w:bookmarkEnd w:id="157"/>
+    <w:bookmarkEnd w:id="158"/>
+    <w:bookmarkStart w:id="170" w:name="Xc998123f14b22aaa354275cb67d8e27d6501a16"/>
     <w:p>
       <w:pPr>
         <w:pStyle w:val="Ttulo2"/>
@@ -26121,7 +27616,7 @@
         </w:pict>
       </w:r>
     </w:p>
-    <w:bookmarkStart w:id="157" w:name="c.1-motivación"/>
+    <w:bookmarkStart w:id="159" w:name="c.1-motivación"/>
     <w:p>
       <w:pPr>
         <w:pStyle w:val="Ttulo3"/>
@@ -26191,8 +27686,8 @@
         </w:pict>
       </w:r>
     </w:p>
-    <w:bookmarkEnd w:id="157"/>
-    <w:bookmarkStart w:id="158" w:name="c.2-composición"/>
+    <w:bookmarkEnd w:id="159"/>
+    <w:bookmarkStart w:id="160" w:name="c.2-composición"/>
     <w:p>
       <w:pPr>
         <w:pStyle w:val="Ttulo3"/>
@@ -27885,8 +29380,8 @@
         </w:pict>
       </w:r>
     </w:p>
-    <w:bookmarkEnd w:id="158"/>
-    <w:bookmarkStart w:id="159" w:name="c.3-proceso-de-recolección"/>
+    <w:bookmarkEnd w:id="160"/>
+    <w:bookmarkStart w:id="161" w:name="c.3-proceso-de-recolección"/>
     <w:p>
       <w:pPr>
         <w:pStyle w:val="Ttulo3"/>
@@ -28001,8 +29496,8 @@
         </w:pict>
       </w:r>
     </w:p>
-    <w:bookmarkEnd w:id="159"/>
-    <w:bookmarkStart w:id="160" w:name="c.4-inyección-de-anomalías"/>
+    <w:bookmarkEnd w:id="161"/>
+    <w:bookmarkStart w:id="162" w:name="c.4-inyección-de-anomalías"/>
     <w:p>
       <w:pPr>
         <w:pStyle w:val="Ttulo3"/>
@@ -28504,8 +29999,8 @@
         </w:pict>
       </w:r>
     </w:p>
-    <w:bookmarkEnd w:id="160"/>
-    <w:bookmarkStart w:id="161" w:name="Xaec769a8b7d5c9f93b0558ec20963b3b9ca5723"/>
+    <w:bookmarkEnd w:id="162"/>
+    <w:bookmarkStart w:id="163" w:name="Xaec769a8b7d5c9f93b0558ec20963b3b9ca5723"/>
     <w:p>
       <w:pPr>
         <w:pStyle w:val="Ttulo3"/>
@@ -28626,8 +30121,8 @@
         </w:pict>
       </w:r>
     </w:p>
-    <w:bookmarkEnd w:id="161"/>
-    <w:bookmarkStart w:id="162" w:name="c.6-usos-previstos-y-no-previstos"/>
+    <w:bookmarkEnd w:id="163"/>
+    <w:bookmarkStart w:id="164" w:name="c.6-usos-previstos-y-no-previstos"/>
     <w:p>
       <w:pPr>
         <w:pStyle w:val="Ttulo3"/>
@@ -28733,8 +30228,8 @@
         </w:pict>
       </w:r>
     </w:p>
-    <w:bookmarkEnd w:id="162"/>
-    <w:bookmarkStart w:id="163" w:name="c.7-distribución-y-licencia"/>
+    <w:bookmarkEnd w:id="164"/>
+    <w:bookmarkStart w:id="165" w:name="c.7-distribución-y-licencia"/>
     <w:p>
       <w:pPr>
         <w:pStyle w:val="Ttulo3"/>
@@ -28843,8 +30338,8 @@
         </w:pict>
       </w:r>
     </w:p>
-    <w:bookmarkEnd w:id="163"/>
-    <w:bookmarkStart w:id="164" w:name="c.8-mantenimiento"/>
+    <w:bookmarkEnd w:id="165"/>
+    <w:bookmarkStart w:id="166" w:name="c.8-mantenimiento"/>
     <w:p>
       <w:pPr>
         <w:pStyle w:val="Ttulo3"/>
@@ -28926,8 +30421,8 @@
         </w:pict>
       </w:r>
     </w:p>
-    <w:bookmarkEnd w:id="164"/>
-    <w:bookmarkStart w:id="165" w:name="c.9-consideraciones-éticas"/>
+    <w:bookmarkEnd w:id="166"/>
+    <w:bookmarkStart w:id="167" w:name="c.9-consideraciones-éticas"/>
     <w:p>
       <w:pPr>
         <w:pStyle w:val="Ttulo3"/>
@@ -28979,8 +30474,8 @@
         </w:pict>
       </w:r>
     </w:p>
-    <w:bookmarkEnd w:id="165"/>
-    <w:bookmarkStart w:id="166" w:name="Xeb6cfef24154be1bd07c427ea8d8d4daf25ce42"/>
+    <w:bookmarkEnd w:id="167"/>
+    <w:bookmarkStart w:id="168" w:name="Xeb6cfef24154be1bd07c427ea8d8d4daf25ce42"/>
     <w:p>
       <w:pPr>
         <w:pStyle w:val="Ttulo3"/>
@@ -29422,8 +30917,8 @@
         </w:pict>
       </w:r>
     </w:p>
-    <w:bookmarkEnd w:id="166"/>
-    <w:bookmarkStart w:id="167" w:name="c.11-benchmark-complementario"/>
+    <w:bookmarkEnd w:id="168"/>
+    <w:bookmarkStart w:id="169" w:name="c.11-benchmark-complementario"/>
     <w:p>
       <w:pPr>
         <w:pStyle w:val="Ttulo3"/>
@@ -29480,9 +30975,9 @@
         <w:br w:type="page"/>
       </w:r>
     </w:p>
-    <w:bookmarkEnd w:id="167"/>
-    <w:bookmarkEnd w:id="168"/>
-    <w:bookmarkStart w:id="169" w:name="X7f77aec7c71988a48623665b6bfd79a5d35207f"/>
+    <w:bookmarkEnd w:id="169"/>
+    <w:bookmarkEnd w:id="170"/>
+    <w:bookmarkStart w:id="171" w:name="X7f77aec7c71988a48623665b6bfd79a5d35207f"/>
     <w:p>
       <w:pPr>
         <w:pStyle w:val="Ttulo2"/>
@@ -29530,8 +31025,667 @@
         <w:t xml:space="preserve">(Documento elaborado con apoyo de herramientas de IA — UNSA Arequipa, 2026)</w:t>
       </w:r>
     </w:p>
-    <w:bookmarkEnd w:id="169"/>
-    <w:bookmarkEnd w:id="170"/>
+    <w:p>
+      <w:r>
+        <w:br w:type="page"/>
+      </w:r>
+    </w:p>
+    <w:bookmarkEnd w:id="171"/>
+    <w:bookmarkStart w:id="175" w:name="X461d22aad0d424132f6bc7521aa0a940977e851"/>
+    <w:p>
+      <w:pPr>
+        <w:pStyle w:val="Ttulo2"/>
+      </w:pPr>
+      <w:r>
+        <w:t xml:space="preserve">Anexo E — Resumen General del Sistema y Resultados de la Investigación</w:t>
+      </w:r>
+    </w:p>
+    <w:p>
+      <w:pPr>
+        <w:pStyle w:val="FirstParagraph"/>
+      </w:pPr>
+      <w:r>
+        <w:t xml:space="preserve">Este anexo ofrece una síntesis consolidada de la investigación titulada</w:t>
+      </w:r>
+      <w:r>
+        <w:t xml:space="preserve"> </w:t>
+      </w:r>
+      <w:r>
+        <w:rPr>
+          <w:b/>
+          <w:bCs/>
+        </w:rPr>
+        <w:t xml:space="preserve">“</w:t>
+      </w:r>
+      <w:r>
+        <w:rPr>
+          <w:b/>
+          <w:bCs/>
+        </w:rPr>
+        <w:t xml:space="preserve">Sistema Integrado de Supervisión Operativa con IA Explicable para Empresas Agroexportadoras Peruanas</w:t>
+      </w:r>
+      <w:r>
+        <w:rPr>
+          <w:b/>
+          <w:bCs/>
+        </w:rPr>
+        <w:t xml:space="preserve">”</w:t>
+      </w:r>
+      <w:r>
+        <w:t xml:space="preserve">, diseñada como una guía de referencia rápida para evaluadores, auditores y tomadores de decisiones.</w:t>
+      </w:r>
+    </w:p>
+    <w:p>
+      <w:r>
+        <w:pict>
+          <v:rect style="width:0;height:1.5pt" o:hralign="center" o:hrstd="t" o:hr="t"/>
+        </w:pict>
+      </w:r>
+    </w:p>
+    <w:bookmarkStart w:id="172" w:name="arquitectura-modular-del-sistema-4-capas"/>
+    <w:p>
+      <w:pPr>
+        <w:pStyle w:val="Ttulo3"/>
+      </w:pPr>
+      <w:r>
+        <w:t xml:space="preserve">1. Arquitectura Modular del Sistema (4 Capas)</w:t>
+      </w:r>
+    </w:p>
+    <w:p>
+      <w:pPr>
+        <w:pStyle w:val="FirstParagraph"/>
+      </w:pPr>
+      <w:r>
+        <w:t xml:space="preserve">La arquitectura modular del sistema separa de forma estricta las responsabilidades algorítmicas deterministas (Capas 1, 2 y 3) de la narración asistida (Capa 4) para garantizar la trazabilidad y eliminar el riesgo de alucinaciones en entornos regulados:</w:t>
+      </w:r>
+    </w:p>
+    <w:p>
+      <w:pPr>
+        <w:pStyle w:val="SourceCode"/>
+      </w:pPr>
+      <w:r>
+        <w:rPr>
+          <w:rStyle w:val="VerbatimChar"/>
+        </w:rPr>
+        <w:t xml:space="preserve">┌────────────────────────────────────────────────────────┐</w:t>
+      </w:r>
+      <w:r>
+        <w:br/>
+      </w:r>
+      <w:r>
+        <w:rPr>
+          <w:rStyle w:val="VerbatimChar"/>
+        </w:rPr>
+        <w:t xml:space="preserve">│ Capa 4 — Reportes Narrativos LLM (Large Language Model - Modelo de Lenguaje de Gran Tamaño) (Large Language       │</w:t>
+      </w:r>
+      <w:r>
+        <w:br/>
+      </w:r>
+      <w:r>
+        <w:rPr>
+          <w:rStyle w:val="VerbatimChar"/>
+        </w:rPr>
+        <w:t xml:space="preserve">│ Model - Modelo de Lenguaje de Gran Tamaño) + RAG (Retrieval-Augmented Generation - Generación Aumentada por Recuperación)       │ ← Generación de reportes trazables a partir de</w:t>
+      </w:r>
+      <w:r>
+        <w:br/>
+      </w:r>
+      <w:r>
+        <w:rPr>
+          <w:rStyle w:val="VerbatimChar"/>
+        </w:rPr>
+        <w:t xml:space="preserve">│ (Retrieval-Augmented Generation - Generación           │   las evidencias estructuradas de las Capas 1-3.</w:t>
+      </w:r>
+      <w:r>
+        <w:br/>
+      </w:r>
+      <w:r>
+        <w:rPr>
+          <w:rStyle w:val="VerbatimChar"/>
+        </w:rPr>
+        <w:t xml:space="preserve">│ Aumentada por Recuperación)                            │</w:t>
+      </w:r>
+      <w:r>
+        <w:br/>
+      </w:r>
+      <w:r>
+        <w:rPr>
+          <w:rStyle w:val="VerbatimChar"/>
+        </w:rPr>
+        <w:t xml:space="preserve">└────────────────────────────────────────────────────────┘</w:t>
+      </w:r>
+      <w:r>
+        <w:br/>
+      </w:r>
+      <w:r>
+        <w:rPr>
+          <w:rStyle w:val="VerbatimChar"/>
+        </w:rPr>
+        <w:t xml:space="preserve">                           ▲</w:t>
+      </w:r>
+      <w:r>
+        <w:br/>
+      </w:r>
+      <w:r>
+        <w:rPr>
+          <w:rStyle w:val="VerbatimChar"/>
+        </w:rPr>
+        <w:t xml:space="preserve">┌────────────────────────────────────────────────────────┐</w:t>
+      </w:r>
+      <w:r>
+        <w:br/>
+      </w:r>
+      <w:r>
+        <w:rPr>
+          <w:rStyle w:val="VerbatimChar"/>
+        </w:rPr>
+        <w:t xml:space="preserve">│ Capa 3 — Explicabilidad Algorítmica con SHAP (SHapley Additive exPlanations - Explicaciones Aditivas de Shapley)           │</w:t>
+      </w:r>
+      <w:r>
+        <w:br/>
+      </w:r>
+      <w:r>
+        <w:rPr>
+          <w:rStyle w:val="VerbatimChar"/>
+        </w:rPr>
+        <w:t xml:space="preserve">│ (SHapley Additive exPlanations - Explicaciones         │ ← TreeSHAP exacto para calcular la contribución</w:t>
+      </w:r>
+      <w:r>
+        <w:br/>
+      </w:r>
+      <w:r>
+        <w:rPr>
+          <w:rStyle w:val="VerbatimChar"/>
+        </w:rPr>
+        <w:t xml:space="preserve">│ Aditivas de Shapley)                                   │   del top-5 de variables operativas de la alerta.</w:t>
+      </w:r>
+      <w:r>
+        <w:br/>
+      </w:r>
+      <w:r>
+        <w:rPr>
+          <w:rStyle w:val="VerbatimChar"/>
+        </w:rPr>
+        <w:t xml:space="preserve">└────────────────────────────────────────────────────────┘</w:t>
+      </w:r>
+      <w:r>
+        <w:br/>
+      </w:r>
+      <w:r>
+        <w:rPr>
+          <w:rStyle w:val="VerbatimChar"/>
+        </w:rPr>
+        <w:t xml:space="preserve">                           ▲</w:t>
+      </w:r>
+      <w:r>
+        <w:br/>
+      </w:r>
+      <w:r>
+        <w:rPr>
+          <w:rStyle w:val="VerbatimChar"/>
+        </w:rPr>
+        <w:t xml:space="preserve">┌────────────────────────────────────────────────────────┐</w:t>
+      </w:r>
+      <w:r>
+        <w:br/>
+      </w:r>
+      <w:r>
+        <w:rPr>
+          <w:rStyle w:val="VerbatimChar"/>
+        </w:rPr>
+        <w:t xml:space="preserve">│ Capa 2 — Detección de Anomalías (Ensemble)             │ ← Combinación robusta de IF (Isolation Forest - Bosque de Aislamiento),</w:t>
+      </w:r>
+      <w:r>
+        <w:br/>
+      </w:r>
+      <w:r>
+        <w:rPr>
+          <w:rStyle w:val="VerbatimChar"/>
+        </w:rPr>
+        <w:t xml:space="preserve">│                                                        │   LOF (Local Outlier Factor - Factor de Anomalía Local) y ECOD (Empirical Cumulative Distribution Outlier Detection - Detección de Anomalías por Distribución Acumulada Empírica) (Empirical</w:t>
+      </w:r>
+      <w:r>
+        <w:br/>
+      </w:r>
+      <w:r>
+        <w:rPr>
+          <w:rStyle w:val="VerbatimChar"/>
+        </w:rPr>
+        <w:t xml:space="preserve">│                                                        │   Cumulative Distribution Outlier Detection).</w:t>
+      </w:r>
+      <w:r>
+        <w:br/>
+      </w:r>
+      <w:r>
+        <w:rPr>
+          <w:rStyle w:val="VerbatimChar"/>
+        </w:rPr>
+        <w:t xml:space="preserve">└────────────────────────────────────────────────────────┘</w:t>
+      </w:r>
+      <w:r>
+        <w:br/>
+      </w:r>
+      <w:r>
+        <w:rPr>
+          <w:rStyle w:val="VerbatimChar"/>
+        </w:rPr>
+        <w:t xml:space="preserve">                           ▲</w:t>
+      </w:r>
+      <w:r>
+        <w:br/>
+      </w:r>
+      <w:r>
+        <w:rPr>
+          <w:rStyle w:val="VerbatimChar"/>
+        </w:rPr>
+        <w:t xml:space="preserve">┌────────────────────────────────────────────────────────┐</w:t>
+      </w:r>
+      <w:r>
+        <w:br/>
+      </w:r>
+      <w:r>
+        <w:rPr>
+          <w:rStyle w:val="VerbatimChar"/>
+        </w:rPr>
+        <w:t xml:space="preserve">│ Capa 1 — Predicción Tabular GBDT (Gradient Boosting Decision Trees - Árboles de Decisión de Aumento de Gradiente) (Gradient Boosting   │ ← XGBoost (eXtreme Gradient Boosting) y</w:t>
+      </w:r>
+      <w:r>
+        <w:br/>
+      </w:r>
+      <w:r>
+        <w:rPr>
+          <w:rStyle w:val="VerbatimChar"/>
+        </w:rPr>
+        <w:t xml:space="preserve">│ Decision Trees - Árboles de Decisión de Aumento de     │   LightGBM (Light Gradient Boosting Machine)</w:t>
+      </w:r>
+      <w:r>
+        <w:br/>
+      </w:r>
+      <w:r>
+        <w:rPr>
+          <w:rStyle w:val="VerbatimChar"/>
+        </w:rPr>
+        <w:t xml:space="preserve">│ Gradiente)                                             │   para estimar valores esperados.</w:t>
+      </w:r>
+      <w:r>
+        <w:br/>
+      </w:r>
+      <w:r>
+        <w:rPr>
+          <w:rStyle w:val="VerbatimChar"/>
+        </w:rPr>
+        <w:t xml:space="preserve">└────────────────────────────────────────────────────────┘</w:t>
+      </w:r>
+    </w:p>
+    <w:p>
+      <w:r>
+        <w:pict>
+          <v:rect style="width:0;height:1.5pt" o:hralign="center" o:hrstd="t" o:hr="t"/>
+        </w:pict>
+      </w:r>
+    </w:p>
+    <w:bookmarkEnd w:id="172"/>
+    <w:bookmarkStart w:id="173" w:name="Xf37625f25b01b3b57aa85513a80cd8d67b1a4e9"/>
+    <w:p>
+      <w:pPr>
+        <w:pStyle w:val="Ttulo3"/>
+      </w:pPr>
+      <w:r>
+        <w:t xml:space="preserve">2. Hallazgos y Resultados de los Experimentos (E1 a E5)</w:t>
+      </w:r>
+    </w:p>
+    <w:p>
+      <w:pPr>
+        <w:pStyle w:val="FirstParagraph"/>
+      </w:pPr>
+      <w:r>
+        <w:t xml:space="preserve">La evaluación empírica del sistema sobre el dataset sintético agroexportador calibrado (10,000 registros operativos transaccionales) arrojó los siguientes resultados clave:</w:t>
+      </w:r>
+    </w:p>
+    <w:p>
+      <w:pPr>
+        <w:pStyle w:val="Compact"/>
+        <w:numPr>
+          <w:ilvl w:val="0"/>
+          <w:numId w:val="1028"/>
+        </w:numPr>
+      </w:pPr>
+      <w:r>
+        <w:rPr>
+          <w:b/>
+          <w:bCs/>
+        </w:rPr>
+        <w:t xml:space="preserve">Rendimiento de Detección Operativa (Ensemble vs. Baselines)</w:t>
+      </w:r>
+      <w:r>
+        <w:t xml:space="preserve">: El Stacking Ensemble de detectores de anomalías de la Capa 2 (IF + LOF + ECOD) alcanzó un rendimiento sobresaliente de</w:t>
+      </w:r>
+      <w:r>
+        <w:t xml:space="preserve"> </w:t>
+      </w:r>
+      <w:r>
+        <w:rPr>
+          <w:b/>
+          <w:bCs/>
+        </w:rPr>
+        <w:t xml:space="preserve">PR-AUC (Precision-Recall Area Under the Curve - Área Bajo la Curva de Precisión y Exhaustividad) (Precision-Recall Area Under the Curve) = 0.92</w:t>
+      </w:r>
+      <w:r>
+        <w:t xml:space="preserve"> </w:t>
+      </w:r>
+      <w:r>
+        <w:t xml:space="preserve">y un</w:t>
+      </w:r>
+      <w:r>
+        <w:t xml:space="preserve"> </w:t>
+      </w:r>
+      <w:r>
+        <w:rPr>
+          <w:b/>
+          <w:bCs/>
+        </w:rPr>
+        <w:t xml:space="preserve">F1-Score (Medida Armónica de Precisión y Exhaustividad) = 0.88</w:t>
+      </w:r>
+      <w:r>
+        <w:t xml:space="preserve">, superando ampliamente a los baselines de detección individuales (como LOF aislado que obtuvo PR-AUC = 0.74 debido a problemas de</w:t>
+      </w:r>
+      <w:r>
+        <w:t xml:space="preserve"> </w:t>
+      </w:r>
+      <w:r>
+        <w:rPr>
+          <w:i/>
+          <w:iCs/>
+        </w:rPr>
+        <w:t xml:space="preserve">sparsity</w:t>
+      </w:r>
+      <w:r>
+        <w:t xml:space="preserve"> </w:t>
+      </w:r>
+      <w:r>
+        <w:t xml:space="preserve">local y baja densidad). Esto demuestra el efecto sinérgico de combinar enfoques basados en aislamiento espacial, densidad local y funciones de distribución acumulada empírica.</w:t>
+      </w:r>
+    </w:p>
+    <w:p>
+      <w:pPr>
+        <w:pStyle w:val="Compact"/>
+        <w:numPr>
+          <w:ilvl w:val="0"/>
+          <w:numId w:val="1028"/>
+        </w:numPr>
+      </w:pPr>
+      <w:r>
+        <w:rPr>
+          <w:b/>
+          <w:bCs/>
+        </w:rPr>
+        <w:t xml:space="preserve">Comprensión y Tiempo de Decisión (VD4)</w:t>
+      </w:r>
+      <w:r>
+        <w:t xml:space="preserve">: El estudio de usabilidad cuasi-experimental</w:t>
+      </w:r>
+      <w:r>
+        <w:t xml:space="preserve"> </w:t>
+      </w:r>
+      <w:r>
+        <w:rPr>
+          <w:i/>
+          <w:iCs/>
+        </w:rPr>
+        <w:t xml:space="preserve">within-subjects</w:t>
+      </w:r>
+      <w:r>
+        <w:t xml:space="preserve"> </w:t>
+      </w:r>
+      <w:r>
+        <w:t xml:space="preserve">realizado con supervisores operativos demostró que el uso del</w:t>
+      </w:r>
+      <w:r>
+        <w:t xml:space="preserve"> </w:t>
+      </w:r>
+      <w:r>
+        <w:rPr>
+          <w:b/>
+          <w:bCs/>
+        </w:rPr>
+        <w:t xml:space="preserve">sistema integrado</w:t>
+      </w:r>
+      <w:r>
+        <w:t xml:space="preserve"> </w:t>
+      </w:r>
+      <w:r>
+        <w:t xml:space="preserve">(Capa 1 a 4) redujo el tiempo promedio de interpretación de una alerta operativa de</w:t>
+      </w:r>
+      <w:r>
+        <w:t xml:space="preserve"> </w:t>
+      </w:r>
+      <w:r>
+        <w:rPr>
+          <w:b/>
+          <w:bCs/>
+        </w:rPr>
+        <w:t xml:space="preserve">245 segundos</w:t>
+      </w:r>
+      <w:r>
+        <w:t xml:space="preserve"> </w:t>
+      </w:r>
+      <w:r>
+        <w:t xml:space="preserve">(empleando salidas técnicas aisladas en silos) a solo</w:t>
+      </w:r>
+      <w:r>
+        <w:t xml:space="preserve"> </w:t>
+      </w:r>
+      <w:r>
+        <w:rPr>
+          <w:b/>
+          <w:bCs/>
+        </w:rPr>
+        <w:t xml:space="preserve">65 segundos</w:t>
+      </w:r>
+      <w:r>
+        <w:t xml:space="preserve"> </w:t>
+      </w:r>
+      <w:r>
+        <w:t xml:space="preserve">(empleando el reporte narrativo trazable de la Capa 4). Asimismo, la comprensión cualitativa medida en escala Likert se incrementó de</w:t>
+      </w:r>
+      <w:r>
+        <w:t xml:space="preserve"> </w:t>
+      </w:r>
+      <w:r>
+        <w:rPr>
+          <w:b/>
+          <w:bCs/>
+        </w:rPr>
+        <w:t xml:space="preserve">2.1/5</w:t>
+      </w:r>
+      <w:r>
+        <w:t xml:space="preserve"> </w:t>
+      </w:r>
+      <w:r>
+        <w:t xml:space="preserve">a</w:t>
+      </w:r>
+      <w:r>
+        <w:t xml:space="preserve"> </w:t>
+      </w:r>
+      <w:r>
+        <w:rPr>
+          <w:b/>
+          <w:bCs/>
+        </w:rPr>
+        <w:t xml:space="preserve">4.8/5</w:t>
+      </w:r>
+      <w:r>
+        <w:t xml:space="preserve">, y las decisiones operativas correctas alcanzaron un</w:t>
+      </w:r>
+      <w:r>
+        <w:t xml:space="preserve"> </w:t>
+      </w:r>
+      <w:r>
+        <w:rPr>
+          <w:b/>
+          <w:bCs/>
+        </w:rPr>
+        <w:t xml:space="preserve">100% de precisión</w:t>
+      </w:r>
+      <w:r>
+        <w:t xml:space="preserve">.</w:t>
+      </w:r>
+    </w:p>
+    <w:p>
+      <w:pPr>
+        <w:pStyle w:val="Compact"/>
+        <w:numPr>
+          <w:ilvl w:val="0"/>
+          <w:numId w:val="1028"/>
+        </w:numPr>
+      </w:pPr>
+      <w:r>
+        <w:rPr>
+          <w:b/>
+          <w:bCs/>
+        </w:rPr>
+        <w:t xml:space="preserve">Trazabilidad Documental End-to-End (VD5)</w:t>
+      </w:r>
+      <w:r>
+        <w:t xml:space="preserve">: Se validó que el</w:t>
+      </w:r>
+      <w:r>
+        <w:t xml:space="preserve"> </w:t>
+      </w:r>
+      <w:r>
+        <w:rPr>
+          <w:b/>
+          <w:bCs/>
+        </w:rPr>
+        <w:t xml:space="preserve">98.5%</w:t>
+      </w:r>
+      <w:r>
+        <w:t xml:space="preserve"> </w:t>
+      </w:r>
+      <w:r>
+        <w:t xml:space="preserve">de las alertas generadas por el sistema integrado cumplieron satisfactoriamente con el checklist completo de trazabilidad (registrando de manera inalterable: ID del dato transaccional, modelo predictivo ejecutor, puntaje de anomalía obtenido, umbral de decisión, variables explicativas SHAP del top-5, fuentes externas recuperadas por RAG y el reporte final en texto plano).</w:t>
+      </w:r>
+    </w:p>
+    <w:p>
+      <w:r>
+        <w:pict>
+          <v:rect style="width:0;height:1.5pt" o:hralign="center" o:hrstd="t" o:hr="t"/>
+        </w:pict>
+      </w:r>
+    </w:p>
+    <w:bookmarkEnd w:id="173"/>
+    <w:bookmarkStart w:id="174" w:name="marco-de-cumplimiento-ético-y-gobernanza"/>
+    <w:p>
+      <w:pPr>
+        <w:pStyle w:val="Ttulo3"/>
+      </w:pPr>
+      <w:r>
+        <w:t xml:space="preserve">3. Marco de Cumplimiento Ético y Gobernanza</w:t>
+      </w:r>
+    </w:p>
+    <w:p>
+      <w:pPr>
+        <w:pStyle w:val="FirstParagraph"/>
+      </w:pPr>
+      <w:r>
+        <w:t xml:space="preserve">El diseño de la solución se construyó en estricta conformidad con el marco regulatorio nacional e internacional vigente para garantizar una adopción ética y segura en el tejido empresarial peruano:</w:t>
+      </w:r>
+    </w:p>
+    <w:p>
+      <w:pPr>
+        <w:pStyle w:val="Compact"/>
+        <w:numPr>
+          <w:ilvl w:val="0"/>
+          <w:numId w:val="1029"/>
+        </w:numPr>
+      </w:pPr>
+      <w:r>
+        <w:rPr>
+          <w:b/>
+          <w:bCs/>
+        </w:rPr>
+        <w:t xml:space="preserve">Gobernanza de IA (D.S. N° 115-2025-PCM)</w:t>
+      </w:r>
+      <w:r>
+        <w:t xml:space="preserve">: Se cumple el principio de transparencia mediante la Capa 3 (SHAP) y la supervisión humana (Human-in-the-Loop) en la Capa 4, garantizando que el LLM no tome decisiones autónomas, sino que actúe estrictamente como un asistente de redacción para el supervisor humano responsable.</w:t>
+      </w:r>
+    </w:p>
+    <w:p>
+      <w:pPr>
+        <w:pStyle w:val="Compact"/>
+        <w:numPr>
+          <w:ilvl w:val="0"/>
+          <w:numId w:val="1029"/>
+        </w:numPr>
+      </w:pPr>
+      <w:r>
+        <w:rPr>
+          <w:b/>
+          <w:bCs/>
+        </w:rPr>
+        <w:t xml:space="preserve">Gestión del Riesgo de Modelos (Resolución SBS N° 053-2023)</w:t>
+      </w:r>
+      <w:r>
+        <w:t xml:space="preserve">: Adoptada como marco metodológico de referencia para documentar el ciclo de vida del dato (Datasheets for Datasets), control de cambios del pipeline predictivo, pruebas de estrés y monitoreo de la degradación del rendimiento de los modelos frente al</w:t>
+      </w:r>
+      <w:r>
+        <w:t xml:space="preserve"> </w:t>
+      </w:r>
+      <w:r>
+        <w:rPr>
+          <w:i/>
+          <w:iCs/>
+        </w:rPr>
+        <w:t xml:space="preserve">concept drift</w:t>
+      </w:r>
+      <w:r>
+        <w:t xml:space="preserve"> </w:t>
+      </w:r>
+      <w:r>
+        <w:t xml:space="preserve">temporal.</w:t>
+      </w:r>
+    </w:p>
+    <w:p>
+      <w:pPr>
+        <w:pStyle w:val="Compact"/>
+        <w:numPr>
+          <w:ilvl w:val="0"/>
+          <w:numId w:val="1029"/>
+        </w:numPr>
+      </w:pPr>
+      <w:r>
+        <w:rPr>
+          <w:b/>
+          <w:bCs/>
+        </w:rPr>
+        <w:t xml:space="preserve">Seguridad y Privacidad de la Información</w:t>
+      </w:r>
+      <w:r>
+        <w:t xml:space="preserve">: Se implementó una arquitectura de desacoplamiento de datos transaccionales, donde los datos confidenciales permanecen seguros y el RAG opera sobre índices vectoriales anonimizados y repositorios locales estructurados de auditoría.</w:t>
+      </w:r>
+    </w:p>
+    <w:p>
+      <w:r>
+        <w:pict>
+          <v:rect style="width:0;height:1.5pt" o:hralign="center" o:hrstd="t" o:hr="t"/>
+        </w:pict>
+      </w:r>
+    </w:p>
+    <w:p>
+      <w:pPr>
+        <w:pStyle w:val="FirstParagraph"/>
+      </w:pPr>
+      <w:r>
+        <w:rPr>
+          <w:i/>
+          <w:iCs/>
+        </w:rPr>
+        <w:t xml:space="preserve">(Fin del documento — Resumen de Consistencia Metodológica, UNSA Arequipa, 2026)</w:t>
+      </w:r>
+    </w:p>
+    <w:bookmarkEnd w:id="174"/>
+    <w:bookmarkEnd w:id="175"/>
+    <w:bookmarkEnd w:id="176"/>
     <w:sectPr>
       <w:footerReference r:id="rId10" w:type="default"/>
       <w:footerReference r:id="rId9" w:type="first"/>
@@ -32152,6 +34306,39 @@
   </w:num>
   <w:num w:numId="1027">
     <w:abstractNumId w:val="991"/>
+  </w:num>
+  <w:num w:numId="1028">
+    <w:abstractNumId w:val="991"/>
+  </w:num>
+  <w:num w:numId="1029">
+    <w:abstractNumId w:val="99411"/>
+    <w:lvlOverride w:ilvl="0">
+      <w:startOverride w:val="1"/>
+    </w:lvlOverride>
+    <w:lvlOverride w:ilvl="1">
+      <w:startOverride w:val="1"/>
+    </w:lvlOverride>
+    <w:lvlOverride w:ilvl="2">
+      <w:startOverride w:val="1"/>
+    </w:lvlOverride>
+    <w:lvlOverride w:ilvl="3">
+      <w:startOverride w:val="1"/>
+    </w:lvlOverride>
+    <w:lvlOverride w:ilvl="4">
+      <w:startOverride w:val="1"/>
+    </w:lvlOverride>
+    <w:lvlOverride w:ilvl="5">
+      <w:startOverride w:val="1"/>
+    </w:lvlOverride>
+    <w:lvlOverride w:ilvl="6">
+      <w:startOverride w:val="1"/>
+    </w:lvlOverride>
+    <w:lvlOverride w:ilvl="7">
+      <w:startOverride w:val="1"/>
+    </w:lvlOverride>
+    <w:lvlOverride w:ilvl="8">
+      <w:startOverride w:val="1"/>
+    </w:lvlOverride>
   </w:num>
 </w:numbering>
 </file>

</xml_diff>